<commit_message>
Updated the CC_Method_Analysis_v_0_1.py script to remove the document.save() function call in the linearityreport function, as it was causing issues with saving the document, different names that the user may provide. Saving the linearity report is now handled outside of the CC module. Also removed the linearity interval with error, as it did not make sense mathematically. It is not defined by stretching the extreme ends of your assay by their confidence intervals.
</commit_message>
<xml_diff>
--- a/MethodComparison.docx
+++ b/MethodComparison.docx
@@ -7,60 +7,19 @@
         <w:pStyle w:val="Heading2"/>
       </w:pPr>
       <w:r>
-        <w:t>Comparison of Test Method Result vs. Primary Refence Method Result</w:t>
+        <w:t>Lp(a) - Linearity Analysis</w:t>
       </w:r>
     </w:p>
     <w:p>
       <w:r>
-        <w:t>Pass/Fail is determined based on the allowable error, which is defined as the following.</w:t>
-      </w:r>
-    </w:p>
-    <w:p>
-      <w:r>
-        <w:t xml:space="preserve">Across all range of the measuring interval: </w:t>
-      </w:r>
-      <w:r>
-        <w:t>15</w:t>
-      </w:r>
-      <w:r>
-        <w:t>%</w:t>
-      </w:r>
-    </w:p>
-    <w:p>
-      <w:r>
-        <w:t xml:space="preserve">The Reference Method (X) is: </w:t>
-      </w:r>
-      <w:r>
-        <w:rPr>
-          <w:b/>
-        </w:rPr>
-        <w:t>Primary Refence Method Result</w:t>
-      </w:r>
-    </w:p>
-    <w:p>
-      <w:r>
-        <w:t xml:space="preserve">The Test Method (Y) is: </w:t>
-      </w:r>
-      <w:r>
-        <w:rPr>
-          <w:b/>
-        </w:rPr>
-        <w:t>Test Method Result</w:t>
-      </w:r>
-    </w:p>
-    <w:p>
-      <w:pPr>
-        <w:pStyle w:val="Heading3"/>
-      </w:pPr>
-      <w:r>
-        <w:t>Distribution of Measurements:</w:t>
+        <w:t>Regression is based on Ordinary Least Squares (OLS) regression. Shaded region represents the defined allowable performance limits.</w:t>
       </w:r>
     </w:p>
     <w:p>
       <w:r>
         <w:drawing>
           <wp:inline xmlns:a="http://schemas.openxmlformats.org/drawingml/2006/main" xmlns:pic="http://schemas.openxmlformats.org/drawingml/2006/picture">
-            <wp:extent cx="7315200" cy="2993931"/>
+            <wp:extent cx="7315200" cy="3794516"/>
             <wp:docPr id="1" name="Picture 1"/>
             <wp:cNvGraphicFramePr>
               <a:graphicFrameLocks noChangeAspect="1"/>
@@ -69,7 +28,7 @@
               <a:graphicData uri="http://schemas.openxmlformats.org/drawingml/2006/picture">
                 <pic:pic>
                   <pic:nvPicPr>
-                    <pic:cNvPr id="0" name="cropped_plot_boxplot.png"/>
+                    <pic:cNvPr id="0" name="cropped_plot_Linearity.png"/>
                     <pic:cNvPicPr/>
                   </pic:nvPicPr>
                   <pic:blipFill>
@@ -81,7 +40,7 @@
                   <pic:spPr>
                     <a:xfrm>
                       <a:off x="0" y="0"/>
-                      <a:ext cx="7315200" cy="2993931"/>
+                      <a:ext cx="7315200" cy="3794516"/>
                     </a:xfrm>
                     <a:prstGeom prst="rect"/>
                   </pic:spPr>
@@ -90,6 +49,11 @@
             </a:graphic>
           </wp:inline>
         </w:drawing>
+      </w:r>
+    </w:p>
+    <w:p>
+      <w:r>
+        <w:t>Summary of Linearity Results</w:t>
       </w:r>
     </w:p>
     <w:tbl>
@@ -101,16 +65,10 @@
         <w:tblLook w:firstColumn="1" w:firstRow="1" w:lastColumn="0" w:lastRow="0" w:noHBand="0" w:noVBand="1" w:val="04A0"/>
       </w:tblPr>
       <w:tblGrid>
-        <w:gridCol w:w="1167"/>
-        <w:gridCol w:w="1167"/>
-        <w:gridCol w:w="1167"/>
-        <w:gridCol w:w="1167"/>
-        <w:gridCol w:w="1167"/>
-        <w:gridCol w:w="1167"/>
-        <w:gridCol w:w="1167"/>
-        <w:gridCol w:w="1167"/>
-        <w:gridCol w:w="1167"/>
-        <w:gridCol w:w="1167"/>
+        <w:gridCol w:w="2635"/>
+        <w:gridCol w:w="2635"/>
+        <w:gridCol w:w="2635"/>
+        <w:gridCol w:w="2635"/>
       </w:tblGrid>
       <w:tr>
         <w:tc>
@@ -125,7 +83,7 @@
               <w:rPr>
                 <w:sz w:val="20"/>
               </w:rPr>
-              <w:t>Variable</w:t>
+              <w:t>Measured Mean</w:t>
             </w:r>
           </w:p>
         </w:tc>
@@ -141,7 +99,7 @@
               <w:rPr>
                 <w:sz w:val="20"/>
               </w:rPr>
-              <w:t>N</w:t>
+              <w:t>Expected Mean</w:t>
             </w:r>
           </w:p>
         </w:tc>
@@ -157,7 +115,7 @@
               <w:rPr>
                 <w:sz w:val="20"/>
               </w:rPr>
-              <w:t>Mean ± SEM</w:t>
+              <w:t>Measured Mean Error</w:t>
             </w:r>
           </w:p>
         </w:tc>
@@ -173,103 +131,7 @@
               <w:rPr>
                 <w:sz w:val="20"/>
               </w:rPr>
-              <w:t>Mean</w:t>
-            </w:r>
-          </w:p>
-        </w:tc>
-        <w:tc>
-          <w:tcPr>
-            <w:tcW w:type="dxa" w:w="1417"/>
-          </w:tcPr>
-          <w:p>
-            <w:pPr>
-              <w:jc w:val="center"/>
-            </w:pPr>
-            <w:r>
-              <w:rPr>
-                <w:sz w:val="20"/>
-              </w:rPr>
-              <w:t>SEM</w:t>
-            </w:r>
-          </w:p>
-        </w:tc>
-        <w:tc>
-          <w:tcPr>
-            <w:tcW w:type="dxa" w:w="1417"/>
-          </w:tcPr>
-          <w:p>
-            <w:pPr>
-              <w:jc w:val="center"/>
-            </w:pPr>
-            <w:r>
-              <w:rPr>
-                <w:sz w:val="20"/>
-              </w:rPr>
-              <w:t>SD</w:t>
-            </w:r>
-          </w:p>
-        </w:tc>
-        <w:tc>
-          <w:tcPr>
-            <w:tcW w:type="dxa" w:w="1417"/>
-          </w:tcPr>
-          <w:p>
-            <w:pPr>
-              <w:jc w:val="center"/>
-            </w:pPr>
-            <w:r>
-              <w:rPr>
-                <w:sz w:val="20"/>
-              </w:rPr>
-              <w:t>Min</w:t>
-            </w:r>
-          </w:p>
-        </w:tc>
-        <w:tc>
-          <w:tcPr>
-            <w:tcW w:type="dxa" w:w="1417"/>
-          </w:tcPr>
-          <w:p>
-            <w:pPr>
-              <w:jc w:val="center"/>
-            </w:pPr>
-            <w:r>
-              <w:rPr>
-                <w:sz w:val="20"/>
-              </w:rPr>
-              <w:t>Median</w:t>
-            </w:r>
-          </w:p>
-        </w:tc>
-        <w:tc>
-          <w:tcPr>
-            <w:tcW w:type="dxa" w:w="1417"/>
-          </w:tcPr>
-          <w:p>
-            <w:pPr>
-              <w:jc w:val="center"/>
-            </w:pPr>
-            <w:r>
-              <w:rPr>
-                <w:sz w:val="20"/>
-              </w:rPr>
-              <w:t>Max</w:t>
-            </w:r>
-          </w:p>
-        </w:tc>
-        <w:tc>
-          <w:tcPr>
-            <w:tcW w:type="dxa" w:w="1417"/>
-          </w:tcPr>
-          <w:p>
-            <w:pPr>
-              <w:jc w:val="center"/>
-            </w:pPr>
-            <w:r>
-              <w:rPr>
-                <w:sz w:val="20"/>
-              </w:rPr>
-              <w:t>%CV</w:t>
+              <w:t>%Recovery</w:t>
             </w:r>
           </w:p>
         </w:tc>
@@ -287,7 +149,7 @@
               <w:rPr>
                 <w:sz w:val="20"/>
               </w:rPr>
-              <w:t>Primary Refence Method Result</w:t>
+              <w:t>13.85</w:t>
             </w:r>
           </w:p>
         </w:tc>
@@ -303,7 +165,7 @@
               <w:rPr>
                 <w:sz w:val="20"/>
               </w:rPr>
-              <w:t>40</w:t>
+              <w:t>16.118</w:t>
             </w:r>
           </w:p>
         </w:tc>
@@ -319,7 +181,7 @@
               <w:rPr>
                 <w:sz w:val="20"/>
               </w:rPr>
-              <w:t>(3.7+/-0.6)e+03</w:t>
+              <w:t>143.69</w:t>
             </w:r>
           </w:p>
         </w:tc>
@@ -335,103 +197,7 @@
               <w:rPr>
                 <w:sz w:val="20"/>
               </w:rPr>
-              <w:t>3674.075</w:t>
-            </w:r>
-          </w:p>
-        </w:tc>
-        <w:tc>
-          <w:tcPr>
-            <w:tcW w:type="dxa" w:w="1417"/>
-          </w:tcPr>
-          <w:p>
-            <w:pPr>
-              <w:jc w:val="center"/>
-            </w:pPr>
-            <w:r>
-              <w:rPr>
-                <w:sz w:val="20"/>
-              </w:rPr>
-              <w:t>602.030147</w:t>
-            </w:r>
-          </w:p>
-        </w:tc>
-        <w:tc>
-          <w:tcPr>
-            <w:tcW w:type="dxa" w:w="1417"/>
-          </w:tcPr>
-          <w:p>
-            <w:pPr>
-              <w:jc w:val="center"/>
-            </w:pPr>
-            <w:r>
-              <w:rPr>
-                <w:sz w:val="20"/>
-              </w:rPr>
-              <w:t>3807.572969</w:t>
-            </w:r>
-          </w:p>
-        </w:tc>
-        <w:tc>
-          <w:tcPr>
-            <w:tcW w:type="dxa" w:w="1417"/>
-          </w:tcPr>
-          <w:p>
-            <w:pPr>
-              <w:jc w:val="center"/>
-            </w:pPr>
-            <w:r>
-              <w:rPr>
-                <w:sz w:val="20"/>
-              </w:rPr>
-              <w:t>39.5</w:t>
-            </w:r>
-          </w:p>
-        </w:tc>
-        <w:tc>
-          <w:tcPr>
-            <w:tcW w:type="dxa" w:w="1417"/>
-          </w:tcPr>
-          <w:p>
-            <w:pPr>
-              <w:jc w:val="center"/>
-            </w:pPr>
-            <w:r>
-              <w:rPr>
-                <w:sz w:val="20"/>
-              </w:rPr>
-              <w:t>1854.85</w:t>
-            </w:r>
-          </w:p>
-        </w:tc>
-        <w:tc>
-          <w:tcPr>
-            <w:tcW w:type="dxa" w:w="1417"/>
-          </w:tcPr>
-          <w:p>
-            <w:pPr>
-              <w:jc w:val="center"/>
-            </w:pPr>
-            <w:r>
-              <w:rPr>
-                <w:sz w:val="20"/>
-              </w:rPr>
-              <w:t>13204.8</w:t>
-            </w:r>
-          </w:p>
-        </w:tc>
-        <w:tc>
-          <w:tcPr>
-            <w:tcW w:type="dxa" w:w="1417"/>
-          </w:tcPr>
-          <w:p>
-            <w:pPr>
-              <w:jc w:val="center"/>
-            </w:pPr>
-            <w:r>
-              <w:rPr>
-                <w:sz w:val="20"/>
-              </w:rPr>
-              <w:t>103.63</w:t>
+              <w:t>85.931</w:t>
             </w:r>
           </w:p>
         </w:tc>
@@ -449,7 +215,7 @@
               <w:rPr>
                 <w:sz w:val="20"/>
               </w:rPr>
-              <w:t>Test Method Result</w:t>
+              <w:t>50.55</w:t>
             </w:r>
           </w:p>
         </w:tc>
@@ -465,7 +231,7 @@
               <w:rPr>
                 <w:sz w:val="20"/>
               </w:rPr>
-              <w:t>40</w:t>
+              <w:t>64.47</w:t>
             </w:r>
           </w:p>
         </w:tc>
@@ -481,7 +247,7 @@
               <w:rPr>
                 <w:sz w:val="20"/>
               </w:rPr>
-              <w:t>(3.7+/-0.6)e+03</w:t>
+              <w:t>15.883</w:t>
             </w:r>
           </w:p>
         </w:tc>
@@ -497,103 +263,7 @@
               <w:rPr>
                 <w:sz w:val="20"/>
               </w:rPr>
-              <w:t>3694.2675</w:t>
-            </w:r>
-          </w:p>
-        </w:tc>
-        <w:tc>
-          <w:tcPr>
-            <w:tcW w:type="dxa" w:w="1417"/>
-          </w:tcPr>
-          <w:p>
-            <w:pPr>
-              <w:jc w:val="center"/>
-            </w:pPr>
-            <w:r>
-              <w:rPr>
-                <w:sz w:val="20"/>
-              </w:rPr>
-              <w:t>597.331001</w:t>
-            </w:r>
-          </w:p>
-        </w:tc>
-        <w:tc>
-          <w:tcPr>
-            <w:tcW w:type="dxa" w:w="1417"/>
-          </w:tcPr>
-          <w:p>
-            <w:pPr>
-              <w:jc w:val="center"/>
-            </w:pPr>
-            <w:r>
-              <w:rPr>
-                <w:sz w:val="20"/>
-              </w:rPr>
-              <w:t>3777.852962</w:t>
-            </w:r>
-          </w:p>
-        </w:tc>
-        <w:tc>
-          <w:tcPr>
-            <w:tcW w:type="dxa" w:w="1417"/>
-          </w:tcPr>
-          <w:p>
-            <w:pPr>
-              <w:jc w:val="center"/>
-            </w:pPr>
-            <w:r>
-              <w:rPr>
-                <w:sz w:val="20"/>
-              </w:rPr>
-              <w:t>23.5</w:t>
-            </w:r>
-          </w:p>
-        </w:tc>
-        <w:tc>
-          <w:tcPr>
-            <w:tcW w:type="dxa" w:w="1417"/>
-          </w:tcPr>
-          <w:p>
-            <w:pPr>
-              <w:jc w:val="center"/>
-            </w:pPr>
-            <w:r>
-              <w:rPr>
-                <w:sz w:val="20"/>
-              </w:rPr>
-              <w:t>2085.0</w:t>
-            </w:r>
-          </w:p>
-        </w:tc>
-        <w:tc>
-          <w:tcPr>
-            <w:tcW w:type="dxa" w:w="1417"/>
-          </w:tcPr>
-          <w:p>
-            <w:pPr>
-              <w:jc w:val="center"/>
-            </w:pPr>
-            <w:r>
-              <w:rPr>
-                <w:sz w:val="20"/>
-              </w:rPr>
-              <w:t>13800.0</w:t>
-            </w:r>
-          </w:p>
-        </w:tc>
-        <w:tc>
-          <w:tcPr>
-            <w:tcW w:type="dxa" w:w="1417"/>
-          </w:tcPr>
-          <w:p>
-            <w:pPr>
-              <w:jc w:val="center"/>
-            </w:pPr>
-            <w:r>
-              <w:rPr>
-                <w:sz w:val="20"/>
-              </w:rPr>
-              <w:t>102.26</w:t>
+              <w:t>78.409</w:t>
             </w:r>
           </w:p>
         </w:tc>
@@ -611,7 +281,7 @@
               <w:rPr>
                 <w:sz w:val="20"/>
               </w:rPr>
-              <w:t>Y-X</w:t>
+              <w:t>71.3</w:t>
             </w:r>
           </w:p>
         </w:tc>
@@ -627,7 +297,7 @@
               <w:rPr>
                 <w:sz w:val="20"/>
               </w:rPr>
-              <w:t>40</w:t>
+              <w:t>96.71</w:t>
             </w:r>
           </w:p>
         </w:tc>
@@ -643,7 +313,7 @@
               <w:rPr>
                 <w:sz w:val="20"/>
               </w:rPr>
-              <w:t>(2+/-7)e+01</w:t>
+              <w:t>3.812</w:t>
             </w:r>
           </w:p>
         </w:tc>
@@ -659,103 +329,7 @@
               <w:rPr>
                 <w:sz w:val="20"/>
               </w:rPr>
-              <w:t>20.1925</w:t>
-            </w:r>
-          </w:p>
-        </w:tc>
-        <w:tc>
-          <w:tcPr>
-            <w:tcW w:type="dxa" w:w="1417"/>
-          </w:tcPr>
-          <w:p>
-            <w:pPr>
-              <w:jc w:val="center"/>
-            </w:pPr>
-            <w:r>
-              <w:rPr>
-                <w:sz w:val="20"/>
-              </w:rPr>
-              <w:t>71.687793</w:t>
-            </w:r>
-          </w:p>
-        </w:tc>
-        <w:tc>
-          <w:tcPr>
-            <w:tcW w:type="dxa" w:w="1417"/>
-          </w:tcPr>
-          <w:p>
-            <w:pPr>
-              <w:jc w:val="center"/>
-            </w:pPr>
-            <w:r>
-              <w:rPr>
-                <w:sz w:val="20"/>
-              </w:rPr>
-              <w:t>453.393411</w:t>
-            </w:r>
-          </w:p>
-        </w:tc>
-        <w:tc>
-          <w:tcPr>
-            <w:tcW w:type="dxa" w:w="1417"/>
-          </w:tcPr>
-          <w:p>
-            <w:pPr>
-              <w:jc w:val="center"/>
-            </w:pPr>
-            <w:r>
-              <w:rPr>
-                <w:sz w:val="20"/>
-              </w:rPr>
-              <w:t>-997.6</w:t>
-            </w:r>
-          </w:p>
-        </w:tc>
-        <w:tc>
-          <w:tcPr>
-            <w:tcW w:type="dxa" w:w="1417"/>
-          </w:tcPr>
-          <w:p>
-            <w:pPr>
-              <w:jc w:val="center"/>
-            </w:pPr>
-            <w:r>
-              <w:rPr>
-                <w:sz w:val="20"/>
-              </w:rPr>
-              <w:t>22.55</w:t>
-            </w:r>
-          </w:p>
-        </w:tc>
-        <w:tc>
-          <w:tcPr>
-            <w:tcW w:type="dxa" w:w="1417"/>
-          </w:tcPr>
-          <w:p>
-            <w:pPr>
-              <w:jc w:val="center"/>
-            </w:pPr>
-            <w:r>
-              <w:rPr>
-                <w:sz w:val="20"/>
-              </w:rPr>
-              <w:t>1841.9</w:t>
-            </w:r>
-          </w:p>
-        </w:tc>
-        <w:tc>
-          <w:tcPr>
-            <w:tcW w:type="dxa" w:w="1417"/>
-          </w:tcPr>
-          <w:p>
-            <w:pPr>
-              <w:jc w:val="center"/>
-            </w:pPr>
-            <w:r>
-              <w:rPr>
-                <w:sz w:val="20"/>
-              </w:rPr>
-              <w:t>2245.36</w:t>
+              <w:t>73.726</w:t>
             </w:r>
           </w:p>
         </w:tc>
@@ -773,7 +347,7 @@
               <w:rPr>
                 <w:sz w:val="20"/>
               </w:rPr>
-              <w:t>%(Y-X)/X</w:t>
+              <w:t>94.05</w:t>
             </w:r>
           </w:p>
         </w:tc>
@@ -789,7 +363,7 @@
               <w:rPr>
                 <w:sz w:val="20"/>
               </w:rPr>
-              <w:t>40</w:t>
+              <w:t>128.94</w:t>
             </w:r>
           </w:p>
         </w:tc>
@@ -805,7 +379,7 @@
               <w:rPr>
                 <w:sz w:val="20"/>
               </w:rPr>
-              <w:t>-0.2+/-2.2</w:t>
+              <w:t>5.718</w:t>
             </w:r>
           </w:p>
         </w:tc>
@@ -821,291 +395,7 @@
               <w:rPr>
                 <w:sz w:val="20"/>
               </w:rPr>
-              <w:t>-0.187725</w:t>
-            </w:r>
-          </w:p>
-        </w:tc>
-        <w:tc>
-          <w:tcPr>
-            <w:tcW w:type="dxa" w:w="1417"/>
-          </w:tcPr>
-          <w:p>
-            <w:pPr>
-              <w:jc w:val="center"/>
-            </w:pPr>
-            <w:r>
-              <w:rPr>
-                <w:sz w:val="20"/>
-              </w:rPr>
-              <w:t>2.151249</w:t>
-            </w:r>
-          </w:p>
-        </w:tc>
-        <w:tc>
-          <w:tcPr>
-            <w:tcW w:type="dxa" w:w="1417"/>
-          </w:tcPr>
-          <w:p>
-            <w:pPr>
-              <w:jc w:val="center"/>
-            </w:pPr>
-            <w:r>
-              <w:rPr>
-                <w:sz w:val="20"/>
-              </w:rPr>
-              <w:t>13.605695</w:t>
-            </w:r>
-          </w:p>
-        </w:tc>
-        <w:tc>
-          <w:tcPr>
-            <w:tcW w:type="dxa" w:w="1417"/>
-          </w:tcPr>
-          <w:p>
-            <w:pPr>
-              <w:jc w:val="center"/>
-            </w:pPr>
-            <w:r>
-              <w:rPr>
-                <w:sz w:val="20"/>
-              </w:rPr>
-              <w:t>-50.882</w:t>
-            </w:r>
-          </w:p>
-        </w:tc>
-        <w:tc>
-          <w:tcPr>
-            <w:tcW w:type="dxa" w:w="1417"/>
-          </w:tcPr>
-          <w:p>
-            <w:pPr>
-              <w:jc w:val="center"/>
-            </w:pPr>
-            <w:r>
-              <w:rPr>
-                <w:sz w:val="20"/>
-              </w:rPr>
-              <w:t>2.5365</w:t>
-            </w:r>
-          </w:p>
-        </w:tc>
-        <w:tc>
-          <w:tcPr>
-            <w:tcW w:type="dxa" w:w="1417"/>
-          </w:tcPr>
-          <w:p>
-            <w:pPr>
-              <w:jc w:val="center"/>
-            </w:pPr>
-            <w:r>
-              <w:rPr>
-                <w:sz w:val="20"/>
-              </w:rPr>
-              <w:t>15.403</w:t>
-            </w:r>
-          </w:p>
-        </w:tc>
-        <w:tc>
-          <w:tcPr>
-            <w:tcW w:type="dxa" w:w="1417"/>
-          </w:tcPr>
-          <w:p>
-            <w:pPr>
-              <w:jc w:val="center"/>
-            </w:pPr>
-            <w:r>
-              <w:rPr>
-                <w:sz w:val="20"/>
-              </w:rPr>
-              <w:t>-7247.67</w:t>
-            </w:r>
-          </w:p>
-        </w:tc>
-      </w:tr>
-    </w:tbl>
-    <w:p>
-      <w:pPr>
-        <w:pStyle w:val="Heading3"/>
-      </w:pPr>
-      <w:r>
-        <w:t xml:space="preserve">Shapiro-Wilk Test: </w:t>
-      </w:r>
-    </w:p>
-    <w:p>
-      <w:r>
-        <w:t xml:space="preserve">The measurements of the difference between the Test Method and Reference Method do NOT sufficiently resemble a Gaussian distribution, as based on Shapiro-Wilk Test. </w:t>
-      </w:r>
-      <w:r>
-        <w:t>Proportional biases may be present.</w:t>
-      </w:r>
-    </w:p>
-    <w:p>
-      <w:pPr>
-        <w:pStyle w:val="Heading3"/>
-      </w:pPr>
-      <w:r>
-        <w:t>Regression &amp; Bias Analysis</w:t>
-      </w:r>
-    </w:p>
-    <w:p>
-      <w:r>
-        <w:t xml:space="preserve">Regression is based on Deming method, assuming equal variance of both methods. </w:t>
-      </w:r>
-    </w:p>
-    <w:p>
-      <w:r>
-        <w:drawing>
-          <wp:inline xmlns:a="http://schemas.openxmlformats.org/drawingml/2006/main" xmlns:pic="http://schemas.openxmlformats.org/drawingml/2006/picture">
-            <wp:extent cx="5943600" cy="6244318"/>
-            <wp:docPr id="2" name="Picture 2"/>
-            <wp:cNvGraphicFramePr>
-              <a:graphicFrameLocks noChangeAspect="1"/>
-            </wp:cNvGraphicFramePr>
-            <a:graphic>
-              <a:graphicData uri="http://schemas.openxmlformats.org/drawingml/2006/picture">
-                <pic:pic>
-                  <pic:nvPicPr>
-                    <pic:cNvPr id="0" name="cropped_plot_Deming_regression.png"/>
-                    <pic:cNvPicPr/>
-                  </pic:nvPicPr>
-                  <pic:blipFill>
-                    <a:blip r:embed="rId10"/>
-                    <a:stretch>
-                      <a:fillRect/>
-                    </a:stretch>
-                  </pic:blipFill>
-                  <pic:spPr>
-                    <a:xfrm>
-                      <a:off x="0" y="0"/>
-                      <a:ext cx="5943600" cy="6244318"/>
-                    </a:xfrm>
-                    <a:prstGeom prst="rect"/>
-                  </pic:spPr>
-                </pic:pic>
-              </a:graphicData>
-            </a:graphic>
-          </wp:inline>
-        </w:drawing>
-      </w:r>
-    </w:p>
-    <w:p>
-      <w:r>
-        <w:rPr>
-          <w:b/>
-        </w:rPr>
-        <w:t>Comparison of Paired Measurements</w:t>
-      </w:r>
-    </w:p>
-    <w:tbl>
-      <w:tblPr>
-        <w:tblStyle w:val="LightShading-Accent1"/>
-        <w:tblW w:type="auto" w:w="0"/>
-        <w:jc w:val="center"/>
-        <w:tblLayout w:type="autofit"/>
-        <w:tblLook w:firstColumn="1" w:firstRow="1" w:lastColumn="0" w:lastRow="0" w:noHBand="0" w:noVBand="1" w:val="04A0"/>
-      </w:tblPr>
-      <w:tblGrid>
-        <w:gridCol w:w="1946"/>
-        <w:gridCol w:w="1946"/>
-        <w:gridCol w:w="1946"/>
-        <w:gridCol w:w="1946"/>
-        <w:gridCol w:w="1946"/>
-        <w:gridCol w:w="1946"/>
-      </w:tblGrid>
-      <w:tr>
-        <w:tc>
-          <w:tcPr>
-            <w:tcW w:type="dxa" w:w="1417"/>
-          </w:tcPr>
-          <w:p>
-            <w:pPr>
-              <w:jc w:val="center"/>
-            </w:pPr>
-            <w:r>
-              <w:rPr>
-                <w:sz w:val="20"/>
-              </w:rPr>
-              <w:t>Sample ID</w:t>
-            </w:r>
-          </w:p>
-        </w:tc>
-        <w:tc>
-          <w:tcPr>
-            <w:tcW w:type="dxa" w:w="1417"/>
-          </w:tcPr>
-          <w:p>
-            <w:pPr>
-              <w:jc w:val="center"/>
-            </w:pPr>
-            <w:r>
-              <w:rPr>
-                <w:sz w:val="20"/>
-              </w:rPr>
-              <w:t>Primary Refence Method Result</w:t>
-            </w:r>
-          </w:p>
-        </w:tc>
-        <w:tc>
-          <w:tcPr>
-            <w:tcW w:type="dxa" w:w="1417"/>
-          </w:tcPr>
-          <w:p>
-            <w:pPr>
-              <w:jc w:val="center"/>
-            </w:pPr>
-            <w:r>
-              <w:rPr>
-                <w:sz w:val="20"/>
-              </w:rPr>
-              <w:t>Test Method Result</w:t>
-            </w:r>
-          </w:p>
-        </w:tc>
-        <w:tc>
-          <w:tcPr>
-            <w:tcW w:type="dxa" w:w="1417"/>
-          </w:tcPr>
-          <w:p>
-            <w:pPr>
-              <w:jc w:val="center"/>
-            </w:pPr>
-            <w:r>
-              <w:rPr>
-                <w:sz w:val="20"/>
-              </w:rPr>
-              <w:t>Y-X</w:t>
-            </w:r>
-          </w:p>
-        </w:tc>
-        <w:tc>
-          <w:tcPr>
-            <w:tcW w:type="dxa" w:w="1417"/>
-          </w:tcPr>
-          <w:p>
-            <w:pPr>
-              <w:jc w:val="center"/>
-            </w:pPr>
-            <w:r>
-              <w:rPr>
-                <w:sz w:val="20"/>
-              </w:rPr>
-              <w:t>%(Y-X)/X</w:t>
-            </w:r>
-          </w:p>
-        </w:tc>
-        <w:tc>
-          <w:tcPr>
-            <w:tcW w:type="dxa" w:w="1417"/>
-          </w:tcPr>
-          <w:p>
-            <w:pPr>
-              <w:jc w:val="center"/>
-            </w:pPr>
-            <w:r>
-              <w:rPr>
-                <w:sz w:val="20"/>
-              </w:rPr>
-              <w:t>Pass/Fail</w:t>
+              <w:t>72.941</w:t>
             </w:r>
           </w:p>
         </w:tc>
@@ -1123,7 +413,7 @@
               <w:rPr>
                 <w:sz w:val="20"/>
               </w:rPr>
-              <w:t>34</w:t>
+              <w:t>115.6</w:t>
             </w:r>
           </w:p>
         </w:tc>
@@ -1139,7 +429,7 @@
               <w:rPr>
                 <w:sz w:val="20"/>
               </w:rPr>
-              <w:t>39.5</w:t>
+              <w:t>161.18</w:t>
             </w:r>
           </w:p>
         </w:tc>
@@ -1155,7 +445,7 @@
               <w:rPr>
                 <w:sz w:val="20"/>
               </w:rPr>
-              <w:t>23.5</w:t>
+              <w:t>6.353</w:t>
             </w:r>
           </w:p>
         </w:tc>
@@ -1171,39 +461,7 @@
               <w:rPr>
                 <w:sz w:val="20"/>
               </w:rPr>
-              <w:t>-16.0</w:t>
-            </w:r>
-          </w:p>
-        </w:tc>
-        <w:tc>
-          <w:tcPr>
-            <w:tcW w:type="dxa" w:w="1417"/>
-          </w:tcPr>
-          <w:p>
-            <w:pPr>
-              <w:jc w:val="center"/>
-            </w:pPr>
-            <w:r>
-              <w:rPr>
-                <w:sz w:val="20"/>
-              </w:rPr>
-              <w:t>-40.506</w:t>
-            </w:r>
-          </w:p>
-        </w:tc>
-        <w:tc>
-          <w:tcPr>
-            <w:tcW w:type="dxa" w:w="1417"/>
-          </w:tcPr>
-          <w:p>
-            <w:pPr>
-              <w:jc w:val="center"/>
-            </w:pPr>
-            <w:r>
-              <w:rPr>
-                <w:sz w:val="20"/>
-              </w:rPr>
-              <w:t>**FAIL**</w:t>
+              <w:t>71.721</w:t>
             </w:r>
           </w:p>
         </w:tc>
@@ -1221,7 +479,7 @@
               <w:rPr>
                 <w:sz w:val="20"/>
               </w:rPr>
-              <w:t>14</w:t>
+              <w:t>136.0</w:t>
             </w:r>
           </w:p>
         </w:tc>
@@ -1237,7 +495,7 @@
               <w:rPr>
                 <w:sz w:val="20"/>
               </w:rPr>
-              <w:t>73.7</w:t>
+              <w:t>193.4</w:t>
             </w:r>
           </w:p>
         </w:tc>
@@ -1253,7 +511,7 @@
               <w:rPr>
                 <w:sz w:val="20"/>
               </w:rPr>
-              <w:t>36.2</w:t>
+              <w:t>2.541</w:t>
             </w:r>
           </w:p>
         </w:tc>
@@ -1269,39 +527,7 @@
               <w:rPr>
                 <w:sz w:val="20"/>
               </w:rPr>
-              <w:t>-37.5</w:t>
-            </w:r>
-          </w:p>
-        </w:tc>
-        <w:tc>
-          <w:tcPr>
-            <w:tcW w:type="dxa" w:w="1417"/>
-          </w:tcPr>
-          <w:p>
-            <w:pPr>
-              <w:jc w:val="center"/>
-            </w:pPr>
-            <w:r>
-              <w:rPr>
-                <w:sz w:val="20"/>
-              </w:rPr>
-              <w:t>-50.882</w:t>
-            </w:r>
-          </w:p>
-        </w:tc>
-        <w:tc>
-          <w:tcPr>
-            <w:tcW w:type="dxa" w:w="1417"/>
-          </w:tcPr>
-          <w:p>
-            <w:pPr>
-              <w:jc w:val="center"/>
-            </w:pPr>
-            <w:r>
-              <w:rPr>
-                <w:sz w:val="20"/>
-              </w:rPr>
-              <w:t>**FAIL**</w:t>
+              <w:t>70.321</w:t>
             </w:r>
           </w:p>
         </w:tc>
@@ -1319,7 +545,7 @@
               <w:rPr>
                 <w:sz w:val="20"/>
               </w:rPr>
-              <w:t>18</w:t>
+              <w:t>169.5</w:t>
             </w:r>
           </w:p>
         </w:tc>
@@ -1335,7 +561,7 @@
               <w:rPr>
                 <w:sz w:val="20"/>
               </w:rPr>
-              <w:t>146.4</w:t>
+              <w:t>225.65</w:t>
             </w:r>
           </w:p>
         </w:tc>
@@ -1351,7 +577,7 @@
               <w:rPr>
                 <w:sz w:val="20"/>
               </w:rPr>
-              <w:t>141.0</w:t>
+              <w:t>5.082</w:t>
             </w:r>
           </w:p>
         </w:tc>
@@ -1367,39 +593,7 @@
               <w:rPr>
                 <w:sz w:val="20"/>
               </w:rPr>
-              <w:t>-5.4</w:t>
-            </w:r>
-          </w:p>
-        </w:tc>
-        <w:tc>
-          <w:tcPr>
-            <w:tcW w:type="dxa" w:w="1417"/>
-          </w:tcPr>
-          <w:p>
-            <w:pPr>
-              <w:jc w:val="center"/>
-            </w:pPr>
-            <w:r>
-              <w:rPr>
-                <w:sz w:val="20"/>
-              </w:rPr>
-              <w:t>-3.689</w:t>
-            </w:r>
-          </w:p>
-        </w:tc>
-        <w:tc>
-          <w:tcPr>
-            <w:tcW w:type="dxa" w:w="1417"/>
-          </w:tcPr>
-          <w:p>
-            <w:pPr>
-              <w:jc w:val="center"/>
-            </w:pPr>
-            <w:r>
-              <w:rPr>
-                <w:sz w:val="20"/>
-              </w:rPr>
-              <w:t>pass</w:t>
+              <w:t>75.116</w:t>
             </w:r>
           </w:p>
         </w:tc>
@@ -1417,7 +611,7 @@
               <w:rPr>
                 <w:sz w:val="20"/>
               </w:rPr>
-              <w:t>30</w:t>
+              <w:t>196.6</w:t>
             </w:r>
           </w:p>
         </w:tc>
@@ -1433,7 +627,7 @@
               <w:rPr>
                 <w:sz w:val="20"/>
               </w:rPr>
-              <w:t>172.4</w:t>
+              <w:t>257.88</w:t>
             </w:r>
           </w:p>
         </w:tc>
@@ -1449,7 +643,7 @@
               <w:rPr>
                 <w:sz w:val="20"/>
               </w:rPr>
-              <w:t>145.0</w:t>
+              <w:t>2.541</w:t>
             </w:r>
           </w:p>
         </w:tc>
@@ -1465,39 +659,7 @@
               <w:rPr>
                 <w:sz w:val="20"/>
               </w:rPr>
-              <w:t>-27.4</w:t>
-            </w:r>
-          </w:p>
-        </w:tc>
-        <w:tc>
-          <w:tcPr>
-            <w:tcW w:type="dxa" w:w="1417"/>
-          </w:tcPr>
-          <w:p>
-            <w:pPr>
-              <w:jc w:val="center"/>
-            </w:pPr>
-            <w:r>
-              <w:rPr>
-                <w:sz w:val="20"/>
-              </w:rPr>
-              <w:t>-15.893</w:t>
-            </w:r>
-          </w:p>
-        </w:tc>
-        <w:tc>
-          <w:tcPr>
-            <w:tcW w:type="dxa" w:w="1417"/>
-          </w:tcPr>
-          <w:p>
-            <w:pPr>
-              <w:jc w:val="center"/>
-            </w:pPr>
-            <w:r>
-              <w:rPr>
-                <w:sz w:val="20"/>
-              </w:rPr>
-              <w:t>**FAIL**</w:t>
+              <w:t>76.237</w:t>
             </w:r>
           </w:p>
         </w:tc>
@@ -1515,7 +677,7 @@
               <w:rPr>
                 <w:sz w:val="20"/>
               </w:rPr>
-              <w:t>35</w:t>
+              <w:t>272.8</w:t>
             </w:r>
           </w:p>
         </w:tc>
@@ -1531,7 +693,7 @@
               <w:rPr>
                 <w:sz w:val="20"/>
               </w:rPr>
-              <w:t>250.4</w:t>
+              <w:t>290.115</w:t>
             </w:r>
           </w:p>
         </w:tc>
@@ -1547,7 +709,7 @@
               <w:rPr>
                 <w:sz w:val="20"/>
               </w:rPr>
-              <w:t>256.0</w:t>
+              <w:t>8.894</w:t>
             </w:r>
           </w:p>
         </w:tc>
@@ -1563,39 +725,7 @@
               <w:rPr>
                 <w:sz w:val="20"/>
               </w:rPr>
-              <w:t>5.6</w:t>
-            </w:r>
-          </w:p>
-        </w:tc>
-        <w:tc>
-          <w:tcPr>
-            <w:tcW w:type="dxa" w:w="1417"/>
-          </w:tcPr>
-          <w:p>
-            <w:pPr>
-              <w:jc w:val="center"/>
-            </w:pPr>
-            <w:r>
-              <w:rPr>
-                <w:sz w:val="20"/>
-              </w:rPr>
-              <w:t>2.236</w:t>
-            </w:r>
-          </w:p>
-        </w:tc>
-        <w:tc>
-          <w:tcPr>
-            <w:tcW w:type="dxa" w:w="1417"/>
-          </w:tcPr>
-          <w:p>
-            <w:pPr>
-              <w:jc w:val="center"/>
-            </w:pPr>
-            <w:r>
-              <w:rPr>
-                <w:sz w:val="20"/>
-              </w:rPr>
-              <w:t>pass</w:t>
+              <w:t>94.032</w:t>
             </w:r>
           </w:p>
         </w:tc>
@@ -1613,7 +743,7 @@
               <w:rPr>
                 <w:sz w:val="20"/>
               </w:rPr>
-              <w:t>33</w:t>
+              <w:t>322.35</w:t>
             </w:r>
           </w:p>
         </w:tc>
@@ -1629,7 +759,7 @@
               <w:rPr>
                 <w:sz w:val="20"/>
               </w:rPr>
-              <w:t>344.1</w:t>
+              <w:t>322.35</w:t>
             </w:r>
           </w:p>
         </w:tc>
@@ -1645,7 +775,7 @@
               <w:rPr>
                 <w:sz w:val="20"/>
               </w:rPr>
-              <w:t>358.0</w:t>
+              <w:t>42.566</w:t>
             </w:r>
           </w:p>
         </w:tc>
@@ -1661,3486 +791,7 @@
               <w:rPr>
                 <w:sz w:val="20"/>
               </w:rPr>
-              <w:t>13.9</w:t>
-            </w:r>
-          </w:p>
-        </w:tc>
-        <w:tc>
-          <w:tcPr>
-            <w:tcW w:type="dxa" w:w="1417"/>
-          </w:tcPr>
-          <w:p>
-            <w:pPr>
-              <w:jc w:val="center"/>
-            </w:pPr>
-            <w:r>
-              <w:rPr>
-                <w:sz w:val="20"/>
-              </w:rPr>
-              <w:t>4.04</w:t>
-            </w:r>
-          </w:p>
-        </w:tc>
-        <w:tc>
-          <w:tcPr>
-            <w:tcW w:type="dxa" w:w="1417"/>
-          </w:tcPr>
-          <w:p>
-            <w:pPr>
-              <w:jc w:val="center"/>
-            </w:pPr>
-            <w:r>
-              <w:rPr>
-                <w:sz w:val="20"/>
-              </w:rPr>
-              <w:t>pass</w:t>
-            </w:r>
-          </w:p>
-        </w:tc>
-      </w:tr>
-      <w:tr>
-        <w:tc>
-          <w:tcPr>
-            <w:tcW w:type="dxa" w:w="1417"/>
-          </w:tcPr>
-          <w:p>
-            <w:pPr>
-              <w:jc w:val="center"/>
-            </w:pPr>
-            <w:r>
-              <w:rPr>
-                <w:sz w:val="20"/>
-              </w:rPr>
-              <w:t>10</w:t>
-            </w:r>
-          </w:p>
-        </w:tc>
-        <w:tc>
-          <w:tcPr>
-            <w:tcW w:type="dxa" w:w="1417"/>
-          </w:tcPr>
-          <w:p>
-            <w:pPr>
-              <w:jc w:val="center"/>
-            </w:pPr>
-            <w:r>
-              <w:rPr>
-                <w:sz w:val="20"/>
-              </w:rPr>
-              <w:t>536.5</w:t>
-            </w:r>
-          </w:p>
-        </w:tc>
-        <w:tc>
-          <w:tcPr>
-            <w:tcW w:type="dxa" w:w="1417"/>
-          </w:tcPr>
-          <w:p>
-            <w:pPr>
-              <w:jc w:val="center"/>
-            </w:pPr>
-            <w:r>
-              <w:rPr>
-                <w:sz w:val="20"/>
-              </w:rPr>
-              <w:t>509.0</w:t>
-            </w:r>
-          </w:p>
-        </w:tc>
-        <w:tc>
-          <w:tcPr>
-            <w:tcW w:type="dxa" w:w="1417"/>
-          </w:tcPr>
-          <w:p>
-            <w:pPr>
-              <w:jc w:val="center"/>
-            </w:pPr>
-            <w:r>
-              <w:rPr>
-                <w:sz w:val="20"/>
-              </w:rPr>
-              <w:t>-27.5</w:t>
-            </w:r>
-          </w:p>
-        </w:tc>
-        <w:tc>
-          <w:tcPr>
-            <w:tcW w:type="dxa" w:w="1417"/>
-          </w:tcPr>
-          <w:p>
-            <w:pPr>
-              <w:jc w:val="center"/>
-            </w:pPr>
-            <w:r>
-              <w:rPr>
-                <w:sz w:val="20"/>
-              </w:rPr>
-              <w:t>-5.126</w:t>
-            </w:r>
-          </w:p>
-        </w:tc>
-        <w:tc>
-          <w:tcPr>
-            <w:tcW w:type="dxa" w:w="1417"/>
-          </w:tcPr>
-          <w:p>
-            <w:pPr>
-              <w:jc w:val="center"/>
-            </w:pPr>
-            <w:r>
-              <w:rPr>
-                <w:sz w:val="20"/>
-              </w:rPr>
-              <w:t>pass</w:t>
-            </w:r>
-          </w:p>
-        </w:tc>
-      </w:tr>
-      <w:tr>
-        <w:tc>
-          <w:tcPr>
-            <w:tcW w:type="dxa" w:w="1417"/>
-          </w:tcPr>
-          <w:p>
-            <w:pPr>
-              <w:jc w:val="center"/>
-            </w:pPr>
-            <w:r>
-              <w:rPr>
-                <w:sz w:val="20"/>
-              </w:rPr>
-              <w:t>27</w:t>
-            </w:r>
-          </w:p>
-        </w:tc>
-        <w:tc>
-          <w:tcPr>
-            <w:tcW w:type="dxa" w:w="1417"/>
-          </w:tcPr>
-          <w:p>
-            <w:pPr>
-              <w:jc w:val="center"/>
-            </w:pPr>
-            <w:r>
-              <w:rPr>
-                <w:sz w:val="20"/>
-              </w:rPr>
-              <w:t>636.4</w:t>
-            </w:r>
-          </w:p>
-        </w:tc>
-        <w:tc>
-          <w:tcPr>
-            <w:tcW w:type="dxa" w:w="1417"/>
-          </w:tcPr>
-          <w:p>
-            <w:pPr>
-              <w:jc w:val="center"/>
-            </w:pPr>
-            <w:r>
-              <w:rPr>
-                <w:sz w:val="20"/>
-              </w:rPr>
-              <w:t>674.0</w:t>
-            </w:r>
-          </w:p>
-        </w:tc>
-        <w:tc>
-          <w:tcPr>
-            <w:tcW w:type="dxa" w:w="1417"/>
-          </w:tcPr>
-          <w:p>
-            <w:pPr>
-              <w:jc w:val="center"/>
-            </w:pPr>
-            <w:r>
-              <w:rPr>
-                <w:sz w:val="20"/>
-              </w:rPr>
-              <w:t>37.6</w:t>
-            </w:r>
-          </w:p>
-        </w:tc>
-        <w:tc>
-          <w:tcPr>
-            <w:tcW w:type="dxa" w:w="1417"/>
-          </w:tcPr>
-          <w:p>
-            <w:pPr>
-              <w:jc w:val="center"/>
-            </w:pPr>
-            <w:r>
-              <w:rPr>
-                <w:sz w:val="20"/>
-              </w:rPr>
-              <w:t>5.908</w:t>
-            </w:r>
-          </w:p>
-        </w:tc>
-        <w:tc>
-          <w:tcPr>
-            <w:tcW w:type="dxa" w:w="1417"/>
-          </w:tcPr>
-          <w:p>
-            <w:pPr>
-              <w:jc w:val="center"/>
-            </w:pPr>
-            <w:r>
-              <w:rPr>
-                <w:sz w:val="20"/>
-              </w:rPr>
-              <w:t>pass</w:t>
-            </w:r>
-          </w:p>
-        </w:tc>
-      </w:tr>
-      <w:tr>
-        <w:tc>
-          <w:tcPr>
-            <w:tcW w:type="dxa" w:w="1417"/>
-          </w:tcPr>
-          <w:p>
-            <w:pPr>
-              <w:jc w:val="center"/>
-            </w:pPr>
-            <w:r>
-              <w:rPr>
-                <w:sz w:val="20"/>
-              </w:rPr>
-              <w:t>20</w:t>
-            </w:r>
-          </w:p>
-        </w:tc>
-        <w:tc>
-          <w:tcPr>
-            <w:tcW w:type="dxa" w:w="1417"/>
-          </w:tcPr>
-          <w:p>
-            <w:pPr>
-              <w:jc w:val="center"/>
-            </w:pPr>
-            <w:r>
-              <w:rPr>
-                <w:sz w:val="20"/>
-              </w:rPr>
-              <w:t>713.7</w:t>
-            </w:r>
-          </w:p>
-        </w:tc>
-        <w:tc>
-          <w:tcPr>
-            <w:tcW w:type="dxa" w:w="1417"/>
-          </w:tcPr>
-          <w:p>
-            <w:pPr>
-              <w:jc w:val="center"/>
-            </w:pPr>
-            <w:r>
-              <w:rPr>
-                <w:sz w:val="20"/>
-              </w:rPr>
-              <w:t>733.0</w:t>
-            </w:r>
-          </w:p>
-        </w:tc>
-        <w:tc>
-          <w:tcPr>
-            <w:tcW w:type="dxa" w:w="1417"/>
-          </w:tcPr>
-          <w:p>
-            <w:pPr>
-              <w:jc w:val="center"/>
-            </w:pPr>
-            <w:r>
-              <w:rPr>
-                <w:sz w:val="20"/>
-              </w:rPr>
-              <w:t>19.3</w:t>
-            </w:r>
-          </w:p>
-        </w:tc>
-        <w:tc>
-          <w:tcPr>
-            <w:tcW w:type="dxa" w:w="1417"/>
-          </w:tcPr>
-          <w:p>
-            <w:pPr>
-              <w:jc w:val="center"/>
-            </w:pPr>
-            <w:r>
-              <w:rPr>
-                <w:sz w:val="20"/>
-              </w:rPr>
-              <w:t>2.704</w:t>
-            </w:r>
-          </w:p>
-        </w:tc>
-        <w:tc>
-          <w:tcPr>
-            <w:tcW w:type="dxa" w:w="1417"/>
-          </w:tcPr>
-          <w:p>
-            <w:pPr>
-              <w:jc w:val="center"/>
-            </w:pPr>
-            <w:r>
-              <w:rPr>
-                <w:sz w:val="20"/>
-              </w:rPr>
-              <w:t>pass</w:t>
-            </w:r>
-          </w:p>
-        </w:tc>
-      </w:tr>
-      <w:tr>
-        <w:tc>
-          <w:tcPr>
-            <w:tcW w:type="dxa" w:w="1417"/>
-          </w:tcPr>
-          <w:p>
-            <w:pPr>
-              <w:jc w:val="center"/>
-            </w:pPr>
-            <w:r>
-              <w:rPr>
-                <w:sz w:val="20"/>
-              </w:rPr>
-              <w:t>24</w:t>
-            </w:r>
-          </w:p>
-        </w:tc>
-        <w:tc>
-          <w:tcPr>
-            <w:tcW w:type="dxa" w:w="1417"/>
-          </w:tcPr>
-          <w:p>
-            <w:pPr>
-              <w:jc w:val="center"/>
-            </w:pPr>
-            <w:r>
-              <w:rPr>
-                <w:sz w:val="20"/>
-              </w:rPr>
-              <w:t>733.1</w:t>
-            </w:r>
-          </w:p>
-        </w:tc>
-        <w:tc>
-          <w:tcPr>
-            <w:tcW w:type="dxa" w:w="1417"/>
-          </w:tcPr>
-          <w:p>
-            <w:pPr>
-              <w:jc w:val="center"/>
-            </w:pPr>
-            <w:r>
-              <w:rPr>
-                <w:sz w:val="20"/>
-              </w:rPr>
-              <w:t>629.0</w:t>
-            </w:r>
-          </w:p>
-        </w:tc>
-        <w:tc>
-          <w:tcPr>
-            <w:tcW w:type="dxa" w:w="1417"/>
-          </w:tcPr>
-          <w:p>
-            <w:pPr>
-              <w:jc w:val="center"/>
-            </w:pPr>
-            <w:r>
-              <w:rPr>
-                <w:sz w:val="20"/>
-              </w:rPr>
-              <w:t>-104.1</w:t>
-            </w:r>
-          </w:p>
-        </w:tc>
-        <w:tc>
-          <w:tcPr>
-            <w:tcW w:type="dxa" w:w="1417"/>
-          </w:tcPr>
-          <w:p>
-            <w:pPr>
-              <w:jc w:val="center"/>
-            </w:pPr>
-            <w:r>
-              <w:rPr>
-                <w:sz w:val="20"/>
-              </w:rPr>
-              <w:t>-14.2</w:t>
-            </w:r>
-          </w:p>
-        </w:tc>
-        <w:tc>
-          <w:tcPr>
-            <w:tcW w:type="dxa" w:w="1417"/>
-          </w:tcPr>
-          <w:p>
-            <w:pPr>
-              <w:jc w:val="center"/>
-            </w:pPr>
-            <w:r>
-              <w:rPr>
-                <w:sz w:val="20"/>
-              </w:rPr>
-              <w:t>pass</w:t>
-            </w:r>
-          </w:p>
-        </w:tc>
-      </w:tr>
-      <w:tr>
-        <w:tc>
-          <w:tcPr>
-            <w:tcW w:type="dxa" w:w="1417"/>
-          </w:tcPr>
-          <w:p>
-            <w:pPr>
-              <w:jc w:val="center"/>
-            </w:pPr>
-            <w:r>
-              <w:rPr>
-                <w:sz w:val="20"/>
-              </w:rPr>
-              <w:t>38</w:t>
-            </w:r>
-          </w:p>
-        </w:tc>
-        <w:tc>
-          <w:tcPr>
-            <w:tcW w:type="dxa" w:w="1417"/>
-          </w:tcPr>
-          <w:p>
-            <w:pPr>
-              <w:jc w:val="center"/>
-            </w:pPr>
-            <w:r>
-              <w:rPr>
-                <w:sz w:val="20"/>
-              </w:rPr>
-              <w:t>787.1</w:t>
-            </w:r>
-          </w:p>
-        </w:tc>
-        <w:tc>
-          <w:tcPr>
-            <w:tcW w:type="dxa" w:w="1417"/>
-          </w:tcPr>
-          <w:p>
-            <w:pPr>
-              <w:jc w:val="center"/>
-            </w:pPr>
-            <w:r>
-              <w:rPr>
-                <w:sz w:val="20"/>
-              </w:rPr>
-              <w:t>840.0</w:t>
-            </w:r>
-          </w:p>
-        </w:tc>
-        <w:tc>
-          <w:tcPr>
-            <w:tcW w:type="dxa" w:w="1417"/>
-          </w:tcPr>
-          <w:p>
-            <w:pPr>
-              <w:jc w:val="center"/>
-            </w:pPr>
-            <w:r>
-              <w:rPr>
-                <w:sz w:val="20"/>
-              </w:rPr>
-              <w:t>52.9</w:t>
-            </w:r>
-          </w:p>
-        </w:tc>
-        <w:tc>
-          <w:tcPr>
-            <w:tcW w:type="dxa" w:w="1417"/>
-          </w:tcPr>
-          <w:p>
-            <w:pPr>
-              <w:jc w:val="center"/>
-            </w:pPr>
-            <w:r>
-              <w:rPr>
-                <w:sz w:val="20"/>
-              </w:rPr>
-              <w:t>6.721</w:t>
-            </w:r>
-          </w:p>
-        </w:tc>
-        <w:tc>
-          <w:tcPr>
-            <w:tcW w:type="dxa" w:w="1417"/>
-          </w:tcPr>
-          <w:p>
-            <w:pPr>
-              <w:jc w:val="center"/>
-            </w:pPr>
-            <w:r>
-              <w:rPr>
-                <w:sz w:val="20"/>
-              </w:rPr>
-              <w:t>pass</w:t>
-            </w:r>
-          </w:p>
-        </w:tc>
-      </w:tr>
-      <w:tr>
-        <w:tc>
-          <w:tcPr>
-            <w:tcW w:type="dxa" w:w="1417"/>
-          </w:tcPr>
-          <w:p>
-            <w:pPr>
-              <w:jc w:val="center"/>
-            </w:pPr>
-            <w:r>
-              <w:rPr>
-                <w:sz w:val="20"/>
-              </w:rPr>
-              <w:t>22</w:t>
-            </w:r>
-          </w:p>
-        </w:tc>
-        <w:tc>
-          <w:tcPr>
-            <w:tcW w:type="dxa" w:w="1417"/>
-          </w:tcPr>
-          <w:p>
-            <w:pPr>
-              <w:jc w:val="center"/>
-            </w:pPr>
-            <w:r>
-              <w:rPr>
-                <w:sz w:val="20"/>
-              </w:rPr>
-              <w:t>854.3</w:t>
-            </w:r>
-          </w:p>
-        </w:tc>
-        <w:tc>
-          <w:tcPr>
-            <w:tcW w:type="dxa" w:w="1417"/>
-          </w:tcPr>
-          <w:p>
-            <w:pPr>
-              <w:jc w:val="center"/>
-            </w:pPr>
-            <w:r>
-              <w:rPr>
-                <w:sz w:val="20"/>
-              </w:rPr>
-              <w:t>855.0</w:t>
-            </w:r>
-          </w:p>
-        </w:tc>
-        <w:tc>
-          <w:tcPr>
-            <w:tcW w:type="dxa" w:w="1417"/>
-          </w:tcPr>
-          <w:p>
-            <w:pPr>
-              <w:jc w:val="center"/>
-            </w:pPr>
-            <w:r>
-              <w:rPr>
-                <w:sz w:val="20"/>
-              </w:rPr>
-              <w:t>0.7</w:t>
-            </w:r>
-          </w:p>
-        </w:tc>
-        <w:tc>
-          <w:tcPr>
-            <w:tcW w:type="dxa" w:w="1417"/>
-          </w:tcPr>
-          <w:p>
-            <w:pPr>
-              <w:jc w:val="center"/>
-            </w:pPr>
-            <w:r>
-              <w:rPr>
-                <w:sz w:val="20"/>
-              </w:rPr>
-              <w:t>0.082</w:t>
-            </w:r>
-          </w:p>
-        </w:tc>
-        <w:tc>
-          <w:tcPr>
-            <w:tcW w:type="dxa" w:w="1417"/>
-          </w:tcPr>
-          <w:p>
-            <w:pPr>
-              <w:jc w:val="center"/>
-            </w:pPr>
-            <w:r>
-              <w:rPr>
-                <w:sz w:val="20"/>
-              </w:rPr>
-              <w:t>pass</w:t>
-            </w:r>
-          </w:p>
-        </w:tc>
-      </w:tr>
-      <w:tr>
-        <w:tc>
-          <w:tcPr>
-            <w:tcW w:type="dxa" w:w="1417"/>
-          </w:tcPr>
-          <w:p>
-            <w:pPr>
-              <w:jc w:val="center"/>
-            </w:pPr>
-            <w:r>
-              <w:rPr>
-                <w:sz w:val="20"/>
-              </w:rPr>
-              <w:t>1</w:t>
-            </w:r>
-          </w:p>
-        </w:tc>
-        <w:tc>
-          <w:tcPr>
-            <w:tcW w:type="dxa" w:w="1417"/>
-          </w:tcPr>
-          <w:p>
-            <w:pPr>
-              <w:jc w:val="center"/>
-            </w:pPr>
-            <w:r>
-              <w:rPr>
-                <w:sz w:val="20"/>
-              </w:rPr>
-              <w:t>855.2</w:t>
-            </w:r>
-          </w:p>
-        </w:tc>
-        <w:tc>
-          <w:tcPr>
-            <w:tcW w:type="dxa" w:w="1417"/>
-          </w:tcPr>
-          <w:p>
-            <w:pPr>
-              <w:jc w:val="center"/>
-            </w:pPr>
-            <w:r>
-              <w:rPr>
-                <w:sz w:val="20"/>
-              </w:rPr>
-              <w:t>881.0</w:t>
-            </w:r>
-          </w:p>
-        </w:tc>
-        <w:tc>
-          <w:tcPr>
-            <w:tcW w:type="dxa" w:w="1417"/>
-          </w:tcPr>
-          <w:p>
-            <w:pPr>
-              <w:jc w:val="center"/>
-            </w:pPr>
-            <w:r>
-              <w:rPr>
-                <w:sz w:val="20"/>
-              </w:rPr>
-              <w:t>25.8</w:t>
-            </w:r>
-          </w:p>
-        </w:tc>
-        <w:tc>
-          <w:tcPr>
-            <w:tcW w:type="dxa" w:w="1417"/>
-          </w:tcPr>
-          <w:p>
-            <w:pPr>
-              <w:jc w:val="center"/>
-            </w:pPr>
-            <w:r>
-              <w:rPr>
-                <w:sz w:val="20"/>
-              </w:rPr>
-              <w:t>3.017</w:t>
-            </w:r>
-          </w:p>
-        </w:tc>
-        <w:tc>
-          <w:tcPr>
-            <w:tcW w:type="dxa" w:w="1417"/>
-          </w:tcPr>
-          <w:p>
-            <w:pPr>
-              <w:jc w:val="center"/>
-            </w:pPr>
-            <w:r>
-              <w:rPr>
-                <w:sz w:val="20"/>
-              </w:rPr>
-              <w:t>pass</w:t>
-            </w:r>
-          </w:p>
-        </w:tc>
-      </w:tr>
-      <w:tr>
-        <w:tc>
-          <w:tcPr>
-            <w:tcW w:type="dxa" w:w="1417"/>
-          </w:tcPr>
-          <w:p>
-            <w:pPr>
-              <w:jc w:val="center"/>
-            </w:pPr>
-            <w:r>
-              <w:rPr>
-                <w:sz w:val="20"/>
-              </w:rPr>
-              <w:t>36</w:t>
-            </w:r>
-          </w:p>
-        </w:tc>
-        <w:tc>
-          <w:tcPr>
-            <w:tcW w:type="dxa" w:w="1417"/>
-          </w:tcPr>
-          <w:p>
-            <w:pPr>
-              <w:jc w:val="center"/>
-            </w:pPr>
-            <w:r>
-              <w:rPr>
-                <w:sz w:val="20"/>
-              </w:rPr>
-              <w:t>1002.4</w:t>
-            </w:r>
-          </w:p>
-        </w:tc>
-        <w:tc>
-          <w:tcPr>
-            <w:tcW w:type="dxa" w:w="1417"/>
-          </w:tcPr>
-          <w:p>
-            <w:pPr>
-              <w:jc w:val="center"/>
-            </w:pPr>
-            <w:r>
-              <w:rPr>
-                <w:sz w:val="20"/>
-              </w:rPr>
-              <w:t>1100.0</w:t>
-            </w:r>
-          </w:p>
-        </w:tc>
-        <w:tc>
-          <w:tcPr>
-            <w:tcW w:type="dxa" w:w="1417"/>
-          </w:tcPr>
-          <w:p>
-            <w:pPr>
-              <w:jc w:val="center"/>
-            </w:pPr>
-            <w:r>
-              <w:rPr>
-                <w:sz w:val="20"/>
-              </w:rPr>
-              <w:t>97.6</w:t>
-            </w:r>
-          </w:p>
-        </w:tc>
-        <w:tc>
-          <w:tcPr>
-            <w:tcW w:type="dxa" w:w="1417"/>
-          </w:tcPr>
-          <w:p>
-            <w:pPr>
-              <w:jc w:val="center"/>
-            </w:pPr>
-            <w:r>
-              <w:rPr>
-                <w:sz w:val="20"/>
-              </w:rPr>
-              <w:t>9.737</w:t>
-            </w:r>
-          </w:p>
-        </w:tc>
-        <w:tc>
-          <w:tcPr>
-            <w:tcW w:type="dxa" w:w="1417"/>
-          </w:tcPr>
-          <w:p>
-            <w:pPr>
-              <w:jc w:val="center"/>
-            </w:pPr>
-            <w:r>
-              <w:rPr>
-                <w:sz w:val="20"/>
-              </w:rPr>
-              <w:t>pass</w:t>
-            </w:r>
-          </w:p>
-        </w:tc>
-      </w:tr>
-      <w:tr>
-        <w:tc>
-          <w:tcPr>
-            <w:tcW w:type="dxa" w:w="1417"/>
-          </w:tcPr>
-          <w:p>
-            <w:pPr>
-              <w:jc w:val="center"/>
-            </w:pPr>
-            <w:r>
-              <w:rPr>
-                <w:sz w:val="20"/>
-              </w:rPr>
-              <w:t>23</w:t>
-            </w:r>
-          </w:p>
-        </w:tc>
-        <w:tc>
-          <w:tcPr>
-            <w:tcW w:type="dxa" w:w="1417"/>
-          </w:tcPr>
-          <w:p>
-            <w:pPr>
-              <w:jc w:val="center"/>
-            </w:pPr>
-            <w:r>
-              <w:rPr>
-                <w:sz w:val="20"/>
-              </w:rPr>
-              <w:t>1080.1</w:t>
-            </w:r>
-          </w:p>
-        </w:tc>
-        <w:tc>
-          <w:tcPr>
-            <w:tcW w:type="dxa" w:w="1417"/>
-          </w:tcPr>
-          <w:p>
-            <w:pPr>
-              <w:jc w:val="center"/>
-            </w:pPr>
-            <w:r>
-              <w:rPr>
-                <w:sz w:val="20"/>
-              </w:rPr>
-              <w:t>1240.0</w:t>
-            </w:r>
-          </w:p>
-        </w:tc>
-        <w:tc>
-          <w:tcPr>
-            <w:tcW w:type="dxa" w:w="1417"/>
-          </w:tcPr>
-          <w:p>
-            <w:pPr>
-              <w:jc w:val="center"/>
-            </w:pPr>
-            <w:r>
-              <w:rPr>
-                <w:sz w:val="20"/>
-              </w:rPr>
-              <w:t>159.9</w:t>
-            </w:r>
-          </w:p>
-        </w:tc>
-        <w:tc>
-          <w:tcPr>
-            <w:tcW w:type="dxa" w:w="1417"/>
-          </w:tcPr>
-          <w:p>
-            <w:pPr>
-              <w:jc w:val="center"/>
-            </w:pPr>
-            <w:r>
-              <w:rPr>
-                <w:sz w:val="20"/>
-              </w:rPr>
-              <w:t>14.804</w:t>
-            </w:r>
-          </w:p>
-        </w:tc>
-        <w:tc>
-          <w:tcPr>
-            <w:tcW w:type="dxa" w:w="1417"/>
-          </w:tcPr>
-          <w:p>
-            <w:pPr>
-              <w:jc w:val="center"/>
-            </w:pPr>
-            <w:r>
-              <w:rPr>
-                <w:sz w:val="20"/>
-              </w:rPr>
-              <w:t>pass</w:t>
-            </w:r>
-          </w:p>
-        </w:tc>
-      </w:tr>
-      <w:tr>
-        <w:tc>
-          <w:tcPr>
-            <w:tcW w:type="dxa" w:w="1417"/>
-          </w:tcPr>
-          <w:p>
-            <w:pPr>
-              <w:jc w:val="center"/>
-            </w:pPr>
-            <w:r>
-              <w:rPr>
-                <w:sz w:val="20"/>
-              </w:rPr>
-              <w:t>0</w:t>
-            </w:r>
-          </w:p>
-        </w:tc>
-        <w:tc>
-          <w:tcPr>
-            <w:tcW w:type="dxa" w:w="1417"/>
-          </w:tcPr>
-          <w:p>
-            <w:pPr>
-              <w:jc w:val="center"/>
-            </w:pPr>
-            <w:r>
-              <w:rPr>
-                <w:sz w:val="20"/>
-              </w:rPr>
-              <w:t>1485.1</w:t>
-            </w:r>
-          </w:p>
-        </w:tc>
-        <w:tc>
-          <w:tcPr>
-            <w:tcW w:type="dxa" w:w="1417"/>
-          </w:tcPr>
-          <w:p>
-            <w:pPr>
-              <w:jc w:val="center"/>
-            </w:pPr>
-            <w:r>
-              <w:rPr>
-                <w:sz w:val="20"/>
-              </w:rPr>
-              <w:t>1710.0</w:t>
-            </w:r>
-          </w:p>
-        </w:tc>
-        <w:tc>
-          <w:tcPr>
-            <w:tcW w:type="dxa" w:w="1417"/>
-          </w:tcPr>
-          <w:p>
-            <w:pPr>
-              <w:jc w:val="center"/>
-            </w:pPr>
-            <w:r>
-              <w:rPr>
-                <w:sz w:val="20"/>
-              </w:rPr>
-              <w:t>224.9</w:t>
-            </w:r>
-          </w:p>
-        </w:tc>
-        <w:tc>
-          <w:tcPr>
-            <w:tcW w:type="dxa" w:w="1417"/>
-          </w:tcPr>
-          <w:p>
-            <w:pPr>
-              <w:jc w:val="center"/>
-            </w:pPr>
-            <w:r>
-              <w:rPr>
-                <w:sz w:val="20"/>
-              </w:rPr>
-              <w:t>15.144</w:t>
-            </w:r>
-          </w:p>
-        </w:tc>
-        <w:tc>
-          <w:tcPr>
-            <w:tcW w:type="dxa" w:w="1417"/>
-          </w:tcPr>
-          <w:p>
-            <w:pPr>
-              <w:jc w:val="center"/>
-            </w:pPr>
-            <w:r>
-              <w:rPr>
-                <w:sz w:val="20"/>
-              </w:rPr>
-              <w:t>**FAIL**</w:t>
-            </w:r>
-          </w:p>
-        </w:tc>
-      </w:tr>
-      <w:tr>
-        <w:tc>
-          <w:tcPr>
-            <w:tcW w:type="dxa" w:w="1417"/>
-          </w:tcPr>
-          <w:p>
-            <w:pPr>
-              <w:jc w:val="center"/>
-            </w:pPr>
-            <w:r>
-              <w:rPr>
-                <w:sz w:val="20"/>
-              </w:rPr>
-              <w:t>21</w:t>
-            </w:r>
-          </w:p>
-        </w:tc>
-        <w:tc>
-          <w:tcPr>
-            <w:tcW w:type="dxa" w:w="1417"/>
-          </w:tcPr>
-          <w:p>
-            <w:pPr>
-              <w:jc w:val="center"/>
-            </w:pPr>
-            <w:r>
-              <w:rPr>
-                <w:sz w:val="20"/>
-              </w:rPr>
-              <w:t>1503.3</w:t>
-            </w:r>
-          </w:p>
-        </w:tc>
-        <w:tc>
-          <w:tcPr>
-            <w:tcW w:type="dxa" w:w="1417"/>
-          </w:tcPr>
-          <w:p>
-            <w:pPr>
-              <w:jc w:val="center"/>
-            </w:pPr>
-            <w:r>
-              <w:rPr>
-                <w:sz w:val="20"/>
-              </w:rPr>
-              <w:t>1640.0</w:t>
-            </w:r>
-          </w:p>
-        </w:tc>
-        <w:tc>
-          <w:tcPr>
-            <w:tcW w:type="dxa" w:w="1417"/>
-          </w:tcPr>
-          <w:p>
-            <w:pPr>
-              <w:jc w:val="center"/>
-            </w:pPr>
-            <w:r>
-              <w:rPr>
-                <w:sz w:val="20"/>
-              </w:rPr>
-              <w:t>136.7</w:t>
-            </w:r>
-          </w:p>
-        </w:tc>
-        <w:tc>
-          <w:tcPr>
-            <w:tcW w:type="dxa" w:w="1417"/>
-          </w:tcPr>
-          <w:p>
-            <w:pPr>
-              <w:jc w:val="center"/>
-            </w:pPr>
-            <w:r>
-              <w:rPr>
-                <w:sz w:val="20"/>
-              </w:rPr>
-              <w:t>9.093</w:t>
-            </w:r>
-          </w:p>
-        </w:tc>
-        <w:tc>
-          <w:tcPr>
-            <w:tcW w:type="dxa" w:w="1417"/>
-          </w:tcPr>
-          <w:p>
-            <w:pPr>
-              <w:jc w:val="center"/>
-            </w:pPr>
-            <w:r>
-              <w:rPr>
-                <w:sz w:val="20"/>
-              </w:rPr>
-              <w:t>pass</w:t>
-            </w:r>
-          </w:p>
-        </w:tc>
-      </w:tr>
-      <w:tr>
-        <w:tc>
-          <w:tcPr>
-            <w:tcW w:type="dxa" w:w="1417"/>
-          </w:tcPr>
-          <w:p>
-            <w:pPr>
-              <w:jc w:val="center"/>
-            </w:pPr>
-            <w:r>
-              <w:rPr>
-                <w:sz w:val="20"/>
-              </w:rPr>
-              <w:t>26</w:t>
-            </w:r>
-          </w:p>
-        </w:tc>
-        <w:tc>
-          <w:tcPr>
-            <w:tcW w:type="dxa" w:w="1417"/>
-          </w:tcPr>
-          <w:p>
-            <w:pPr>
-              <w:jc w:val="center"/>
-            </w:pPr>
-            <w:r>
-              <w:rPr>
-                <w:sz w:val="20"/>
-              </w:rPr>
-              <w:t>1530.4</w:t>
-            </w:r>
-          </w:p>
-        </w:tc>
-        <w:tc>
-          <w:tcPr>
-            <w:tcW w:type="dxa" w:w="1417"/>
-          </w:tcPr>
-          <w:p>
-            <w:pPr>
-              <w:jc w:val="center"/>
-            </w:pPr>
-            <w:r>
-              <w:rPr>
-                <w:sz w:val="20"/>
-              </w:rPr>
-              <w:t>1520.0</w:t>
-            </w:r>
-          </w:p>
-        </w:tc>
-        <w:tc>
-          <w:tcPr>
-            <w:tcW w:type="dxa" w:w="1417"/>
-          </w:tcPr>
-          <w:p>
-            <w:pPr>
-              <w:jc w:val="center"/>
-            </w:pPr>
-            <w:r>
-              <w:rPr>
-                <w:sz w:val="20"/>
-              </w:rPr>
-              <w:t>-10.4</w:t>
-            </w:r>
-          </w:p>
-        </w:tc>
-        <w:tc>
-          <w:tcPr>
-            <w:tcW w:type="dxa" w:w="1417"/>
-          </w:tcPr>
-          <w:p>
-            <w:pPr>
-              <w:jc w:val="center"/>
-            </w:pPr>
-            <w:r>
-              <w:rPr>
-                <w:sz w:val="20"/>
-              </w:rPr>
-              <w:t>-0.68</w:t>
-            </w:r>
-          </w:p>
-        </w:tc>
-        <w:tc>
-          <w:tcPr>
-            <w:tcW w:type="dxa" w:w="1417"/>
-          </w:tcPr>
-          <w:p>
-            <w:pPr>
-              <w:jc w:val="center"/>
-            </w:pPr>
-            <w:r>
-              <w:rPr>
-                <w:sz w:val="20"/>
-              </w:rPr>
-              <w:t>pass</w:t>
-            </w:r>
-          </w:p>
-        </w:tc>
-      </w:tr>
-      <w:tr>
-        <w:tc>
-          <w:tcPr>
-            <w:tcW w:type="dxa" w:w="1417"/>
-          </w:tcPr>
-          <w:p>
-            <w:pPr>
-              <w:jc w:val="center"/>
-            </w:pPr>
-            <w:r>
-              <w:rPr>
-                <w:sz w:val="20"/>
-              </w:rPr>
-              <w:t>29</w:t>
-            </w:r>
-          </w:p>
-        </w:tc>
-        <w:tc>
-          <w:tcPr>
-            <w:tcW w:type="dxa" w:w="1417"/>
-          </w:tcPr>
-          <w:p>
-            <w:pPr>
-              <w:jc w:val="center"/>
-            </w:pPr>
-            <w:r>
-              <w:rPr>
-                <w:sz w:val="20"/>
-              </w:rPr>
-              <w:t>1600.0</w:t>
-            </w:r>
-          </w:p>
-        </w:tc>
-        <w:tc>
-          <w:tcPr>
-            <w:tcW w:type="dxa" w:w="1417"/>
-          </w:tcPr>
-          <w:p>
-            <w:pPr>
-              <w:jc w:val="center"/>
-            </w:pPr>
-            <w:r>
-              <w:rPr>
-                <w:sz w:val="20"/>
-              </w:rPr>
-              <w:t>1780.0</w:t>
-            </w:r>
-          </w:p>
-        </w:tc>
-        <w:tc>
-          <w:tcPr>
-            <w:tcW w:type="dxa" w:w="1417"/>
-          </w:tcPr>
-          <w:p>
-            <w:pPr>
-              <w:jc w:val="center"/>
-            </w:pPr>
-            <w:r>
-              <w:rPr>
-                <w:sz w:val="20"/>
-              </w:rPr>
-              <w:t>180.0</w:t>
-            </w:r>
-          </w:p>
-        </w:tc>
-        <w:tc>
-          <w:tcPr>
-            <w:tcW w:type="dxa" w:w="1417"/>
-          </w:tcPr>
-          <w:p>
-            <w:pPr>
-              <w:jc w:val="center"/>
-            </w:pPr>
-            <w:r>
-              <w:rPr>
-                <w:sz w:val="20"/>
-              </w:rPr>
-              <w:t>11.25</w:t>
-            </w:r>
-          </w:p>
-        </w:tc>
-        <w:tc>
-          <w:tcPr>
-            <w:tcW w:type="dxa" w:w="1417"/>
-          </w:tcPr>
-          <w:p>
-            <w:pPr>
-              <w:jc w:val="center"/>
-            </w:pPr>
-            <w:r>
-              <w:rPr>
-                <w:sz w:val="20"/>
-              </w:rPr>
-              <w:t>pass</w:t>
-            </w:r>
-          </w:p>
-        </w:tc>
-      </w:tr>
-      <w:tr>
-        <w:tc>
-          <w:tcPr>
-            <w:tcW w:type="dxa" w:w="1417"/>
-          </w:tcPr>
-          <w:p>
-            <w:pPr>
-              <w:jc w:val="center"/>
-            </w:pPr>
-            <w:r>
-              <w:rPr>
-                <w:sz w:val="20"/>
-              </w:rPr>
-              <w:t>12</w:t>
-            </w:r>
-          </w:p>
-        </w:tc>
-        <w:tc>
-          <w:tcPr>
-            <w:tcW w:type="dxa" w:w="1417"/>
-          </w:tcPr>
-          <w:p>
-            <w:pPr>
-              <w:jc w:val="center"/>
-            </w:pPr>
-            <w:r>
-              <w:rPr>
-                <w:sz w:val="20"/>
-              </w:rPr>
-              <w:t>1658.9</w:t>
-            </w:r>
-          </w:p>
-        </w:tc>
-        <w:tc>
-          <w:tcPr>
-            <w:tcW w:type="dxa" w:w="1417"/>
-          </w:tcPr>
-          <w:p>
-            <w:pPr>
-              <w:jc w:val="center"/>
-            </w:pPr>
-            <w:r>
-              <w:rPr>
-                <w:sz w:val="20"/>
-              </w:rPr>
-              <w:t>1860.0</w:t>
-            </w:r>
-          </w:p>
-        </w:tc>
-        <w:tc>
-          <w:tcPr>
-            <w:tcW w:type="dxa" w:w="1417"/>
-          </w:tcPr>
-          <w:p>
-            <w:pPr>
-              <w:jc w:val="center"/>
-            </w:pPr>
-            <w:r>
-              <w:rPr>
-                <w:sz w:val="20"/>
-              </w:rPr>
-              <w:t>201.1</w:t>
-            </w:r>
-          </w:p>
-        </w:tc>
-        <w:tc>
-          <w:tcPr>
-            <w:tcW w:type="dxa" w:w="1417"/>
-          </w:tcPr>
-          <w:p>
-            <w:pPr>
-              <w:jc w:val="center"/>
-            </w:pPr>
-            <w:r>
-              <w:rPr>
-                <w:sz w:val="20"/>
-              </w:rPr>
-              <w:t>12.122</w:t>
-            </w:r>
-          </w:p>
-        </w:tc>
-        <w:tc>
-          <w:tcPr>
-            <w:tcW w:type="dxa" w:w="1417"/>
-          </w:tcPr>
-          <w:p>
-            <w:pPr>
-              <w:jc w:val="center"/>
-            </w:pPr>
-            <w:r>
-              <w:rPr>
-                <w:sz w:val="20"/>
-              </w:rPr>
-              <w:t>pass</w:t>
-            </w:r>
-          </w:p>
-        </w:tc>
-      </w:tr>
-      <w:tr>
-        <w:tc>
-          <w:tcPr>
-            <w:tcW w:type="dxa" w:w="1417"/>
-          </w:tcPr>
-          <w:p>
-            <w:pPr>
-              <w:jc w:val="center"/>
-            </w:pPr>
-            <w:r>
-              <w:rPr>
-                <w:sz w:val="20"/>
-              </w:rPr>
-              <w:t>9</w:t>
-            </w:r>
-          </w:p>
-        </w:tc>
-        <w:tc>
-          <w:tcPr>
-            <w:tcW w:type="dxa" w:w="1417"/>
-          </w:tcPr>
-          <w:p>
-            <w:pPr>
-              <w:jc w:val="center"/>
-            </w:pPr>
-            <w:r>
-              <w:rPr>
-                <w:sz w:val="20"/>
-              </w:rPr>
-              <w:t>2050.8</w:t>
-            </w:r>
-          </w:p>
-        </w:tc>
-        <w:tc>
-          <w:tcPr>
-            <w:tcW w:type="dxa" w:w="1417"/>
-          </w:tcPr>
-          <w:p>
-            <w:pPr>
-              <w:jc w:val="center"/>
-            </w:pPr>
-            <w:r>
-              <w:rPr>
-                <w:sz w:val="20"/>
-              </w:rPr>
-              <w:t>2310.0</w:t>
-            </w:r>
-          </w:p>
-        </w:tc>
-        <w:tc>
-          <w:tcPr>
-            <w:tcW w:type="dxa" w:w="1417"/>
-          </w:tcPr>
-          <w:p>
-            <w:pPr>
-              <w:jc w:val="center"/>
-            </w:pPr>
-            <w:r>
-              <w:rPr>
-                <w:sz w:val="20"/>
-              </w:rPr>
-              <w:t>259.2</w:t>
-            </w:r>
-          </w:p>
-        </w:tc>
-        <w:tc>
-          <w:tcPr>
-            <w:tcW w:type="dxa" w:w="1417"/>
-          </w:tcPr>
-          <w:p>
-            <w:pPr>
-              <w:jc w:val="center"/>
-            </w:pPr>
-            <w:r>
-              <w:rPr>
-                <w:sz w:val="20"/>
-              </w:rPr>
-              <w:t>12.639</w:t>
-            </w:r>
-          </w:p>
-        </w:tc>
-        <w:tc>
-          <w:tcPr>
-            <w:tcW w:type="dxa" w:w="1417"/>
-          </w:tcPr>
-          <w:p>
-            <w:pPr>
-              <w:jc w:val="center"/>
-            </w:pPr>
-            <w:r>
-              <w:rPr>
-                <w:sz w:val="20"/>
-              </w:rPr>
-              <w:t>pass</w:t>
-            </w:r>
-          </w:p>
-        </w:tc>
-      </w:tr>
-      <w:tr>
-        <w:tc>
-          <w:tcPr>
-            <w:tcW w:type="dxa" w:w="1417"/>
-          </w:tcPr>
-          <w:p>
-            <w:pPr>
-              <w:jc w:val="center"/>
-            </w:pPr>
-            <w:r>
-              <w:rPr>
-                <w:sz w:val="20"/>
-              </w:rPr>
-              <w:t>39</w:t>
-            </w:r>
-          </w:p>
-        </w:tc>
-        <w:tc>
-          <w:tcPr>
-            <w:tcW w:type="dxa" w:w="1417"/>
-          </w:tcPr>
-          <w:p>
-            <w:pPr>
-              <w:jc w:val="center"/>
-            </w:pPr>
-            <w:r>
-              <w:rPr>
-                <w:sz w:val="20"/>
-              </w:rPr>
-              <w:t>2241.8</w:t>
-            </w:r>
-          </w:p>
-        </w:tc>
-        <w:tc>
-          <w:tcPr>
-            <w:tcW w:type="dxa" w:w="1417"/>
-          </w:tcPr>
-          <w:p>
-            <w:pPr>
-              <w:jc w:val="center"/>
-            </w:pPr>
-            <w:r>
-              <w:rPr>
-                <w:sz w:val="20"/>
-              </w:rPr>
-              <w:t>2310.0</w:t>
-            </w:r>
-          </w:p>
-        </w:tc>
-        <w:tc>
-          <w:tcPr>
-            <w:tcW w:type="dxa" w:w="1417"/>
-          </w:tcPr>
-          <w:p>
-            <w:pPr>
-              <w:jc w:val="center"/>
-            </w:pPr>
-            <w:r>
-              <w:rPr>
-                <w:sz w:val="20"/>
-              </w:rPr>
-              <w:t>68.2</w:t>
-            </w:r>
-          </w:p>
-        </w:tc>
-        <w:tc>
-          <w:tcPr>
-            <w:tcW w:type="dxa" w:w="1417"/>
-          </w:tcPr>
-          <w:p>
-            <w:pPr>
-              <w:jc w:val="center"/>
-            </w:pPr>
-            <w:r>
-              <w:rPr>
-                <w:sz w:val="20"/>
-              </w:rPr>
-              <w:t>3.042</w:t>
-            </w:r>
-          </w:p>
-        </w:tc>
-        <w:tc>
-          <w:tcPr>
-            <w:tcW w:type="dxa" w:w="1417"/>
-          </w:tcPr>
-          <w:p>
-            <w:pPr>
-              <w:jc w:val="center"/>
-            </w:pPr>
-            <w:r>
-              <w:rPr>
-                <w:sz w:val="20"/>
-              </w:rPr>
-              <w:t>pass</w:t>
-            </w:r>
-          </w:p>
-        </w:tc>
-      </w:tr>
-      <w:tr>
-        <w:tc>
-          <w:tcPr>
-            <w:tcW w:type="dxa" w:w="1417"/>
-          </w:tcPr>
-          <w:p>
-            <w:pPr>
-              <w:jc w:val="center"/>
-            </w:pPr>
-            <w:r>
-              <w:rPr>
-                <w:sz w:val="20"/>
-              </w:rPr>
-              <w:t>19</w:t>
-            </w:r>
-          </w:p>
-        </w:tc>
-        <w:tc>
-          <w:tcPr>
-            <w:tcW w:type="dxa" w:w="1417"/>
-          </w:tcPr>
-          <w:p>
-            <w:pPr>
-              <w:jc w:val="center"/>
-            </w:pPr>
-            <w:r>
-              <w:rPr>
-                <w:sz w:val="20"/>
-              </w:rPr>
-              <w:t>2264.7</w:t>
-            </w:r>
-          </w:p>
-        </w:tc>
-        <w:tc>
-          <w:tcPr>
-            <w:tcW w:type="dxa" w:w="1417"/>
-          </w:tcPr>
-          <w:p>
-            <w:pPr>
-              <w:jc w:val="center"/>
-            </w:pPr>
-            <w:r>
-              <w:rPr>
-                <w:sz w:val="20"/>
-              </w:rPr>
-              <w:t>2580.0</w:t>
-            </w:r>
-          </w:p>
-        </w:tc>
-        <w:tc>
-          <w:tcPr>
-            <w:tcW w:type="dxa" w:w="1417"/>
-          </w:tcPr>
-          <w:p>
-            <w:pPr>
-              <w:jc w:val="center"/>
-            </w:pPr>
-            <w:r>
-              <w:rPr>
-                <w:sz w:val="20"/>
-              </w:rPr>
-              <w:t>315.3</w:t>
-            </w:r>
-          </w:p>
-        </w:tc>
-        <w:tc>
-          <w:tcPr>
-            <w:tcW w:type="dxa" w:w="1417"/>
-          </w:tcPr>
-          <w:p>
-            <w:pPr>
-              <w:jc w:val="center"/>
-            </w:pPr>
-            <w:r>
-              <w:rPr>
-                <w:sz w:val="20"/>
-              </w:rPr>
-              <w:t>13.922</w:t>
-            </w:r>
-          </w:p>
-        </w:tc>
-        <w:tc>
-          <w:tcPr>
-            <w:tcW w:type="dxa" w:w="1417"/>
-          </w:tcPr>
-          <w:p>
-            <w:pPr>
-              <w:jc w:val="center"/>
-            </w:pPr>
-            <w:r>
-              <w:rPr>
-                <w:sz w:val="20"/>
-              </w:rPr>
-              <w:t>pass</w:t>
-            </w:r>
-          </w:p>
-        </w:tc>
-      </w:tr>
-      <w:tr>
-        <w:tc>
-          <w:tcPr>
-            <w:tcW w:type="dxa" w:w="1417"/>
-          </w:tcPr>
-          <w:p>
-            <w:pPr>
-              <w:jc w:val="center"/>
-            </w:pPr>
-            <w:r>
-              <w:rPr>
-                <w:sz w:val="20"/>
-              </w:rPr>
-              <w:t>7</w:t>
-            </w:r>
-          </w:p>
-        </w:tc>
-        <w:tc>
-          <w:tcPr>
-            <w:tcW w:type="dxa" w:w="1417"/>
-          </w:tcPr>
-          <w:p>
-            <w:pPr>
-              <w:jc w:val="center"/>
-            </w:pPr>
-            <w:r>
-              <w:rPr>
-                <w:sz w:val="20"/>
-              </w:rPr>
-              <w:t>2996.8</w:t>
-            </w:r>
-          </w:p>
-        </w:tc>
-        <w:tc>
-          <w:tcPr>
-            <w:tcW w:type="dxa" w:w="1417"/>
-          </w:tcPr>
-          <w:p>
-            <w:pPr>
-              <w:jc w:val="center"/>
-            </w:pPr>
-            <w:r>
-              <w:rPr>
-                <w:sz w:val="20"/>
-              </w:rPr>
-              <w:t>3150.0</w:t>
-            </w:r>
-          </w:p>
-        </w:tc>
-        <w:tc>
-          <w:tcPr>
-            <w:tcW w:type="dxa" w:w="1417"/>
-          </w:tcPr>
-          <w:p>
-            <w:pPr>
-              <w:jc w:val="center"/>
-            </w:pPr>
-            <w:r>
-              <w:rPr>
-                <w:sz w:val="20"/>
-              </w:rPr>
-              <w:t>153.2</w:t>
-            </w:r>
-          </w:p>
-        </w:tc>
-        <w:tc>
-          <w:tcPr>
-            <w:tcW w:type="dxa" w:w="1417"/>
-          </w:tcPr>
-          <w:p>
-            <w:pPr>
-              <w:jc w:val="center"/>
-            </w:pPr>
-            <w:r>
-              <w:rPr>
-                <w:sz w:val="20"/>
-              </w:rPr>
-              <w:t>5.112</w:t>
-            </w:r>
-          </w:p>
-        </w:tc>
-        <w:tc>
-          <w:tcPr>
-            <w:tcW w:type="dxa" w:w="1417"/>
-          </w:tcPr>
-          <w:p>
-            <w:pPr>
-              <w:jc w:val="center"/>
-            </w:pPr>
-            <w:r>
-              <w:rPr>
-                <w:sz w:val="20"/>
-              </w:rPr>
-              <w:t>pass</w:t>
-            </w:r>
-          </w:p>
-        </w:tc>
-      </w:tr>
-      <w:tr>
-        <w:tc>
-          <w:tcPr>
-            <w:tcW w:type="dxa" w:w="1417"/>
-          </w:tcPr>
-          <w:p>
-            <w:pPr>
-              <w:jc w:val="center"/>
-            </w:pPr>
-            <w:r>
-              <w:rPr>
-                <w:sz w:val="20"/>
-              </w:rPr>
-              <w:t>37</w:t>
-            </w:r>
-          </w:p>
-        </w:tc>
-        <w:tc>
-          <w:tcPr>
-            <w:tcW w:type="dxa" w:w="1417"/>
-          </w:tcPr>
-          <w:p>
-            <w:pPr>
-              <w:jc w:val="center"/>
-            </w:pPr>
-            <w:r>
-              <w:rPr>
-                <w:sz w:val="20"/>
-              </w:rPr>
-              <w:t>3828.3</w:t>
-            </w:r>
-          </w:p>
-        </w:tc>
-        <w:tc>
-          <w:tcPr>
-            <w:tcW w:type="dxa" w:w="1417"/>
-          </w:tcPr>
-          <w:p>
-            <w:pPr>
-              <w:jc w:val="center"/>
-            </w:pPr>
-            <w:r>
-              <w:rPr>
-                <w:sz w:val="20"/>
-              </w:rPr>
-              <w:t>3470.0</w:t>
-            </w:r>
-          </w:p>
-        </w:tc>
-        <w:tc>
-          <w:tcPr>
-            <w:tcW w:type="dxa" w:w="1417"/>
-          </w:tcPr>
-          <w:p>
-            <w:pPr>
-              <w:jc w:val="center"/>
-            </w:pPr>
-            <w:r>
-              <w:rPr>
-                <w:sz w:val="20"/>
-              </w:rPr>
-              <w:t>-358.3</w:t>
-            </w:r>
-          </w:p>
-        </w:tc>
-        <w:tc>
-          <w:tcPr>
-            <w:tcW w:type="dxa" w:w="1417"/>
-          </w:tcPr>
-          <w:p>
-            <w:pPr>
-              <w:jc w:val="center"/>
-            </w:pPr>
-            <w:r>
-              <w:rPr>
-                <w:sz w:val="20"/>
-              </w:rPr>
-              <w:t>-9.359</w:t>
-            </w:r>
-          </w:p>
-        </w:tc>
-        <w:tc>
-          <w:tcPr>
-            <w:tcW w:type="dxa" w:w="1417"/>
-          </w:tcPr>
-          <w:p>
-            <w:pPr>
-              <w:jc w:val="center"/>
-            </w:pPr>
-            <w:r>
-              <w:rPr>
-                <w:sz w:val="20"/>
-              </w:rPr>
-              <w:t>pass</w:t>
-            </w:r>
-          </w:p>
-        </w:tc>
-      </w:tr>
-      <w:tr>
-        <w:tc>
-          <w:tcPr>
-            <w:tcW w:type="dxa" w:w="1417"/>
-          </w:tcPr>
-          <w:p>
-            <w:pPr>
-              <w:jc w:val="center"/>
-            </w:pPr>
-            <w:r>
-              <w:rPr>
-                <w:sz w:val="20"/>
-              </w:rPr>
-              <w:t>15</w:t>
-            </w:r>
-          </w:p>
-        </w:tc>
-        <w:tc>
-          <w:tcPr>
-            <w:tcW w:type="dxa" w:w="1417"/>
-          </w:tcPr>
-          <w:p>
-            <w:pPr>
-              <w:jc w:val="center"/>
-            </w:pPr>
-            <w:r>
-              <w:rPr>
-                <w:sz w:val="20"/>
-              </w:rPr>
-              <w:t>3898.7</w:t>
-            </w:r>
-          </w:p>
-        </w:tc>
-        <w:tc>
-          <w:tcPr>
-            <w:tcW w:type="dxa" w:w="1417"/>
-          </w:tcPr>
-          <w:p>
-            <w:pPr>
-              <w:jc w:val="center"/>
-            </w:pPr>
-            <w:r>
-              <w:rPr>
-                <w:sz w:val="20"/>
-              </w:rPr>
-              <w:t>4250.0</w:t>
-            </w:r>
-          </w:p>
-        </w:tc>
-        <w:tc>
-          <w:tcPr>
-            <w:tcW w:type="dxa" w:w="1417"/>
-          </w:tcPr>
-          <w:p>
-            <w:pPr>
-              <w:jc w:val="center"/>
-            </w:pPr>
-            <w:r>
-              <w:rPr>
-                <w:sz w:val="20"/>
-              </w:rPr>
-              <w:t>351.3</w:t>
-            </w:r>
-          </w:p>
-        </w:tc>
-        <w:tc>
-          <w:tcPr>
-            <w:tcW w:type="dxa" w:w="1417"/>
-          </w:tcPr>
-          <w:p>
-            <w:pPr>
-              <w:jc w:val="center"/>
-            </w:pPr>
-            <w:r>
-              <w:rPr>
-                <w:sz w:val="20"/>
-              </w:rPr>
-              <w:t>9.011</w:t>
-            </w:r>
-          </w:p>
-        </w:tc>
-        <w:tc>
-          <w:tcPr>
-            <w:tcW w:type="dxa" w:w="1417"/>
-          </w:tcPr>
-          <w:p>
-            <w:pPr>
-              <w:jc w:val="center"/>
-            </w:pPr>
-            <w:r>
-              <w:rPr>
-                <w:sz w:val="20"/>
-              </w:rPr>
-              <w:t>pass</w:t>
-            </w:r>
-          </w:p>
-        </w:tc>
-      </w:tr>
-      <w:tr>
-        <w:tc>
-          <w:tcPr>
-            <w:tcW w:type="dxa" w:w="1417"/>
-          </w:tcPr>
-          <w:p>
-            <w:pPr>
-              <w:jc w:val="center"/>
-            </w:pPr>
-            <w:r>
-              <w:rPr>
-                <w:sz w:val="20"/>
-              </w:rPr>
-              <w:t>4</w:t>
-            </w:r>
-          </w:p>
-        </w:tc>
-        <w:tc>
-          <w:tcPr>
-            <w:tcW w:type="dxa" w:w="1417"/>
-          </w:tcPr>
-          <w:p>
-            <w:pPr>
-              <w:jc w:val="center"/>
-            </w:pPr>
-            <w:r>
-              <w:rPr>
-                <w:sz w:val="20"/>
-              </w:rPr>
-              <w:t>4948.7</w:t>
-            </w:r>
-          </w:p>
-        </w:tc>
-        <w:tc>
-          <w:tcPr>
-            <w:tcW w:type="dxa" w:w="1417"/>
-          </w:tcPr>
-          <w:p>
-            <w:pPr>
-              <w:jc w:val="center"/>
-            </w:pPr>
-            <w:r>
-              <w:rPr>
-                <w:sz w:val="20"/>
-              </w:rPr>
-              <w:t>4690.0</w:t>
-            </w:r>
-          </w:p>
-        </w:tc>
-        <w:tc>
-          <w:tcPr>
-            <w:tcW w:type="dxa" w:w="1417"/>
-          </w:tcPr>
-          <w:p>
-            <w:pPr>
-              <w:jc w:val="center"/>
-            </w:pPr>
-            <w:r>
-              <w:rPr>
-                <w:sz w:val="20"/>
-              </w:rPr>
-              <w:t>-258.7</w:t>
-            </w:r>
-          </w:p>
-        </w:tc>
-        <w:tc>
-          <w:tcPr>
-            <w:tcW w:type="dxa" w:w="1417"/>
-          </w:tcPr>
-          <w:p>
-            <w:pPr>
-              <w:jc w:val="center"/>
-            </w:pPr>
-            <w:r>
-              <w:rPr>
-                <w:sz w:val="20"/>
-              </w:rPr>
-              <w:t>-5.228</w:t>
-            </w:r>
-          </w:p>
-        </w:tc>
-        <w:tc>
-          <w:tcPr>
-            <w:tcW w:type="dxa" w:w="1417"/>
-          </w:tcPr>
-          <w:p>
-            <w:pPr>
-              <w:jc w:val="center"/>
-            </w:pPr>
-            <w:r>
-              <w:rPr>
-                <w:sz w:val="20"/>
-              </w:rPr>
-              <w:t>pass</w:t>
-            </w:r>
-          </w:p>
-        </w:tc>
-      </w:tr>
-      <w:tr>
-        <w:tc>
-          <w:tcPr>
-            <w:tcW w:type="dxa" w:w="1417"/>
-          </w:tcPr>
-          <w:p>
-            <w:pPr>
-              <w:jc w:val="center"/>
-            </w:pPr>
-            <w:r>
-              <w:rPr>
-                <w:sz w:val="20"/>
-              </w:rPr>
-              <w:t>11</w:t>
-            </w:r>
-          </w:p>
-        </w:tc>
-        <w:tc>
-          <w:tcPr>
-            <w:tcW w:type="dxa" w:w="1417"/>
-          </w:tcPr>
-          <w:p>
-            <w:pPr>
-              <w:jc w:val="center"/>
-            </w:pPr>
-            <w:r>
-              <w:rPr>
-                <w:sz w:val="20"/>
-              </w:rPr>
-              <w:t>5438.5</w:t>
-            </w:r>
-          </w:p>
-        </w:tc>
-        <w:tc>
-          <w:tcPr>
-            <w:tcW w:type="dxa" w:w="1417"/>
-          </w:tcPr>
-          <w:p>
-            <w:pPr>
-              <w:jc w:val="center"/>
-            </w:pPr>
-            <w:r>
-              <w:rPr>
-                <w:sz w:val="20"/>
-              </w:rPr>
-              <w:t>5890.0</w:t>
-            </w:r>
-          </w:p>
-        </w:tc>
-        <w:tc>
-          <w:tcPr>
-            <w:tcW w:type="dxa" w:w="1417"/>
-          </w:tcPr>
-          <w:p>
-            <w:pPr>
-              <w:jc w:val="center"/>
-            </w:pPr>
-            <w:r>
-              <w:rPr>
-                <w:sz w:val="20"/>
-              </w:rPr>
-              <w:t>451.5</w:t>
-            </w:r>
-          </w:p>
-        </w:tc>
-        <w:tc>
-          <w:tcPr>
-            <w:tcW w:type="dxa" w:w="1417"/>
-          </w:tcPr>
-          <w:p>
-            <w:pPr>
-              <w:jc w:val="center"/>
-            </w:pPr>
-            <w:r>
-              <w:rPr>
-                <w:sz w:val="20"/>
-              </w:rPr>
-              <w:t>8.302</w:t>
-            </w:r>
-          </w:p>
-        </w:tc>
-        <w:tc>
-          <w:tcPr>
-            <w:tcW w:type="dxa" w:w="1417"/>
-          </w:tcPr>
-          <w:p>
-            <w:pPr>
-              <w:jc w:val="center"/>
-            </w:pPr>
-            <w:r>
-              <w:rPr>
-                <w:sz w:val="20"/>
-              </w:rPr>
-              <w:t>pass</w:t>
-            </w:r>
-          </w:p>
-        </w:tc>
-      </w:tr>
-      <w:tr>
-        <w:tc>
-          <w:tcPr>
-            <w:tcW w:type="dxa" w:w="1417"/>
-          </w:tcPr>
-          <w:p>
-            <w:pPr>
-              <w:jc w:val="center"/>
-            </w:pPr>
-            <w:r>
-              <w:rPr>
-                <w:sz w:val="20"/>
-              </w:rPr>
-              <w:t>13</w:t>
-            </w:r>
-          </w:p>
-        </w:tc>
-        <w:tc>
-          <w:tcPr>
-            <w:tcW w:type="dxa" w:w="1417"/>
-          </w:tcPr>
-          <w:p>
-            <w:pPr>
-              <w:jc w:val="center"/>
-            </w:pPr>
-            <w:r>
-              <w:rPr>
-                <w:sz w:val="20"/>
-              </w:rPr>
-              <w:t>5553.2</w:t>
-            </w:r>
-          </w:p>
-        </w:tc>
-        <w:tc>
-          <w:tcPr>
-            <w:tcW w:type="dxa" w:w="1417"/>
-          </w:tcPr>
-          <w:p>
-            <w:pPr>
-              <w:jc w:val="center"/>
-            </w:pPr>
-            <w:r>
-              <w:rPr>
-                <w:sz w:val="20"/>
-              </w:rPr>
-              <w:t>6310.0</w:t>
-            </w:r>
-          </w:p>
-        </w:tc>
-        <w:tc>
-          <w:tcPr>
-            <w:tcW w:type="dxa" w:w="1417"/>
-          </w:tcPr>
-          <w:p>
-            <w:pPr>
-              <w:jc w:val="center"/>
-            </w:pPr>
-            <w:r>
-              <w:rPr>
-                <w:sz w:val="20"/>
-              </w:rPr>
-              <w:t>756.8</w:t>
-            </w:r>
-          </w:p>
-        </w:tc>
-        <w:tc>
-          <w:tcPr>
-            <w:tcW w:type="dxa" w:w="1417"/>
-          </w:tcPr>
-          <w:p>
-            <w:pPr>
-              <w:jc w:val="center"/>
-            </w:pPr>
-            <w:r>
-              <w:rPr>
-                <w:sz w:val="20"/>
-              </w:rPr>
-              <w:t>13.628</w:t>
-            </w:r>
-          </w:p>
-        </w:tc>
-        <w:tc>
-          <w:tcPr>
-            <w:tcW w:type="dxa" w:w="1417"/>
-          </w:tcPr>
-          <w:p>
-            <w:pPr>
-              <w:jc w:val="center"/>
-            </w:pPr>
-            <w:r>
-              <w:rPr>
-                <w:sz w:val="20"/>
-              </w:rPr>
-              <w:t>pass</w:t>
-            </w:r>
-          </w:p>
-        </w:tc>
-      </w:tr>
-      <w:tr>
-        <w:tc>
-          <w:tcPr>
-            <w:tcW w:type="dxa" w:w="1417"/>
-          </w:tcPr>
-          <w:p>
-            <w:pPr>
-              <w:jc w:val="center"/>
-            </w:pPr>
-            <w:r>
-              <w:rPr>
-                <w:sz w:val="20"/>
-              </w:rPr>
-              <w:t>31</w:t>
-            </w:r>
-          </w:p>
-        </w:tc>
-        <w:tc>
-          <w:tcPr>
-            <w:tcW w:type="dxa" w:w="1417"/>
-          </w:tcPr>
-          <w:p>
-            <w:pPr>
-              <w:jc w:val="center"/>
-            </w:pPr>
-            <w:r>
-              <w:rPr>
-                <w:sz w:val="20"/>
-              </w:rPr>
-              <w:t>5672.6</w:t>
-            </w:r>
-          </w:p>
-        </w:tc>
-        <w:tc>
-          <w:tcPr>
-            <w:tcW w:type="dxa" w:w="1417"/>
-          </w:tcPr>
-          <w:p>
-            <w:pPr>
-              <w:jc w:val="center"/>
-            </w:pPr>
-            <w:r>
-              <w:rPr>
-                <w:sz w:val="20"/>
-              </w:rPr>
-              <w:t>5710.0</w:t>
-            </w:r>
-          </w:p>
-        </w:tc>
-        <w:tc>
-          <w:tcPr>
-            <w:tcW w:type="dxa" w:w="1417"/>
-          </w:tcPr>
-          <w:p>
-            <w:pPr>
-              <w:jc w:val="center"/>
-            </w:pPr>
-            <w:r>
-              <w:rPr>
-                <w:sz w:val="20"/>
-              </w:rPr>
-              <w:t>37.4</w:t>
-            </w:r>
-          </w:p>
-        </w:tc>
-        <w:tc>
-          <w:tcPr>
-            <w:tcW w:type="dxa" w:w="1417"/>
-          </w:tcPr>
-          <w:p>
-            <w:pPr>
-              <w:jc w:val="center"/>
-            </w:pPr>
-            <w:r>
-              <w:rPr>
-                <w:sz w:val="20"/>
-              </w:rPr>
-              <w:t>0.659</w:t>
-            </w:r>
-          </w:p>
-        </w:tc>
-        <w:tc>
-          <w:tcPr>
-            <w:tcW w:type="dxa" w:w="1417"/>
-          </w:tcPr>
-          <w:p>
-            <w:pPr>
-              <w:jc w:val="center"/>
-            </w:pPr>
-            <w:r>
-              <w:rPr>
-                <w:sz w:val="20"/>
-              </w:rPr>
-              <w:t>pass</w:t>
-            </w:r>
-          </w:p>
-        </w:tc>
-      </w:tr>
-      <w:tr>
-        <w:tc>
-          <w:tcPr>
-            <w:tcW w:type="dxa" w:w="1417"/>
-          </w:tcPr>
-          <w:p>
-            <w:pPr>
-              <w:jc w:val="center"/>
-            </w:pPr>
-            <w:r>
-              <w:rPr>
-                <w:sz w:val="20"/>
-              </w:rPr>
-              <w:t>8</w:t>
-            </w:r>
-          </w:p>
-        </w:tc>
-        <w:tc>
-          <w:tcPr>
-            <w:tcW w:type="dxa" w:w="1417"/>
-          </w:tcPr>
-          <w:p>
-            <w:pPr>
-              <w:jc w:val="center"/>
-            </w:pPr>
-            <w:r>
-              <w:rPr>
-                <w:sz w:val="20"/>
-              </w:rPr>
-              <w:t>5692.5</w:t>
-            </w:r>
-          </w:p>
-        </w:tc>
-        <w:tc>
-          <w:tcPr>
-            <w:tcW w:type="dxa" w:w="1417"/>
-          </w:tcPr>
-          <w:p>
-            <w:pPr>
-              <w:jc w:val="center"/>
-            </w:pPr>
-            <w:r>
-              <w:rPr>
-                <w:sz w:val="20"/>
-              </w:rPr>
-              <w:t>5910.0</w:t>
-            </w:r>
-          </w:p>
-        </w:tc>
-        <w:tc>
-          <w:tcPr>
-            <w:tcW w:type="dxa" w:w="1417"/>
-          </w:tcPr>
-          <w:p>
-            <w:pPr>
-              <w:jc w:val="center"/>
-            </w:pPr>
-            <w:r>
-              <w:rPr>
-                <w:sz w:val="20"/>
-              </w:rPr>
-              <w:t>217.5</w:t>
-            </w:r>
-          </w:p>
-        </w:tc>
-        <w:tc>
-          <w:tcPr>
-            <w:tcW w:type="dxa" w:w="1417"/>
-          </w:tcPr>
-          <w:p>
-            <w:pPr>
-              <w:jc w:val="center"/>
-            </w:pPr>
-            <w:r>
-              <w:rPr>
-                <w:sz w:val="20"/>
-              </w:rPr>
-              <w:t>3.821</w:t>
-            </w:r>
-          </w:p>
-        </w:tc>
-        <w:tc>
-          <w:tcPr>
-            <w:tcW w:type="dxa" w:w="1417"/>
-          </w:tcPr>
-          <w:p>
-            <w:pPr>
-              <w:jc w:val="center"/>
-            </w:pPr>
-            <w:r>
-              <w:rPr>
-                <w:sz w:val="20"/>
-              </w:rPr>
-              <w:t>pass</w:t>
-            </w:r>
-          </w:p>
-        </w:tc>
-      </w:tr>
-      <w:tr>
-        <w:tc>
-          <w:tcPr>
-            <w:tcW w:type="dxa" w:w="1417"/>
-          </w:tcPr>
-          <w:p>
-            <w:pPr>
-              <w:jc w:val="center"/>
-            </w:pPr>
-            <w:r>
-              <w:rPr>
-                <w:sz w:val="20"/>
-              </w:rPr>
-              <w:t>25</w:t>
-            </w:r>
-          </w:p>
-        </w:tc>
-        <w:tc>
-          <w:tcPr>
-            <w:tcW w:type="dxa" w:w="1417"/>
-          </w:tcPr>
-          <w:p>
-            <w:pPr>
-              <w:jc w:val="center"/>
-            </w:pPr>
-            <w:r>
-              <w:rPr>
-                <w:sz w:val="20"/>
-              </w:rPr>
-              <w:t>5766.2</w:t>
-            </w:r>
-          </w:p>
-        </w:tc>
-        <w:tc>
-          <w:tcPr>
-            <w:tcW w:type="dxa" w:w="1417"/>
-          </w:tcPr>
-          <w:p>
-            <w:pPr>
-              <w:jc w:val="center"/>
-            </w:pPr>
-            <w:r>
-              <w:rPr>
-                <w:sz w:val="20"/>
-              </w:rPr>
-              <w:t>5390.0</w:t>
-            </w:r>
-          </w:p>
-        </w:tc>
-        <w:tc>
-          <w:tcPr>
-            <w:tcW w:type="dxa" w:w="1417"/>
-          </w:tcPr>
-          <w:p>
-            <w:pPr>
-              <w:jc w:val="center"/>
-            </w:pPr>
-            <w:r>
-              <w:rPr>
-                <w:sz w:val="20"/>
-              </w:rPr>
-              <w:t>-376.2</w:t>
-            </w:r>
-          </w:p>
-        </w:tc>
-        <w:tc>
-          <w:tcPr>
-            <w:tcW w:type="dxa" w:w="1417"/>
-          </w:tcPr>
-          <w:p>
-            <w:pPr>
-              <w:jc w:val="center"/>
-            </w:pPr>
-            <w:r>
-              <w:rPr>
-                <w:sz w:val="20"/>
-              </w:rPr>
-              <w:t>-6.524</w:t>
-            </w:r>
-          </w:p>
-        </w:tc>
-        <w:tc>
-          <w:tcPr>
-            <w:tcW w:type="dxa" w:w="1417"/>
-          </w:tcPr>
-          <w:p>
-            <w:pPr>
-              <w:jc w:val="center"/>
-            </w:pPr>
-            <w:r>
-              <w:rPr>
-                <w:sz w:val="20"/>
-              </w:rPr>
-              <w:t>pass</w:t>
-            </w:r>
-          </w:p>
-        </w:tc>
-      </w:tr>
-      <w:tr>
-        <w:tc>
-          <w:tcPr>
-            <w:tcW w:type="dxa" w:w="1417"/>
-          </w:tcPr>
-          <w:p>
-            <w:pPr>
-              <w:jc w:val="center"/>
-            </w:pPr>
-            <w:r>
-              <w:rPr>
-                <w:sz w:val="20"/>
-              </w:rPr>
-              <w:t>32</w:t>
-            </w:r>
-          </w:p>
-        </w:tc>
-        <w:tc>
-          <w:tcPr>
-            <w:tcW w:type="dxa" w:w="1417"/>
-          </w:tcPr>
-          <w:p>
-            <w:pPr>
-              <w:jc w:val="center"/>
-            </w:pPr>
-            <w:r>
-              <w:rPr>
-                <w:sz w:val="20"/>
-              </w:rPr>
-              <w:t>5825.9</w:t>
-            </w:r>
-          </w:p>
-        </w:tc>
-        <w:tc>
-          <w:tcPr>
-            <w:tcW w:type="dxa" w:w="1417"/>
-          </w:tcPr>
-          <w:p>
-            <w:pPr>
-              <w:jc w:val="center"/>
-            </w:pPr>
-            <w:r>
-              <w:rPr>
-                <w:sz w:val="20"/>
-              </w:rPr>
-              <w:t>5630.0</w:t>
-            </w:r>
-          </w:p>
-        </w:tc>
-        <w:tc>
-          <w:tcPr>
-            <w:tcW w:type="dxa" w:w="1417"/>
-          </w:tcPr>
-          <w:p>
-            <w:pPr>
-              <w:jc w:val="center"/>
-            </w:pPr>
-            <w:r>
-              <w:rPr>
-                <w:sz w:val="20"/>
-              </w:rPr>
-              <w:t>-195.9</w:t>
-            </w:r>
-          </w:p>
-        </w:tc>
-        <w:tc>
-          <w:tcPr>
-            <w:tcW w:type="dxa" w:w="1417"/>
-          </w:tcPr>
-          <w:p>
-            <w:pPr>
-              <w:jc w:val="center"/>
-            </w:pPr>
-            <w:r>
-              <w:rPr>
-                <w:sz w:val="20"/>
-              </w:rPr>
-              <w:t>-3.363</w:t>
-            </w:r>
-          </w:p>
-        </w:tc>
-        <w:tc>
-          <w:tcPr>
-            <w:tcW w:type="dxa" w:w="1417"/>
-          </w:tcPr>
-          <w:p>
-            <w:pPr>
-              <w:jc w:val="center"/>
-            </w:pPr>
-            <w:r>
-              <w:rPr>
-                <w:sz w:val="20"/>
-              </w:rPr>
-              <w:t>pass</w:t>
-            </w:r>
-          </w:p>
-        </w:tc>
-      </w:tr>
-      <w:tr>
-        <w:tc>
-          <w:tcPr>
-            <w:tcW w:type="dxa" w:w="1417"/>
-          </w:tcPr>
-          <w:p>
-            <w:pPr>
-              <w:jc w:val="center"/>
-            </w:pPr>
-            <w:r>
-              <w:rPr>
-                <w:sz w:val="20"/>
-              </w:rPr>
-              <w:t>17</w:t>
-            </w:r>
-          </w:p>
-        </w:tc>
-        <w:tc>
-          <w:tcPr>
-            <w:tcW w:type="dxa" w:w="1417"/>
-          </w:tcPr>
-          <w:p>
-            <w:pPr>
-              <w:jc w:val="center"/>
-            </w:pPr>
-            <w:r>
-              <w:rPr>
-                <w:sz w:val="20"/>
-              </w:rPr>
-              <w:t>8377.6</w:t>
-            </w:r>
-          </w:p>
-        </w:tc>
-        <w:tc>
-          <w:tcPr>
-            <w:tcW w:type="dxa" w:w="1417"/>
-          </w:tcPr>
-          <w:p>
-            <w:pPr>
-              <w:jc w:val="center"/>
-            </w:pPr>
-            <w:r>
-              <w:rPr>
-                <w:sz w:val="20"/>
-              </w:rPr>
-              <w:t>7380.0</w:t>
-            </w:r>
-          </w:p>
-        </w:tc>
-        <w:tc>
-          <w:tcPr>
-            <w:tcW w:type="dxa" w:w="1417"/>
-          </w:tcPr>
-          <w:p>
-            <w:pPr>
-              <w:jc w:val="center"/>
-            </w:pPr>
-            <w:r>
-              <w:rPr>
-                <w:sz w:val="20"/>
-              </w:rPr>
-              <w:t>-997.6</w:t>
-            </w:r>
-          </w:p>
-        </w:tc>
-        <w:tc>
-          <w:tcPr>
-            <w:tcW w:type="dxa" w:w="1417"/>
-          </w:tcPr>
-          <w:p>
-            <w:pPr>
-              <w:jc w:val="center"/>
-            </w:pPr>
-            <w:r>
-              <w:rPr>
-                <w:sz w:val="20"/>
-              </w:rPr>
-              <w:t>-11.908</w:t>
-            </w:r>
-          </w:p>
-        </w:tc>
-        <w:tc>
-          <w:tcPr>
-            <w:tcW w:type="dxa" w:w="1417"/>
-          </w:tcPr>
-          <w:p>
-            <w:pPr>
-              <w:jc w:val="center"/>
-            </w:pPr>
-            <w:r>
-              <w:rPr>
-                <w:sz w:val="20"/>
-              </w:rPr>
-              <w:t>pass</w:t>
-            </w:r>
-          </w:p>
-        </w:tc>
-      </w:tr>
-      <w:tr>
-        <w:tc>
-          <w:tcPr>
-            <w:tcW w:type="dxa" w:w="1417"/>
-          </w:tcPr>
-          <w:p>
-            <w:pPr>
-              <w:jc w:val="center"/>
-            </w:pPr>
-            <w:r>
-              <w:rPr>
-                <w:sz w:val="20"/>
-              </w:rPr>
-              <w:t>6</w:t>
-            </w:r>
-          </w:p>
-        </w:tc>
-        <w:tc>
-          <w:tcPr>
-            <w:tcW w:type="dxa" w:w="1417"/>
-          </w:tcPr>
-          <w:p>
-            <w:pPr>
-              <w:jc w:val="center"/>
-            </w:pPr>
-            <w:r>
-              <w:rPr>
-                <w:sz w:val="20"/>
-              </w:rPr>
-              <w:t>8807.8</w:t>
-            </w:r>
-          </w:p>
-        </w:tc>
-        <w:tc>
-          <w:tcPr>
-            <w:tcW w:type="dxa" w:w="1417"/>
-          </w:tcPr>
-          <w:p>
-            <w:pPr>
-              <w:jc w:val="center"/>
-            </w:pPr>
-            <w:r>
-              <w:rPr>
-                <w:sz w:val="20"/>
-              </w:rPr>
-              <w:t>7860.0</w:t>
-            </w:r>
-          </w:p>
-        </w:tc>
-        <w:tc>
-          <w:tcPr>
-            <w:tcW w:type="dxa" w:w="1417"/>
-          </w:tcPr>
-          <w:p>
-            <w:pPr>
-              <w:jc w:val="center"/>
-            </w:pPr>
-            <w:r>
-              <w:rPr>
-                <w:sz w:val="20"/>
-              </w:rPr>
-              <w:t>-947.8</w:t>
-            </w:r>
-          </w:p>
-        </w:tc>
-        <w:tc>
-          <w:tcPr>
-            <w:tcW w:type="dxa" w:w="1417"/>
-          </w:tcPr>
-          <w:p>
-            <w:pPr>
-              <w:jc w:val="center"/>
-            </w:pPr>
-            <w:r>
-              <w:rPr>
-                <w:sz w:val="20"/>
-              </w:rPr>
-              <w:t>-10.761</w:t>
-            </w:r>
-          </w:p>
-        </w:tc>
-        <w:tc>
-          <w:tcPr>
-            <w:tcW w:type="dxa" w:w="1417"/>
-          </w:tcPr>
-          <w:p>
-            <w:pPr>
-              <w:jc w:val="center"/>
-            </w:pPr>
-            <w:r>
-              <w:rPr>
-                <w:sz w:val="20"/>
-              </w:rPr>
-              <w:t>pass</w:t>
-            </w:r>
-          </w:p>
-        </w:tc>
-      </w:tr>
-      <w:tr>
-        <w:tc>
-          <w:tcPr>
-            <w:tcW w:type="dxa" w:w="1417"/>
-          </w:tcPr>
-          <w:p>
-            <w:pPr>
-              <w:jc w:val="center"/>
-            </w:pPr>
-            <w:r>
-              <w:rPr>
-                <w:sz w:val="20"/>
-              </w:rPr>
-              <w:t>2</w:t>
-            </w:r>
-          </w:p>
-        </w:tc>
-        <w:tc>
-          <w:tcPr>
-            <w:tcW w:type="dxa" w:w="1417"/>
-          </w:tcPr>
-          <w:p>
-            <w:pPr>
-              <w:jc w:val="center"/>
-            </w:pPr>
-            <w:r>
-              <w:rPr>
-                <w:sz w:val="20"/>
-              </w:rPr>
-              <w:t>9964.0</w:t>
-            </w:r>
-          </w:p>
-        </w:tc>
-        <w:tc>
-          <w:tcPr>
-            <w:tcW w:type="dxa" w:w="1417"/>
-          </w:tcPr>
-          <w:p>
-            <w:pPr>
-              <w:jc w:val="center"/>
-            </w:pPr>
-            <w:r>
-              <w:rPr>
-                <w:sz w:val="20"/>
-              </w:rPr>
-              <w:t>10200.0</w:t>
-            </w:r>
-          </w:p>
-        </w:tc>
-        <w:tc>
-          <w:tcPr>
-            <w:tcW w:type="dxa" w:w="1417"/>
-          </w:tcPr>
-          <w:p>
-            <w:pPr>
-              <w:jc w:val="center"/>
-            </w:pPr>
-            <w:r>
-              <w:rPr>
-                <w:sz w:val="20"/>
-              </w:rPr>
-              <w:t>236.0</w:t>
-            </w:r>
-          </w:p>
-        </w:tc>
-        <w:tc>
-          <w:tcPr>
-            <w:tcW w:type="dxa" w:w="1417"/>
-          </w:tcPr>
-          <w:p>
-            <w:pPr>
-              <w:jc w:val="center"/>
-            </w:pPr>
-            <w:r>
-              <w:rPr>
-                <w:sz w:val="20"/>
-              </w:rPr>
-              <w:t>2.369</w:t>
-            </w:r>
-          </w:p>
-        </w:tc>
-        <w:tc>
-          <w:tcPr>
-            <w:tcW w:type="dxa" w:w="1417"/>
-          </w:tcPr>
-          <w:p>
-            <w:pPr>
-              <w:jc w:val="center"/>
-            </w:pPr>
-            <w:r>
-              <w:rPr>
-                <w:sz w:val="20"/>
-              </w:rPr>
-              <w:t>pass</w:t>
-            </w:r>
-          </w:p>
-        </w:tc>
-      </w:tr>
-      <w:tr>
-        <w:tc>
-          <w:tcPr>
-            <w:tcW w:type="dxa" w:w="1417"/>
-          </w:tcPr>
-          <w:p>
-            <w:pPr>
-              <w:jc w:val="center"/>
-            </w:pPr>
-            <w:r>
-              <w:rPr>
-                <w:sz w:val="20"/>
-              </w:rPr>
-              <w:t>16</w:t>
-            </w:r>
-          </w:p>
-        </w:tc>
-        <w:tc>
-          <w:tcPr>
-            <w:tcW w:type="dxa" w:w="1417"/>
-          </w:tcPr>
-          <w:p>
-            <w:pPr>
-              <w:jc w:val="center"/>
-            </w:pPr>
-            <w:r>
-              <w:rPr>
-                <w:sz w:val="20"/>
-              </w:rPr>
-              <w:t>10846.7</w:t>
-            </w:r>
-          </w:p>
-        </w:tc>
-        <w:tc>
-          <w:tcPr>
-            <w:tcW w:type="dxa" w:w="1417"/>
-          </w:tcPr>
-          <w:p>
-            <w:pPr>
-              <w:jc w:val="center"/>
-            </w:pPr>
-            <w:r>
-              <w:rPr>
-                <w:sz w:val="20"/>
-              </w:rPr>
-              <w:t>10400.0</w:t>
-            </w:r>
-          </w:p>
-        </w:tc>
-        <w:tc>
-          <w:tcPr>
-            <w:tcW w:type="dxa" w:w="1417"/>
-          </w:tcPr>
-          <w:p>
-            <w:pPr>
-              <w:jc w:val="center"/>
-            </w:pPr>
-            <w:r>
-              <w:rPr>
-                <w:sz w:val="20"/>
-              </w:rPr>
-              <w:t>-446.7</w:t>
-            </w:r>
-          </w:p>
-        </w:tc>
-        <w:tc>
-          <w:tcPr>
-            <w:tcW w:type="dxa" w:w="1417"/>
-          </w:tcPr>
-          <w:p>
-            <w:pPr>
-              <w:jc w:val="center"/>
-            </w:pPr>
-            <w:r>
-              <w:rPr>
-                <w:sz w:val="20"/>
-              </w:rPr>
-              <w:t>-4.118</w:t>
-            </w:r>
-          </w:p>
-        </w:tc>
-        <w:tc>
-          <w:tcPr>
-            <w:tcW w:type="dxa" w:w="1417"/>
-          </w:tcPr>
-          <w:p>
-            <w:pPr>
-              <w:jc w:val="center"/>
-            </w:pPr>
-            <w:r>
-              <w:rPr>
-                <w:sz w:val="20"/>
-              </w:rPr>
-              <w:t>pass</w:t>
-            </w:r>
-          </w:p>
-        </w:tc>
-      </w:tr>
-      <w:tr>
-        <w:tc>
-          <w:tcPr>
-            <w:tcW w:type="dxa" w:w="1417"/>
-          </w:tcPr>
-          <w:p>
-            <w:pPr>
-              <w:jc w:val="center"/>
-            </w:pPr>
-            <w:r>
-              <w:rPr>
-                <w:sz w:val="20"/>
-              </w:rPr>
-              <w:t>5</w:t>
-            </w:r>
-          </w:p>
-        </w:tc>
-        <w:tc>
-          <w:tcPr>
-            <w:tcW w:type="dxa" w:w="1417"/>
-          </w:tcPr>
-          <w:p>
-            <w:pPr>
-              <w:jc w:val="center"/>
-            </w:pPr>
-            <w:r>
-              <w:rPr>
-                <w:sz w:val="20"/>
-              </w:rPr>
-              <w:t>11622.3</w:t>
-            </w:r>
-          </w:p>
-        </w:tc>
-        <w:tc>
-          <w:tcPr>
-            <w:tcW w:type="dxa" w:w="1417"/>
-          </w:tcPr>
-          <w:p>
-            <w:pPr>
-              <w:jc w:val="center"/>
-            </w:pPr>
-            <w:r>
-              <w:rPr>
-                <w:sz w:val="20"/>
-              </w:rPr>
-              <w:t>10900.0</w:t>
-            </w:r>
-          </w:p>
-        </w:tc>
-        <w:tc>
-          <w:tcPr>
-            <w:tcW w:type="dxa" w:w="1417"/>
-          </w:tcPr>
-          <w:p>
-            <w:pPr>
-              <w:jc w:val="center"/>
-            </w:pPr>
-            <w:r>
-              <w:rPr>
-                <w:sz w:val="20"/>
-              </w:rPr>
-              <w:t>-722.3</w:t>
-            </w:r>
-          </w:p>
-        </w:tc>
-        <w:tc>
-          <w:tcPr>
-            <w:tcW w:type="dxa" w:w="1417"/>
-          </w:tcPr>
-          <w:p>
-            <w:pPr>
-              <w:jc w:val="center"/>
-            </w:pPr>
-            <w:r>
-              <w:rPr>
-                <w:sz w:val="20"/>
-              </w:rPr>
-              <w:t>-6.215</w:t>
-            </w:r>
-          </w:p>
-        </w:tc>
-        <w:tc>
-          <w:tcPr>
-            <w:tcW w:type="dxa" w:w="1417"/>
-          </w:tcPr>
-          <w:p>
-            <w:pPr>
-              <w:jc w:val="center"/>
-            </w:pPr>
-            <w:r>
-              <w:rPr>
-                <w:sz w:val="20"/>
-              </w:rPr>
-              <w:t>pass</w:t>
-            </w:r>
-          </w:p>
-        </w:tc>
-      </w:tr>
-      <w:tr>
-        <w:tc>
-          <w:tcPr>
-            <w:tcW w:type="dxa" w:w="1417"/>
-          </w:tcPr>
-          <w:p>
-            <w:pPr>
-              <w:jc w:val="center"/>
-            </w:pPr>
-            <w:r>
-              <w:rPr>
-                <w:sz w:val="20"/>
-              </w:rPr>
-              <w:t>28</w:t>
-            </w:r>
-          </w:p>
-        </w:tc>
-        <w:tc>
-          <w:tcPr>
-            <w:tcW w:type="dxa" w:w="1417"/>
-          </w:tcPr>
-          <w:p>
-            <w:pPr>
-              <w:jc w:val="center"/>
-            </w:pPr>
-            <w:r>
-              <w:rPr>
-                <w:sz w:val="20"/>
-              </w:rPr>
-              <w:t>11958.1</w:t>
-            </w:r>
-          </w:p>
-        </w:tc>
-        <w:tc>
-          <w:tcPr>
-            <w:tcW w:type="dxa" w:w="1417"/>
-          </w:tcPr>
-          <w:p>
-            <w:pPr>
-              <w:jc w:val="center"/>
-            </w:pPr>
-            <w:r>
-              <w:rPr>
-                <w:sz w:val="20"/>
-              </w:rPr>
-              <w:t>13800.0</w:t>
-            </w:r>
-          </w:p>
-        </w:tc>
-        <w:tc>
-          <w:tcPr>
-            <w:tcW w:type="dxa" w:w="1417"/>
-          </w:tcPr>
-          <w:p>
-            <w:pPr>
-              <w:jc w:val="center"/>
-            </w:pPr>
-            <w:r>
-              <w:rPr>
-                <w:sz w:val="20"/>
-              </w:rPr>
-              <w:t>1841.9</w:t>
-            </w:r>
-          </w:p>
-        </w:tc>
-        <w:tc>
-          <w:tcPr>
-            <w:tcW w:type="dxa" w:w="1417"/>
-          </w:tcPr>
-          <w:p>
-            <w:pPr>
-              <w:jc w:val="center"/>
-            </w:pPr>
-            <w:r>
-              <w:rPr>
-                <w:sz w:val="20"/>
-              </w:rPr>
-              <w:t>15.403</w:t>
-            </w:r>
-          </w:p>
-        </w:tc>
-        <w:tc>
-          <w:tcPr>
-            <w:tcW w:type="dxa" w:w="1417"/>
-          </w:tcPr>
-          <w:p>
-            <w:pPr>
-              <w:jc w:val="center"/>
-            </w:pPr>
-            <w:r>
-              <w:rPr>
-                <w:sz w:val="20"/>
-              </w:rPr>
-              <w:t>**FAIL**</w:t>
-            </w:r>
-          </w:p>
-        </w:tc>
-      </w:tr>
-      <w:tr>
-        <w:tc>
-          <w:tcPr>
-            <w:tcW w:type="dxa" w:w="1417"/>
-          </w:tcPr>
-          <w:p>
-            <w:pPr>
-              <w:jc w:val="center"/>
-            </w:pPr>
-            <w:r>
-              <w:rPr>
-                <w:sz w:val="20"/>
-              </w:rPr>
-              <w:t>3</w:t>
-            </w:r>
-          </w:p>
-        </w:tc>
-        <w:tc>
-          <w:tcPr>
-            <w:tcW w:type="dxa" w:w="1417"/>
-          </w:tcPr>
-          <w:p>
-            <w:pPr>
-              <w:jc w:val="center"/>
-            </w:pPr>
-            <w:r>
-              <w:rPr>
-                <w:sz w:val="20"/>
-              </w:rPr>
-              <w:t>13204.8</w:t>
-            </w:r>
-          </w:p>
-        </w:tc>
-        <w:tc>
-          <w:tcPr>
-            <w:tcW w:type="dxa" w:w="1417"/>
-          </w:tcPr>
-          <w:p>
-            <w:pPr>
-              <w:jc w:val="center"/>
-            </w:pPr>
-            <w:r>
-              <w:rPr>
-                <w:sz w:val="20"/>
-              </w:rPr>
-              <w:t>12700.0</w:t>
-            </w:r>
-          </w:p>
-        </w:tc>
-        <w:tc>
-          <w:tcPr>
-            <w:tcW w:type="dxa" w:w="1417"/>
-          </w:tcPr>
-          <w:p>
-            <w:pPr>
-              <w:jc w:val="center"/>
-            </w:pPr>
-            <w:r>
-              <w:rPr>
-                <w:sz w:val="20"/>
-              </w:rPr>
-              <w:t>-504.8</w:t>
-            </w:r>
-          </w:p>
-        </w:tc>
-        <w:tc>
-          <w:tcPr>
-            <w:tcW w:type="dxa" w:w="1417"/>
-          </w:tcPr>
-          <w:p>
-            <w:pPr>
-              <w:jc w:val="center"/>
-            </w:pPr>
-            <w:r>
-              <w:rPr>
-                <w:sz w:val="20"/>
-              </w:rPr>
-              <w:t>-3.823</w:t>
-            </w:r>
-          </w:p>
-        </w:tc>
-        <w:tc>
-          <w:tcPr>
-            <w:tcW w:type="dxa" w:w="1417"/>
-          </w:tcPr>
-          <w:p>
-            <w:pPr>
-              <w:jc w:val="center"/>
-            </w:pPr>
-            <w:r>
-              <w:rPr>
-                <w:sz w:val="20"/>
-              </w:rPr>
-              <w:t>pass</w:t>
-            </w:r>
-          </w:p>
-        </w:tc>
-      </w:tr>
-    </w:tbl>
-    <w:p>
-      <w:r>
-        <w:br w:type="page"/>
-      </w:r>
-    </w:p>
-    <w:p>
-      <w:r>
-        <w:rPr>
-          <w:b/>
-        </w:rPr>
-        <w:t>Difference Plots</w:t>
-      </w:r>
-    </w:p>
-    <w:tbl>
-      <w:tblPr>
-        <w:tblW w:type="auto" w:w="0"/>
-        <w:tblLook w:firstColumn="1" w:firstRow="1" w:lastColumn="0" w:lastRow="0" w:noHBand="0" w:noVBand="1" w:val="04A0"/>
-      </w:tblPr>
-      <w:tblGrid>
-        <w:gridCol w:w="11674"/>
-      </w:tblGrid>
-      <w:tr>
-        <w:tc>
-          <w:tcPr>
-            <w:tcW w:type="dxa" w:w="11674"/>
-          </w:tcPr>
-          <w:p>
-            <w:pPr>
-              <w:jc w:val="center"/>
-            </w:pPr>
-            <w:r>
-              <w:drawing>
-                <wp:inline xmlns:a="http://schemas.openxmlformats.org/drawingml/2006/main" xmlns:pic="http://schemas.openxmlformats.org/drawingml/2006/picture">
-                  <wp:extent cx="5486400" cy="3943078"/>
-                  <wp:docPr id="3" name="Picture 3"/>
-                  <wp:cNvGraphicFramePr>
-                    <a:graphicFrameLocks noChangeAspect="1"/>
-                  </wp:cNvGraphicFramePr>
-                  <a:graphic>
-                    <a:graphicData uri="http://schemas.openxmlformats.org/drawingml/2006/picture">
-                      <pic:pic>
-                        <pic:nvPicPr>
-                          <pic:cNvPr id="0" name="cropped_plot_Difference_Plot_median.png"/>
-                          <pic:cNvPicPr/>
-                        </pic:nvPicPr>
-                        <pic:blipFill>
-                          <a:blip r:embed="rId11"/>
-                          <a:stretch>
-                            <a:fillRect/>
-                          </a:stretch>
-                        </pic:blipFill>
-                        <pic:spPr>
-                          <a:xfrm>
-                            <a:off x="0" y="0"/>
-                            <a:ext cx="5486400" cy="3943078"/>
-                          </a:xfrm>
-                          <a:prstGeom prst="rect"/>
-                        </pic:spPr>
-                      </pic:pic>
-                    </a:graphicData>
-                  </a:graphic>
-                </wp:inline>
-              </w:drawing>
-            </w:r>
-          </w:p>
-          <w:p/>
-        </w:tc>
-      </w:tr>
-      <w:tr>
-        <w:tc>
-          <w:tcPr>
-            <w:tcW w:type="dxa" w:w="11674"/>
-          </w:tcPr>
-          <w:p>
-            <w:pPr>
-              <w:jc w:val="center"/>
-            </w:pPr>
-            <w:r>
-              <w:drawing>
-                <wp:inline xmlns:a="http://schemas.openxmlformats.org/drawingml/2006/main" xmlns:pic="http://schemas.openxmlformats.org/drawingml/2006/picture">
-                  <wp:extent cx="5486400" cy="4039095"/>
-                  <wp:docPr id="4" name="Picture 4"/>
-                  <wp:cNvGraphicFramePr>
-                    <a:graphicFrameLocks noChangeAspect="1"/>
-                  </wp:cNvGraphicFramePr>
-                  <a:graphic>
-                    <a:graphicData uri="http://schemas.openxmlformats.org/drawingml/2006/picture">
-                      <pic:pic>
-                        <pic:nvPicPr>
-                          <pic:cNvPr id="0" name="cropped_plot_Difference_Plot_median_per.png"/>
-                          <pic:cNvPicPr/>
-                        </pic:nvPicPr>
-                        <pic:blipFill>
-                          <a:blip r:embed="rId12"/>
-                          <a:stretch>
-                            <a:fillRect/>
-                          </a:stretch>
-                        </pic:blipFill>
-                        <pic:spPr>
-                          <a:xfrm>
-                            <a:off x="0" y="0"/>
-                            <a:ext cx="5486400" cy="4039095"/>
-                          </a:xfrm>
-                          <a:prstGeom prst="rect"/>
-                        </pic:spPr>
-                      </pic:pic>
-                    </a:graphicData>
-                  </a:graphic>
-                </wp:inline>
-              </w:drawing>
+              <w:t>100.0</w:t>
             </w:r>
           </w:p>
         </w:tc>
@@ -5148,7 +799,7 @@
     </w:tbl>
     <w:sectPr>
       <w:pgSz w:w="12240" w:h="15840"/>
-      <w:pgMar w:top="283" w:right="283" w:bottom="283" w:left="283" w:header="720" w:footer="720" w:gutter="0"/>
+      <w:pgMar w:top="850" w:right="850" w:bottom="850" w:left="850" w:header="720" w:footer="720" w:gutter="0"/>
       <w:cols w:space="720"/>
       <w:docGrid w:linePitch="360"/>
     </w:sectPr>

</xml_diff>

<commit_message>
Focus on cleaning up the code and removing unnecessary imports and comments. The main changes include: - Removed unused imports from MethodCompare.py and PyME_functions.py.
Images are no longer saved to the local directory, but are instead saved in memory and inserted into the Word document directly. This change improves performance and avoids cluttering the file system with temporary image files.
</commit_message>
<xml_diff>
--- a/MethodComparison.docx
+++ b/MethodComparison.docx
@@ -20,19 +20,19 @@
         <w:t xml:space="preserve">&lt; </w:t>
       </w:r>
       <w:r>
-        <w:t>2.0</w:t>
+        <w:t>3</w:t>
       </w:r>
       <w:r>
         <w:t xml:space="preserve">: ± </w:t>
       </w:r>
       <w:r>
-        <w:t>0.2</w:t>
+        <w:t>20</w:t>
       </w:r>
       <w:r>
         <w:t xml:space="preserve"> </w:t>
       </w:r>
       <w:r>
-        <w:t>nmol/L</w:t>
+        <w:t>u/n</w:t>
       </w:r>
     </w:p>
     <w:p>
@@ -40,13 +40,13 @@
         <w:t xml:space="preserve">≥ </w:t>
       </w:r>
       <w:r>
-        <w:t>2.0</w:t>
+        <w:t>3</w:t>
       </w:r>
       <w:r>
         <w:t>: ±</w:t>
       </w:r>
       <w:r>
-        <w:t>10</w:t>
+        <w:t>15</w:t>
       </w:r>
       <w:r>
         <w:t>%</w:t>
@@ -60,7 +60,7 @@
         <w:rPr>
           <w:b/>
         </w:rPr>
-        <w:t>Current Method</w:t>
+        <w:t>Digoxin (old) - Current method</w:t>
       </w:r>
     </w:p>
     <w:p>
@@ -71,7 +71,7 @@
         <w:rPr>
           <w:b/>
         </w:rPr>
-        <w:t>New Method</w:t>
+        <w:t>Digoxin (new) - Test method</w:t>
       </w:r>
     </w:p>
     <w:p>
@@ -95,7 +95,7 @@
               <a:graphicData uri="http://schemas.openxmlformats.org/drawingml/2006/picture">
                 <pic:pic>
                   <pic:nvPicPr>
-                    <pic:cNvPr id="0" name="cropped_plot_boxplot.png"/>
+                    <pic:cNvPr id="0" name="image.png"/>
                     <pic:cNvPicPr/>
                   </pic:nvPicPr>
                   <pic:blipFill>
@@ -950,365 +950,6 @@
       </w:tr>
     </w:tbl>
     <w:p>
-      <w:r>
-        <w:t>The difference in measurements between the Test Method and Reference Method sufficiently resembles a Gaussian distribution, based on Shapiro-Wilk Test. Consider the Student T-test.</w:t>
-      </w:r>
-    </w:p>
-    <w:p>
-      <w:pPr>
-        <w:pStyle w:val="Heading4"/>
-      </w:pPr>
-      <w:r>
-        <w:t xml:space="preserve">Summary of Paired Student t-Test: </w:t>
-      </w:r>
-    </w:p>
-    <w:p>
-      <w:r>
-        <w:t>Null Hypothesis, H0 = The means of the methods are equivalent</w:t>
-      </w:r>
-    </w:p>
-    <w:p>
-      <w:r>
-        <w:t>Alternate Hypothesis, H1 = The means of the methods are not equivalent</w:t>
-      </w:r>
-    </w:p>
-    <w:tbl>
-      <w:tblPr>
-        <w:tblStyle w:val="LightShading-Accent1"/>
-        <w:tblW w:type="auto" w:w="0"/>
-        <w:jc w:val="center"/>
-        <w:tblLayout w:type="autofit"/>
-        <w:tblLook w:firstColumn="1" w:firstRow="1" w:lastColumn="0" w:lastRow="0" w:noHBand="0" w:noVBand="1" w:val="04A0"/>
-      </w:tblPr>
-      <w:tblGrid>
-        <w:gridCol w:w="1459"/>
-        <w:gridCol w:w="1459"/>
-        <w:gridCol w:w="1459"/>
-        <w:gridCol w:w="1459"/>
-        <w:gridCol w:w="1459"/>
-        <w:gridCol w:w="1459"/>
-        <w:gridCol w:w="1459"/>
-        <w:gridCol w:w="1459"/>
-      </w:tblGrid>
-      <w:tr>
-        <w:tc>
-          <w:tcPr>
-            <w:tcW w:type="dxa" w:w="1417"/>
-          </w:tcPr>
-          <w:p>
-            <w:pPr>
-              <w:jc w:val="center"/>
-            </w:pPr>
-            <w:r>
-              <w:rPr>
-                <w:sz w:val="20"/>
-              </w:rPr>
-              <w:t>T</w:t>
-            </w:r>
-          </w:p>
-        </w:tc>
-        <w:tc>
-          <w:tcPr>
-            <w:tcW w:type="dxa" w:w="1417"/>
-          </w:tcPr>
-          <w:p>
-            <w:pPr>
-              <w:jc w:val="center"/>
-            </w:pPr>
-            <w:r>
-              <w:rPr>
-                <w:sz w:val="20"/>
-              </w:rPr>
-              <w:t>dof</w:t>
-            </w:r>
-          </w:p>
-        </w:tc>
-        <w:tc>
-          <w:tcPr>
-            <w:tcW w:type="dxa" w:w="1417"/>
-          </w:tcPr>
-          <w:p>
-            <w:pPr>
-              <w:jc w:val="center"/>
-            </w:pPr>
-            <w:r>
-              <w:rPr>
-                <w:sz w:val="20"/>
-              </w:rPr>
-              <w:t>alternative</w:t>
-            </w:r>
-          </w:p>
-        </w:tc>
-        <w:tc>
-          <w:tcPr>
-            <w:tcW w:type="dxa" w:w="1417"/>
-          </w:tcPr>
-          <w:p>
-            <w:pPr>
-              <w:jc w:val="center"/>
-            </w:pPr>
-            <w:r>
-              <w:rPr>
-                <w:sz w:val="20"/>
-              </w:rPr>
-              <w:t>p_val</w:t>
-            </w:r>
-          </w:p>
-        </w:tc>
-        <w:tc>
-          <w:tcPr>
-            <w:tcW w:type="dxa" w:w="1417"/>
-          </w:tcPr>
-          <w:p>
-            <w:pPr>
-              <w:jc w:val="center"/>
-            </w:pPr>
-            <w:r>
-              <w:rPr>
-                <w:sz w:val="20"/>
-              </w:rPr>
-              <w:t>CI95</w:t>
-            </w:r>
-          </w:p>
-        </w:tc>
-        <w:tc>
-          <w:tcPr>
-            <w:tcW w:type="dxa" w:w="1417"/>
-          </w:tcPr>
-          <w:p>
-            <w:pPr>
-              <w:jc w:val="center"/>
-            </w:pPr>
-            <w:r>
-              <w:rPr>
-                <w:sz w:val="20"/>
-              </w:rPr>
-              <w:t>cohen_d</w:t>
-            </w:r>
-          </w:p>
-        </w:tc>
-        <w:tc>
-          <w:tcPr>
-            <w:tcW w:type="dxa" w:w="1417"/>
-          </w:tcPr>
-          <w:p>
-            <w:pPr>
-              <w:jc w:val="center"/>
-            </w:pPr>
-            <w:r>
-              <w:rPr>
-                <w:sz w:val="20"/>
-              </w:rPr>
-              <w:t>power</w:t>
-            </w:r>
-          </w:p>
-        </w:tc>
-        <w:tc>
-          <w:tcPr>
-            <w:tcW w:type="dxa" w:w="1417"/>
-          </w:tcPr>
-          <w:p>
-            <w:pPr>
-              <w:jc w:val="center"/>
-            </w:pPr>
-            <w:r>
-              <w:rPr>
-                <w:sz w:val="20"/>
-              </w:rPr>
-              <w:t>BF10</w:t>
-            </w:r>
-          </w:p>
-        </w:tc>
-      </w:tr>
-      <w:tr>
-        <w:tc>
-          <w:tcPr>
-            <w:tcW w:type="dxa" w:w="1417"/>
-          </w:tcPr>
-          <w:p>
-            <w:pPr>
-              <w:jc w:val="center"/>
-            </w:pPr>
-            <w:r>
-              <w:rPr>
-                <w:sz w:val="20"/>
-              </w:rPr>
-              <w:t>3.704</w:t>
-            </w:r>
-          </w:p>
-        </w:tc>
-        <w:tc>
-          <w:tcPr>
-            <w:tcW w:type="dxa" w:w="1417"/>
-          </w:tcPr>
-          <w:p>
-            <w:pPr>
-              <w:jc w:val="center"/>
-            </w:pPr>
-            <w:r>
-              <w:rPr>
-                <w:sz w:val="20"/>
-              </w:rPr>
-              <w:t>24</w:t>
-            </w:r>
-          </w:p>
-        </w:tc>
-        <w:tc>
-          <w:tcPr>
-            <w:tcW w:type="dxa" w:w="1417"/>
-          </w:tcPr>
-          <w:p>
-            <w:pPr>
-              <w:jc w:val="center"/>
-            </w:pPr>
-            <w:r>
-              <w:rPr>
-                <w:sz w:val="20"/>
-              </w:rPr>
-              <w:t>two-sided</w:t>
-            </w:r>
-          </w:p>
-        </w:tc>
-        <w:tc>
-          <w:tcPr>
-            <w:tcW w:type="dxa" w:w="1417"/>
-          </w:tcPr>
-          <w:p>
-            <w:pPr>
-              <w:jc w:val="center"/>
-            </w:pPr>
-            <w:r>
-              <w:rPr>
-                <w:sz w:val="20"/>
-              </w:rPr>
-              <w:t>0.0011</w:t>
-            </w:r>
-          </w:p>
-        </w:tc>
-        <w:tc>
-          <w:tcPr>
-            <w:tcW w:type="dxa" w:w="1417"/>
-          </w:tcPr>
-          <w:p>
-            <w:pPr>
-              <w:jc w:val="center"/>
-            </w:pPr>
-            <w:r>
-              <w:rPr>
-                <w:sz w:val="20"/>
-              </w:rPr>
-              <w:t>[0.01 0.05]</w:t>
-            </w:r>
-          </w:p>
-        </w:tc>
-        <w:tc>
-          <w:tcPr>
-            <w:tcW w:type="dxa" w:w="1417"/>
-          </w:tcPr>
-          <w:p>
-            <w:pPr>
-              <w:jc w:val="center"/>
-            </w:pPr>
-            <w:r>
-              <w:rPr>
-                <w:sz w:val="20"/>
-              </w:rPr>
-              <w:t>0.0647</w:t>
-            </w:r>
-          </w:p>
-        </w:tc>
-        <w:tc>
-          <w:tcPr>
-            <w:tcW w:type="dxa" w:w="1417"/>
-          </w:tcPr>
-          <w:p>
-            <w:pPr>
-              <w:jc w:val="center"/>
-            </w:pPr>
-            <w:r>
-              <w:rPr>
-                <w:sz w:val="20"/>
-              </w:rPr>
-              <w:t>0.0611</w:t>
-            </w:r>
-          </w:p>
-        </w:tc>
-        <w:tc>
-          <w:tcPr>
-            <w:tcW w:type="dxa" w:w="1417"/>
-          </w:tcPr>
-          <w:p>
-            <w:pPr>
-              <w:jc w:val="center"/>
-            </w:pPr>
-            <w:r>
-              <w:rPr>
-                <w:sz w:val="20"/>
-              </w:rPr>
-              <w:t>31.704</w:t>
-            </w:r>
-          </w:p>
-        </w:tc>
-      </w:tr>
-    </w:tbl>
-    <w:p/>
-    <w:p>
-      <w:r>
-        <w:t xml:space="preserve">T = t-value;  </w:t>
-      </w:r>
-      <w:r>
-        <w:t xml:space="preserve">dof =  degrees of freedom:  </w:t>
-      </w:r>
-      <w:r>
-        <w:t xml:space="preserve">p-val = p-value:  </w:t>
-      </w:r>
-      <w:r>
-        <w:t xml:space="preserve">alternative = alternative of the test;  </w:t>
-      </w:r>
-      <w:r>
-        <w:t xml:space="preserve">CI95% = confidence intervals of the difference in means;  </w:t>
-      </w:r>
-      <w:r>
-        <w:t xml:space="preserve">cohen-d = Cohen d effect size;  </w:t>
-      </w:r>
-      <w:r>
-        <w:t xml:space="preserve">BF10 = Bayes Factor of the alternative hypothesis;  </w:t>
-      </w:r>
-      <w:r>
-        <w:t xml:space="preserve">power = achieved power of the test ( = 1 - type II error);  </w:t>
-      </w:r>
-    </w:p>
-    <w:p>
-      <w:r>
-        <w:rPr>
-          <w:b/>
-        </w:rPr>
-        <w:t xml:space="preserve">Reject </w:t>
-      </w:r>
-      <w:r>
-        <w:t>the Null Hypothesis, that there are no significant differences between the means of the methods (p&lt;0.05).</w:t>
-      </w:r>
-    </w:p>
-    <w:p>
-      <w:r>
-        <w:t>ACCEPT the Alternative Hypothesis, that there are significant differences between the means of the methods.</w:t>
-      </w:r>
-    </w:p>
-    <w:p>
-      <w:r>
-        <w:rPr>
-          <w:b/>
-        </w:rPr>
-        <w:t xml:space="preserve">Note: </w:t>
-      </w:r>
-      <w:r>
-        <w:t xml:space="preserve">The t-test result is valid only when there is sufficient amount of normality across the distribution of the measurements. </w:t>
-      </w:r>
-      <w:r>
-        <w:t>Consider the Q-Q plots, histogram distribution and other statistical procedures before accepting the conclusions above.</w:t>
-      </w:r>
-    </w:p>
-    <w:p>
       <w:pPr>
         <w:pStyle w:val="Heading3"/>
       </w:pPr>
@@ -1325,7 +966,7 @@
       <w:r>
         <w:drawing>
           <wp:inline xmlns:a="http://schemas.openxmlformats.org/drawingml/2006/main" xmlns:pic="http://schemas.openxmlformats.org/drawingml/2006/picture">
-            <wp:extent cx="5943600" cy="6127484"/>
+            <wp:extent cx="5943600" cy="2538835"/>
             <wp:docPr id="2" name="Picture 2"/>
             <wp:cNvGraphicFramePr>
               <a:graphicFrameLocks noChangeAspect="1"/>
@@ -1334,7 +975,7 @@
               <a:graphicData uri="http://schemas.openxmlformats.org/drawingml/2006/picture">
                 <pic:pic>
                   <pic:nvPicPr>
-                    <pic:cNvPr id="0" name="cropped_plot_Deming_regression.png"/>
+                    <pic:cNvPr id="0" name="image.png"/>
                     <pic:cNvPicPr/>
                   </pic:nvPicPr>
                   <pic:blipFill>
@@ -1346,7 +987,7 @@
                   <pic:spPr>
                     <a:xfrm>
                       <a:off x="0" y="0"/>
-                      <a:ext cx="5943600" cy="6127484"/>
+                      <a:ext cx="5943600" cy="2538835"/>
                     </a:xfrm>
                     <a:prstGeom prst="rect"/>
                   </pic:spPr>
@@ -3929,6 +3570,1476 @@
           </w:p>
         </w:tc>
       </w:tr>
+      <w:tr>
+        <w:tc>
+          <w:tcPr>
+            <w:tcW w:type="dxa" w:w="1417"/>
+          </w:tcPr>
+          <w:p>
+            <w:pPr>
+              <w:jc w:val="center"/>
+            </w:pPr>
+            <w:r>
+              <w:rPr>
+                <w:sz w:val="20"/>
+              </w:rPr>
+              <w:t>26</w:t>
+            </w:r>
+          </w:p>
+        </w:tc>
+        <w:tc>
+          <w:tcPr>
+            <w:tcW w:type="dxa" w:w="1417"/>
+          </w:tcPr>
+          <w:p>
+            <w:pPr>
+              <w:jc w:val="center"/>
+            </w:pPr>
+            <w:r>
+              <w:rPr>
+                <w:sz w:val="20"/>
+              </w:rPr>
+              <w:t>nan</w:t>
+            </w:r>
+          </w:p>
+        </w:tc>
+        <w:tc>
+          <w:tcPr>
+            <w:tcW w:type="dxa" w:w="1417"/>
+          </w:tcPr>
+          <w:p>
+            <w:pPr>
+              <w:jc w:val="center"/>
+            </w:pPr>
+            <w:r>
+              <w:rPr>
+                <w:sz w:val="20"/>
+              </w:rPr>
+              <w:t>nan</w:t>
+            </w:r>
+          </w:p>
+        </w:tc>
+        <w:tc>
+          <w:tcPr>
+            <w:tcW w:type="dxa" w:w="1417"/>
+          </w:tcPr>
+          <w:p>
+            <w:pPr>
+              <w:jc w:val="center"/>
+            </w:pPr>
+            <w:r>
+              <w:rPr>
+                <w:sz w:val="20"/>
+              </w:rPr>
+              <w:t>nan</w:t>
+            </w:r>
+          </w:p>
+        </w:tc>
+        <w:tc>
+          <w:tcPr>
+            <w:tcW w:type="dxa" w:w="1417"/>
+          </w:tcPr>
+          <w:p>
+            <w:pPr>
+              <w:jc w:val="center"/>
+            </w:pPr>
+            <w:r>
+              <w:rPr>
+                <w:sz w:val="20"/>
+              </w:rPr>
+              <w:t>nan</w:t>
+            </w:r>
+          </w:p>
+        </w:tc>
+        <w:tc>
+          <w:tcPr>
+            <w:tcW w:type="dxa" w:w="1417"/>
+          </w:tcPr>
+          <w:p>
+            <w:pPr>
+              <w:jc w:val="center"/>
+            </w:pPr>
+            <w:r>
+              <w:rPr>
+                <w:sz w:val="20"/>
+              </w:rPr>
+              <w:t>Not assessed</w:t>
+            </w:r>
+          </w:p>
+        </w:tc>
+      </w:tr>
+      <w:tr>
+        <w:tc>
+          <w:tcPr>
+            <w:tcW w:type="dxa" w:w="1417"/>
+          </w:tcPr>
+          <w:p>
+            <w:pPr>
+              <w:jc w:val="center"/>
+            </w:pPr>
+            <w:r>
+              <w:rPr>
+                <w:sz w:val="20"/>
+              </w:rPr>
+              <w:t>27</w:t>
+            </w:r>
+          </w:p>
+        </w:tc>
+        <w:tc>
+          <w:tcPr>
+            <w:tcW w:type="dxa" w:w="1417"/>
+          </w:tcPr>
+          <w:p>
+            <w:pPr>
+              <w:jc w:val="center"/>
+            </w:pPr>
+            <w:r>
+              <w:rPr>
+                <w:sz w:val="20"/>
+              </w:rPr>
+              <w:t>nan</w:t>
+            </w:r>
+          </w:p>
+        </w:tc>
+        <w:tc>
+          <w:tcPr>
+            <w:tcW w:type="dxa" w:w="1417"/>
+          </w:tcPr>
+          <w:p>
+            <w:pPr>
+              <w:jc w:val="center"/>
+            </w:pPr>
+            <w:r>
+              <w:rPr>
+                <w:sz w:val="20"/>
+              </w:rPr>
+              <w:t>nan</w:t>
+            </w:r>
+          </w:p>
+        </w:tc>
+        <w:tc>
+          <w:tcPr>
+            <w:tcW w:type="dxa" w:w="1417"/>
+          </w:tcPr>
+          <w:p>
+            <w:pPr>
+              <w:jc w:val="center"/>
+            </w:pPr>
+            <w:r>
+              <w:rPr>
+                <w:sz w:val="20"/>
+              </w:rPr>
+              <w:t>nan</w:t>
+            </w:r>
+          </w:p>
+        </w:tc>
+        <w:tc>
+          <w:tcPr>
+            <w:tcW w:type="dxa" w:w="1417"/>
+          </w:tcPr>
+          <w:p>
+            <w:pPr>
+              <w:jc w:val="center"/>
+            </w:pPr>
+            <w:r>
+              <w:rPr>
+                <w:sz w:val="20"/>
+              </w:rPr>
+              <w:t>nan</w:t>
+            </w:r>
+          </w:p>
+        </w:tc>
+        <w:tc>
+          <w:tcPr>
+            <w:tcW w:type="dxa" w:w="1417"/>
+          </w:tcPr>
+          <w:p>
+            <w:pPr>
+              <w:jc w:val="center"/>
+            </w:pPr>
+            <w:r>
+              <w:rPr>
+                <w:sz w:val="20"/>
+              </w:rPr>
+              <w:t>Not assessed</w:t>
+            </w:r>
+          </w:p>
+        </w:tc>
+      </w:tr>
+      <w:tr>
+        <w:tc>
+          <w:tcPr>
+            <w:tcW w:type="dxa" w:w="1417"/>
+          </w:tcPr>
+          <w:p>
+            <w:pPr>
+              <w:jc w:val="center"/>
+            </w:pPr>
+            <w:r>
+              <w:rPr>
+                <w:sz w:val="20"/>
+              </w:rPr>
+              <w:t>28</w:t>
+            </w:r>
+          </w:p>
+        </w:tc>
+        <w:tc>
+          <w:tcPr>
+            <w:tcW w:type="dxa" w:w="1417"/>
+          </w:tcPr>
+          <w:p>
+            <w:pPr>
+              <w:jc w:val="center"/>
+            </w:pPr>
+            <w:r>
+              <w:rPr>
+                <w:sz w:val="20"/>
+              </w:rPr>
+              <w:t>nan</w:t>
+            </w:r>
+          </w:p>
+        </w:tc>
+        <w:tc>
+          <w:tcPr>
+            <w:tcW w:type="dxa" w:w="1417"/>
+          </w:tcPr>
+          <w:p>
+            <w:pPr>
+              <w:jc w:val="center"/>
+            </w:pPr>
+            <w:r>
+              <w:rPr>
+                <w:sz w:val="20"/>
+              </w:rPr>
+              <w:t>nan</w:t>
+            </w:r>
+          </w:p>
+        </w:tc>
+        <w:tc>
+          <w:tcPr>
+            <w:tcW w:type="dxa" w:w="1417"/>
+          </w:tcPr>
+          <w:p>
+            <w:pPr>
+              <w:jc w:val="center"/>
+            </w:pPr>
+            <w:r>
+              <w:rPr>
+                <w:sz w:val="20"/>
+              </w:rPr>
+              <w:t>nan</w:t>
+            </w:r>
+          </w:p>
+        </w:tc>
+        <w:tc>
+          <w:tcPr>
+            <w:tcW w:type="dxa" w:w="1417"/>
+          </w:tcPr>
+          <w:p>
+            <w:pPr>
+              <w:jc w:val="center"/>
+            </w:pPr>
+            <w:r>
+              <w:rPr>
+                <w:sz w:val="20"/>
+              </w:rPr>
+              <w:t>nan</w:t>
+            </w:r>
+          </w:p>
+        </w:tc>
+        <w:tc>
+          <w:tcPr>
+            <w:tcW w:type="dxa" w:w="1417"/>
+          </w:tcPr>
+          <w:p>
+            <w:pPr>
+              <w:jc w:val="center"/>
+            </w:pPr>
+            <w:r>
+              <w:rPr>
+                <w:sz w:val="20"/>
+              </w:rPr>
+              <w:t>Not assessed</w:t>
+            </w:r>
+          </w:p>
+        </w:tc>
+      </w:tr>
+      <w:tr>
+        <w:tc>
+          <w:tcPr>
+            <w:tcW w:type="dxa" w:w="1417"/>
+          </w:tcPr>
+          <w:p>
+            <w:pPr>
+              <w:jc w:val="center"/>
+            </w:pPr>
+            <w:r>
+              <w:rPr>
+                <w:sz w:val="20"/>
+              </w:rPr>
+              <w:t>29</w:t>
+            </w:r>
+          </w:p>
+        </w:tc>
+        <w:tc>
+          <w:tcPr>
+            <w:tcW w:type="dxa" w:w="1417"/>
+          </w:tcPr>
+          <w:p>
+            <w:pPr>
+              <w:jc w:val="center"/>
+            </w:pPr>
+            <w:r>
+              <w:rPr>
+                <w:sz w:val="20"/>
+              </w:rPr>
+              <w:t>nan</w:t>
+            </w:r>
+          </w:p>
+        </w:tc>
+        <w:tc>
+          <w:tcPr>
+            <w:tcW w:type="dxa" w:w="1417"/>
+          </w:tcPr>
+          <w:p>
+            <w:pPr>
+              <w:jc w:val="center"/>
+            </w:pPr>
+            <w:r>
+              <w:rPr>
+                <w:sz w:val="20"/>
+              </w:rPr>
+              <w:t>nan</w:t>
+            </w:r>
+          </w:p>
+        </w:tc>
+        <w:tc>
+          <w:tcPr>
+            <w:tcW w:type="dxa" w:w="1417"/>
+          </w:tcPr>
+          <w:p>
+            <w:pPr>
+              <w:jc w:val="center"/>
+            </w:pPr>
+            <w:r>
+              <w:rPr>
+                <w:sz w:val="20"/>
+              </w:rPr>
+              <w:t>nan</w:t>
+            </w:r>
+          </w:p>
+        </w:tc>
+        <w:tc>
+          <w:tcPr>
+            <w:tcW w:type="dxa" w:w="1417"/>
+          </w:tcPr>
+          <w:p>
+            <w:pPr>
+              <w:jc w:val="center"/>
+            </w:pPr>
+            <w:r>
+              <w:rPr>
+                <w:sz w:val="20"/>
+              </w:rPr>
+              <w:t>nan</w:t>
+            </w:r>
+          </w:p>
+        </w:tc>
+        <w:tc>
+          <w:tcPr>
+            <w:tcW w:type="dxa" w:w="1417"/>
+          </w:tcPr>
+          <w:p>
+            <w:pPr>
+              <w:jc w:val="center"/>
+            </w:pPr>
+            <w:r>
+              <w:rPr>
+                <w:sz w:val="20"/>
+              </w:rPr>
+              <w:t>Not assessed</w:t>
+            </w:r>
+          </w:p>
+        </w:tc>
+      </w:tr>
+      <w:tr>
+        <w:tc>
+          <w:tcPr>
+            <w:tcW w:type="dxa" w:w="1417"/>
+          </w:tcPr>
+          <w:p>
+            <w:pPr>
+              <w:jc w:val="center"/>
+            </w:pPr>
+            <w:r>
+              <w:rPr>
+                <w:sz w:val="20"/>
+              </w:rPr>
+              <w:t>30</w:t>
+            </w:r>
+          </w:p>
+        </w:tc>
+        <w:tc>
+          <w:tcPr>
+            <w:tcW w:type="dxa" w:w="1417"/>
+          </w:tcPr>
+          <w:p>
+            <w:pPr>
+              <w:jc w:val="center"/>
+            </w:pPr>
+            <w:r>
+              <w:rPr>
+                <w:sz w:val="20"/>
+              </w:rPr>
+              <w:t>nan</w:t>
+            </w:r>
+          </w:p>
+        </w:tc>
+        <w:tc>
+          <w:tcPr>
+            <w:tcW w:type="dxa" w:w="1417"/>
+          </w:tcPr>
+          <w:p>
+            <w:pPr>
+              <w:jc w:val="center"/>
+            </w:pPr>
+            <w:r>
+              <w:rPr>
+                <w:sz w:val="20"/>
+              </w:rPr>
+              <w:t>nan</w:t>
+            </w:r>
+          </w:p>
+        </w:tc>
+        <w:tc>
+          <w:tcPr>
+            <w:tcW w:type="dxa" w:w="1417"/>
+          </w:tcPr>
+          <w:p>
+            <w:pPr>
+              <w:jc w:val="center"/>
+            </w:pPr>
+            <w:r>
+              <w:rPr>
+                <w:sz w:val="20"/>
+              </w:rPr>
+              <w:t>nan</w:t>
+            </w:r>
+          </w:p>
+        </w:tc>
+        <w:tc>
+          <w:tcPr>
+            <w:tcW w:type="dxa" w:w="1417"/>
+          </w:tcPr>
+          <w:p>
+            <w:pPr>
+              <w:jc w:val="center"/>
+            </w:pPr>
+            <w:r>
+              <w:rPr>
+                <w:sz w:val="20"/>
+              </w:rPr>
+              <w:t>nan</w:t>
+            </w:r>
+          </w:p>
+        </w:tc>
+        <w:tc>
+          <w:tcPr>
+            <w:tcW w:type="dxa" w:w="1417"/>
+          </w:tcPr>
+          <w:p>
+            <w:pPr>
+              <w:jc w:val="center"/>
+            </w:pPr>
+            <w:r>
+              <w:rPr>
+                <w:sz w:val="20"/>
+              </w:rPr>
+              <w:t>Not assessed</w:t>
+            </w:r>
+          </w:p>
+        </w:tc>
+      </w:tr>
+      <w:tr>
+        <w:tc>
+          <w:tcPr>
+            <w:tcW w:type="dxa" w:w="1417"/>
+          </w:tcPr>
+          <w:p>
+            <w:pPr>
+              <w:jc w:val="center"/>
+            </w:pPr>
+            <w:r>
+              <w:rPr>
+                <w:sz w:val="20"/>
+              </w:rPr>
+              <w:t>31</w:t>
+            </w:r>
+          </w:p>
+        </w:tc>
+        <w:tc>
+          <w:tcPr>
+            <w:tcW w:type="dxa" w:w="1417"/>
+          </w:tcPr>
+          <w:p>
+            <w:pPr>
+              <w:jc w:val="center"/>
+            </w:pPr>
+            <w:r>
+              <w:rPr>
+                <w:sz w:val="20"/>
+              </w:rPr>
+              <w:t>nan</w:t>
+            </w:r>
+          </w:p>
+        </w:tc>
+        <w:tc>
+          <w:tcPr>
+            <w:tcW w:type="dxa" w:w="1417"/>
+          </w:tcPr>
+          <w:p>
+            <w:pPr>
+              <w:jc w:val="center"/>
+            </w:pPr>
+            <w:r>
+              <w:rPr>
+                <w:sz w:val="20"/>
+              </w:rPr>
+              <w:t>nan</w:t>
+            </w:r>
+          </w:p>
+        </w:tc>
+        <w:tc>
+          <w:tcPr>
+            <w:tcW w:type="dxa" w:w="1417"/>
+          </w:tcPr>
+          <w:p>
+            <w:pPr>
+              <w:jc w:val="center"/>
+            </w:pPr>
+            <w:r>
+              <w:rPr>
+                <w:sz w:val="20"/>
+              </w:rPr>
+              <w:t>nan</w:t>
+            </w:r>
+          </w:p>
+        </w:tc>
+        <w:tc>
+          <w:tcPr>
+            <w:tcW w:type="dxa" w:w="1417"/>
+          </w:tcPr>
+          <w:p>
+            <w:pPr>
+              <w:jc w:val="center"/>
+            </w:pPr>
+            <w:r>
+              <w:rPr>
+                <w:sz w:val="20"/>
+              </w:rPr>
+              <w:t>nan</w:t>
+            </w:r>
+          </w:p>
+        </w:tc>
+        <w:tc>
+          <w:tcPr>
+            <w:tcW w:type="dxa" w:w="1417"/>
+          </w:tcPr>
+          <w:p>
+            <w:pPr>
+              <w:jc w:val="center"/>
+            </w:pPr>
+            <w:r>
+              <w:rPr>
+                <w:sz w:val="20"/>
+              </w:rPr>
+              <w:t>Not assessed</w:t>
+            </w:r>
+          </w:p>
+        </w:tc>
+      </w:tr>
+      <w:tr>
+        <w:tc>
+          <w:tcPr>
+            <w:tcW w:type="dxa" w:w="1417"/>
+          </w:tcPr>
+          <w:p>
+            <w:pPr>
+              <w:jc w:val="center"/>
+            </w:pPr>
+            <w:r>
+              <w:rPr>
+                <w:sz w:val="20"/>
+              </w:rPr>
+              <w:t>32</w:t>
+            </w:r>
+          </w:p>
+        </w:tc>
+        <w:tc>
+          <w:tcPr>
+            <w:tcW w:type="dxa" w:w="1417"/>
+          </w:tcPr>
+          <w:p>
+            <w:pPr>
+              <w:jc w:val="center"/>
+            </w:pPr>
+            <w:r>
+              <w:rPr>
+                <w:sz w:val="20"/>
+              </w:rPr>
+              <w:t>nan</w:t>
+            </w:r>
+          </w:p>
+        </w:tc>
+        <w:tc>
+          <w:tcPr>
+            <w:tcW w:type="dxa" w:w="1417"/>
+          </w:tcPr>
+          <w:p>
+            <w:pPr>
+              <w:jc w:val="center"/>
+            </w:pPr>
+            <w:r>
+              <w:rPr>
+                <w:sz w:val="20"/>
+              </w:rPr>
+              <w:t>nan</w:t>
+            </w:r>
+          </w:p>
+        </w:tc>
+        <w:tc>
+          <w:tcPr>
+            <w:tcW w:type="dxa" w:w="1417"/>
+          </w:tcPr>
+          <w:p>
+            <w:pPr>
+              <w:jc w:val="center"/>
+            </w:pPr>
+            <w:r>
+              <w:rPr>
+                <w:sz w:val="20"/>
+              </w:rPr>
+              <w:t>nan</w:t>
+            </w:r>
+          </w:p>
+        </w:tc>
+        <w:tc>
+          <w:tcPr>
+            <w:tcW w:type="dxa" w:w="1417"/>
+          </w:tcPr>
+          <w:p>
+            <w:pPr>
+              <w:jc w:val="center"/>
+            </w:pPr>
+            <w:r>
+              <w:rPr>
+                <w:sz w:val="20"/>
+              </w:rPr>
+              <w:t>nan</w:t>
+            </w:r>
+          </w:p>
+        </w:tc>
+        <w:tc>
+          <w:tcPr>
+            <w:tcW w:type="dxa" w:w="1417"/>
+          </w:tcPr>
+          <w:p>
+            <w:pPr>
+              <w:jc w:val="center"/>
+            </w:pPr>
+            <w:r>
+              <w:rPr>
+                <w:sz w:val="20"/>
+              </w:rPr>
+              <w:t>Not assessed</w:t>
+            </w:r>
+          </w:p>
+        </w:tc>
+      </w:tr>
+      <w:tr>
+        <w:tc>
+          <w:tcPr>
+            <w:tcW w:type="dxa" w:w="1417"/>
+          </w:tcPr>
+          <w:p>
+            <w:pPr>
+              <w:jc w:val="center"/>
+            </w:pPr>
+            <w:r>
+              <w:rPr>
+                <w:sz w:val="20"/>
+              </w:rPr>
+              <w:t>33</w:t>
+            </w:r>
+          </w:p>
+        </w:tc>
+        <w:tc>
+          <w:tcPr>
+            <w:tcW w:type="dxa" w:w="1417"/>
+          </w:tcPr>
+          <w:p>
+            <w:pPr>
+              <w:jc w:val="center"/>
+            </w:pPr>
+            <w:r>
+              <w:rPr>
+                <w:sz w:val="20"/>
+              </w:rPr>
+              <w:t>nan</w:t>
+            </w:r>
+          </w:p>
+        </w:tc>
+        <w:tc>
+          <w:tcPr>
+            <w:tcW w:type="dxa" w:w="1417"/>
+          </w:tcPr>
+          <w:p>
+            <w:pPr>
+              <w:jc w:val="center"/>
+            </w:pPr>
+            <w:r>
+              <w:rPr>
+                <w:sz w:val="20"/>
+              </w:rPr>
+              <w:t>nan</w:t>
+            </w:r>
+          </w:p>
+        </w:tc>
+        <w:tc>
+          <w:tcPr>
+            <w:tcW w:type="dxa" w:w="1417"/>
+          </w:tcPr>
+          <w:p>
+            <w:pPr>
+              <w:jc w:val="center"/>
+            </w:pPr>
+            <w:r>
+              <w:rPr>
+                <w:sz w:val="20"/>
+              </w:rPr>
+              <w:t>nan</w:t>
+            </w:r>
+          </w:p>
+        </w:tc>
+        <w:tc>
+          <w:tcPr>
+            <w:tcW w:type="dxa" w:w="1417"/>
+          </w:tcPr>
+          <w:p>
+            <w:pPr>
+              <w:jc w:val="center"/>
+            </w:pPr>
+            <w:r>
+              <w:rPr>
+                <w:sz w:val="20"/>
+              </w:rPr>
+              <w:t>nan</w:t>
+            </w:r>
+          </w:p>
+        </w:tc>
+        <w:tc>
+          <w:tcPr>
+            <w:tcW w:type="dxa" w:w="1417"/>
+          </w:tcPr>
+          <w:p>
+            <w:pPr>
+              <w:jc w:val="center"/>
+            </w:pPr>
+            <w:r>
+              <w:rPr>
+                <w:sz w:val="20"/>
+              </w:rPr>
+              <w:t>Not assessed</w:t>
+            </w:r>
+          </w:p>
+        </w:tc>
+      </w:tr>
+      <w:tr>
+        <w:tc>
+          <w:tcPr>
+            <w:tcW w:type="dxa" w:w="1417"/>
+          </w:tcPr>
+          <w:p>
+            <w:pPr>
+              <w:jc w:val="center"/>
+            </w:pPr>
+            <w:r>
+              <w:rPr>
+                <w:sz w:val="20"/>
+              </w:rPr>
+              <w:t>34</w:t>
+            </w:r>
+          </w:p>
+        </w:tc>
+        <w:tc>
+          <w:tcPr>
+            <w:tcW w:type="dxa" w:w="1417"/>
+          </w:tcPr>
+          <w:p>
+            <w:pPr>
+              <w:jc w:val="center"/>
+            </w:pPr>
+            <w:r>
+              <w:rPr>
+                <w:sz w:val="20"/>
+              </w:rPr>
+              <w:t>nan</w:t>
+            </w:r>
+          </w:p>
+        </w:tc>
+        <w:tc>
+          <w:tcPr>
+            <w:tcW w:type="dxa" w:w="1417"/>
+          </w:tcPr>
+          <w:p>
+            <w:pPr>
+              <w:jc w:val="center"/>
+            </w:pPr>
+            <w:r>
+              <w:rPr>
+                <w:sz w:val="20"/>
+              </w:rPr>
+              <w:t>nan</w:t>
+            </w:r>
+          </w:p>
+        </w:tc>
+        <w:tc>
+          <w:tcPr>
+            <w:tcW w:type="dxa" w:w="1417"/>
+          </w:tcPr>
+          <w:p>
+            <w:pPr>
+              <w:jc w:val="center"/>
+            </w:pPr>
+            <w:r>
+              <w:rPr>
+                <w:sz w:val="20"/>
+              </w:rPr>
+              <w:t>nan</w:t>
+            </w:r>
+          </w:p>
+        </w:tc>
+        <w:tc>
+          <w:tcPr>
+            <w:tcW w:type="dxa" w:w="1417"/>
+          </w:tcPr>
+          <w:p>
+            <w:pPr>
+              <w:jc w:val="center"/>
+            </w:pPr>
+            <w:r>
+              <w:rPr>
+                <w:sz w:val="20"/>
+              </w:rPr>
+              <w:t>nan</w:t>
+            </w:r>
+          </w:p>
+        </w:tc>
+        <w:tc>
+          <w:tcPr>
+            <w:tcW w:type="dxa" w:w="1417"/>
+          </w:tcPr>
+          <w:p>
+            <w:pPr>
+              <w:jc w:val="center"/>
+            </w:pPr>
+            <w:r>
+              <w:rPr>
+                <w:sz w:val="20"/>
+              </w:rPr>
+              <w:t>Not assessed</w:t>
+            </w:r>
+          </w:p>
+        </w:tc>
+      </w:tr>
+      <w:tr>
+        <w:tc>
+          <w:tcPr>
+            <w:tcW w:type="dxa" w:w="1417"/>
+          </w:tcPr>
+          <w:p>
+            <w:pPr>
+              <w:jc w:val="center"/>
+            </w:pPr>
+            <w:r>
+              <w:rPr>
+                <w:sz w:val="20"/>
+              </w:rPr>
+              <w:t>35</w:t>
+            </w:r>
+          </w:p>
+        </w:tc>
+        <w:tc>
+          <w:tcPr>
+            <w:tcW w:type="dxa" w:w="1417"/>
+          </w:tcPr>
+          <w:p>
+            <w:pPr>
+              <w:jc w:val="center"/>
+            </w:pPr>
+            <w:r>
+              <w:rPr>
+                <w:sz w:val="20"/>
+              </w:rPr>
+              <w:t>nan</w:t>
+            </w:r>
+          </w:p>
+        </w:tc>
+        <w:tc>
+          <w:tcPr>
+            <w:tcW w:type="dxa" w:w="1417"/>
+          </w:tcPr>
+          <w:p>
+            <w:pPr>
+              <w:jc w:val="center"/>
+            </w:pPr>
+            <w:r>
+              <w:rPr>
+                <w:sz w:val="20"/>
+              </w:rPr>
+              <w:t>nan</w:t>
+            </w:r>
+          </w:p>
+        </w:tc>
+        <w:tc>
+          <w:tcPr>
+            <w:tcW w:type="dxa" w:w="1417"/>
+          </w:tcPr>
+          <w:p>
+            <w:pPr>
+              <w:jc w:val="center"/>
+            </w:pPr>
+            <w:r>
+              <w:rPr>
+                <w:sz w:val="20"/>
+              </w:rPr>
+              <w:t>nan</w:t>
+            </w:r>
+          </w:p>
+        </w:tc>
+        <w:tc>
+          <w:tcPr>
+            <w:tcW w:type="dxa" w:w="1417"/>
+          </w:tcPr>
+          <w:p>
+            <w:pPr>
+              <w:jc w:val="center"/>
+            </w:pPr>
+            <w:r>
+              <w:rPr>
+                <w:sz w:val="20"/>
+              </w:rPr>
+              <w:t>nan</w:t>
+            </w:r>
+          </w:p>
+        </w:tc>
+        <w:tc>
+          <w:tcPr>
+            <w:tcW w:type="dxa" w:w="1417"/>
+          </w:tcPr>
+          <w:p>
+            <w:pPr>
+              <w:jc w:val="center"/>
+            </w:pPr>
+            <w:r>
+              <w:rPr>
+                <w:sz w:val="20"/>
+              </w:rPr>
+              <w:t>Not assessed</w:t>
+            </w:r>
+          </w:p>
+        </w:tc>
+      </w:tr>
+      <w:tr>
+        <w:tc>
+          <w:tcPr>
+            <w:tcW w:type="dxa" w:w="1417"/>
+          </w:tcPr>
+          <w:p>
+            <w:pPr>
+              <w:jc w:val="center"/>
+            </w:pPr>
+            <w:r>
+              <w:rPr>
+                <w:sz w:val="20"/>
+              </w:rPr>
+              <w:t>36</w:t>
+            </w:r>
+          </w:p>
+        </w:tc>
+        <w:tc>
+          <w:tcPr>
+            <w:tcW w:type="dxa" w:w="1417"/>
+          </w:tcPr>
+          <w:p>
+            <w:pPr>
+              <w:jc w:val="center"/>
+            </w:pPr>
+            <w:r>
+              <w:rPr>
+                <w:sz w:val="20"/>
+              </w:rPr>
+              <w:t>nan</w:t>
+            </w:r>
+          </w:p>
+        </w:tc>
+        <w:tc>
+          <w:tcPr>
+            <w:tcW w:type="dxa" w:w="1417"/>
+          </w:tcPr>
+          <w:p>
+            <w:pPr>
+              <w:jc w:val="center"/>
+            </w:pPr>
+            <w:r>
+              <w:rPr>
+                <w:sz w:val="20"/>
+              </w:rPr>
+              <w:t>nan</w:t>
+            </w:r>
+          </w:p>
+        </w:tc>
+        <w:tc>
+          <w:tcPr>
+            <w:tcW w:type="dxa" w:w="1417"/>
+          </w:tcPr>
+          <w:p>
+            <w:pPr>
+              <w:jc w:val="center"/>
+            </w:pPr>
+            <w:r>
+              <w:rPr>
+                <w:sz w:val="20"/>
+              </w:rPr>
+              <w:t>nan</w:t>
+            </w:r>
+          </w:p>
+        </w:tc>
+        <w:tc>
+          <w:tcPr>
+            <w:tcW w:type="dxa" w:w="1417"/>
+          </w:tcPr>
+          <w:p>
+            <w:pPr>
+              <w:jc w:val="center"/>
+            </w:pPr>
+            <w:r>
+              <w:rPr>
+                <w:sz w:val="20"/>
+              </w:rPr>
+              <w:t>nan</w:t>
+            </w:r>
+          </w:p>
+        </w:tc>
+        <w:tc>
+          <w:tcPr>
+            <w:tcW w:type="dxa" w:w="1417"/>
+          </w:tcPr>
+          <w:p>
+            <w:pPr>
+              <w:jc w:val="center"/>
+            </w:pPr>
+            <w:r>
+              <w:rPr>
+                <w:sz w:val="20"/>
+              </w:rPr>
+              <w:t>Not assessed</w:t>
+            </w:r>
+          </w:p>
+        </w:tc>
+      </w:tr>
+      <w:tr>
+        <w:tc>
+          <w:tcPr>
+            <w:tcW w:type="dxa" w:w="1417"/>
+          </w:tcPr>
+          <w:p>
+            <w:pPr>
+              <w:jc w:val="center"/>
+            </w:pPr>
+            <w:r>
+              <w:rPr>
+                <w:sz w:val="20"/>
+              </w:rPr>
+              <w:t>37</w:t>
+            </w:r>
+          </w:p>
+        </w:tc>
+        <w:tc>
+          <w:tcPr>
+            <w:tcW w:type="dxa" w:w="1417"/>
+          </w:tcPr>
+          <w:p>
+            <w:pPr>
+              <w:jc w:val="center"/>
+            </w:pPr>
+            <w:r>
+              <w:rPr>
+                <w:sz w:val="20"/>
+              </w:rPr>
+              <w:t>nan</w:t>
+            </w:r>
+          </w:p>
+        </w:tc>
+        <w:tc>
+          <w:tcPr>
+            <w:tcW w:type="dxa" w:w="1417"/>
+          </w:tcPr>
+          <w:p>
+            <w:pPr>
+              <w:jc w:val="center"/>
+            </w:pPr>
+            <w:r>
+              <w:rPr>
+                <w:sz w:val="20"/>
+              </w:rPr>
+              <w:t>nan</w:t>
+            </w:r>
+          </w:p>
+        </w:tc>
+        <w:tc>
+          <w:tcPr>
+            <w:tcW w:type="dxa" w:w="1417"/>
+          </w:tcPr>
+          <w:p>
+            <w:pPr>
+              <w:jc w:val="center"/>
+            </w:pPr>
+            <w:r>
+              <w:rPr>
+                <w:sz w:val="20"/>
+              </w:rPr>
+              <w:t>nan</w:t>
+            </w:r>
+          </w:p>
+        </w:tc>
+        <w:tc>
+          <w:tcPr>
+            <w:tcW w:type="dxa" w:w="1417"/>
+          </w:tcPr>
+          <w:p>
+            <w:pPr>
+              <w:jc w:val="center"/>
+            </w:pPr>
+            <w:r>
+              <w:rPr>
+                <w:sz w:val="20"/>
+              </w:rPr>
+              <w:t>nan</w:t>
+            </w:r>
+          </w:p>
+        </w:tc>
+        <w:tc>
+          <w:tcPr>
+            <w:tcW w:type="dxa" w:w="1417"/>
+          </w:tcPr>
+          <w:p>
+            <w:pPr>
+              <w:jc w:val="center"/>
+            </w:pPr>
+            <w:r>
+              <w:rPr>
+                <w:sz w:val="20"/>
+              </w:rPr>
+              <w:t>Not assessed</w:t>
+            </w:r>
+          </w:p>
+        </w:tc>
+      </w:tr>
+      <w:tr>
+        <w:tc>
+          <w:tcPr>
+            <w:tcW w:type="dxa" w:w="1417"/>
+          </w:tcPr>
+          <w:p>
+            <w:pPr>
+              <w:jc w:val="center"/>
+            </w:pPr>
+            <w:r>
+              <w:rPr>
+                <w:sz w:val="20"/>
+              </w:rPr>
+              <w:t>38</w:t>
+            </w:r>
+          </w:p>
+        </w:tc>
+        <w:tc>
+          <w:tcPr>
+            <w:tcW w:type="dxa" w:w="1417"/>
+          </w:tcPr>
+          <w:p>
+            <w:pPr>
+              <w:jc w:val="center"/>
+            </w:pPr>
+            <w:r>
+              <w:rPr>
+                <w:sz w:val="20"/>
+              </w:rPr>
+              <w:t>nan</w:t>
+            </w:r>
+          </w:p>
+        </w:tc>
+        <w:tc>
+          <w:tcPr>
+            <w:tcW w:type="dxa" w:w="1417"/>
+          </w:tcPr>
+          <w:p>
+            <w:pPr>
+              <w:jc w:val="center"/>
+            </w:pPr>
+            <w:r>
+              <w:rPr>
+                <w:sz w:val="20"/>
+              </w:rPr>
+              <w:t>nan</w:t>
+            </w:r>
+          </w:p>
+        </w:tc>
+        <w:tc>
+          <w:tcPr>
+            <w:tcW w:type="dxa" w:w="1417"/>
+          </w:tcPr>
+          <w:p>
+            <w:pPr>
+              <w:jc w:val="center"/>
+            </w:pPr>
+            <w:r>
+              <w:rPr>
+                <w:sz w:val="20"/>
+              </w:rPr>
+              <w:t>nan</w:t>
+            </w:r>
+          </w:p>
+        </w:tc>
+        <w:tc>
+          <w:tcPr>
+            <w:tcW w:type="dxa" w:w="1417"/>
+          </w:tcPr>
+          <w:p>
+            <w:pPr>
+              <w:jc w:val="center"/>
+            </w:pPr>
+            <w:r>
+              <w:rPr>
+                <w:sz w:val="20"/>
+              </w:rPr>
+              <w:t>nan</w:t>
+            </w:r>
+          </w:p>
+        </w:tc>
+        <w:tc>
+          <w:tcPr>
+            <w:tcW w:type="dxa" w:w="1417"/>
+          </w:tcPr>
+          <w:p>
+            <w:pPr>
+              <w:jc w:val="center"/>
+            </w:pPr>
+            <w:r>
+              <w:rPr>
+                <w:sz w:val="20"/>
+              </w:rPr>
+              <w:t>Not assessed</w:t>
+            </w:r>
+          </w:p>
+        </w:tc>
+      </w:tr>
+      <w:tr>
+        <w:tc>
+          <w:tcPr>
+            <w:tcW w:type="dxa" w:w="1417"/>
+          </w:tcPr>
+          <w:p>
+            <w:pPr>
+              <w:jc w:val="center"/>
+            </w:pPr>
+            <w:r>
+              <w:rPr>
+                <w:sz w:val="20"/>
+              </w:rPr>
+              <w:t>39</w:t>
+            </w:r>
+          </w:p>
+        </w:tc>
+        <w:tc>
+          <w:tcPr>
+            <w:tcW w:type="dxa" w:w="1417"/>
+          </w:tcPr>
+          <w:p>
+            <w:pPr>
+              <w:jc w:val="center"/>
+            </w:pPr>
+            <w:r>
+              <w:rPr>
+                <w:sz w:val="20"/>
+              </w:rPr>
+              <w:t>nan</w:t>
+            </w:r>
+          </w:p>
+        </w:tc>
+        <w:tc>
+          <w:tcPr>
+            <w:tcW w:type="dxa" w:w="1417"/>
+          </w:tcPr>
+          <w:p>
+            <w:pPr>
+              <w:jc w:val="center"/>
+            </w:pPr>
+            <w:r>
+              <w:rPr>
+                <w:sz w:val="20"/>
+              </w:rPr>
+              <w:t>nan</w:t>
+            </w:r>
+          </w:p>
+        </w:tc>
+        <w:tc>
+          <w:tcPr>
+            <w:tcW w:type="dxa" w:w="1417"/>
+          </w:tcPr>
+          <w:p>
+            <w:pPr>
+              <w:jc w:val="center"/>
+            </w:pPr>
+            <w:r>
+              <w:rPr>
+                <w:sz w:val="20"/>
+              </w:rPr>
+              <w:t>nan</w:t>
+            </w:r>
+          </w:p>
+        </w:tc>
+        <w:tc>
+          <w:tcPr>
+            <w:tcW w:type="dxa" w:w="1417"/>
+          </w:tcPr>
+          <w:p>
+            <w:pPr>
+              <w:jc w:val="center"/>
+            </w:pPr>
+            <w:r>
+              <w:rPr>
+                <w:sz w:val="20"/>
+              </w:rPr>
+              <w:t>nan</w:t>
+            </w:r>
+          </w:p>
+        </w:tc>
+        <w:tc>
+          <w:tcPr>
+            <w:tcW w:type="dxa" w:w="1417"/>
+          </w:tcPr>
+          <w:p>
+            <w:pPr>
+              <w:jc w:val="center"/>
+            </w:pPr>
+            <w:r>
+              <w:rPr>
+                <w:sz w:val="20"/>
+              </w:rPr>
+              <w:t>Not assessed</w:t>
+            </w:r>
+          </w:p>
+        </w:tc>
+      </w:tr>
+      <w:tr>
+        <w:tc>
+          <w:tcPr>
+            <w:tcW w:type="dxa" w:w="1417"/>
+          </w:tcPr>
+          <w:p>
+            <w:pPr>
+              <w:jc w:val="center"/>
+            </w:pPr>
+            <w:r>
+              <w:rPr>
+                <w:sz w:val="20"/>
+              </w:rPr>
+              <w:t>40</w:t>
+            </w:r>
+          </w:p>
+        </w:tc>
+        <w:tc>
+          <w:tcPr>
+            <w:tcW w:type="dxa" w:w="1417"/>
+          </w:tcPr>
+          <w:p>
+            <w:pPr>
+              <w:jc w:val="center"/>
+            </w:pPr>
+            <w:r>
+              <w:rPr>
+                <w:sz w:val="20"/>
+              </w:rPr>
+              <w:t>nan</w:t>
+            </w:r>
+          </w:p>
+        </w:tc>
+        <w:tc>
+          <w:tcPr>
+            <w:tcW w:type="dxa" w:w="1417"/>
+          </w:tcPr>
+          <w:p>
+            <w:pPr>
+              <w:jc w:val="center"/>
+            </w:pPr>
+            <w:r>
+              <w:rPr>
+                <w:sz w:val="20"/>
+              </w:rPr>
+              <w:t>nan</w:t>
+            </w:r>
+          </w:p>
+        </w:tc>
+        <w:tc>
+          <w:tcPr>
+            <w:tcW w:type="dxa" w:w="1417"/>
+          </w:tcPr>
+          <w:p>
+            <w:pPr>
+              <w:jc w:val="center"/>
+            </w:pPr>
+            <w:r>
+              <w:rPr>
+                <w:sz w:val="20"/>
+              </w:rPr>
+              <w:t>nan</w:t>
+            </w:r>
+          </w:p>
+        </w:tc>
+        <w:tc>
+          <w:tcPr>
+            <w:tcW w:type="dxa" w:w="1417"/>
+          </w:tcPr>
+          <w:p>
+            <w:pPr>
+              <w:jc w:val="center"/>
+            </w:pPr>
+            <w:r>
+              <w:rPr>
+                <w:sz w:val="20"/>
+              </w:rPr>
+              <w:t>nan</w:t>
+            </w:r>
+          </w:p>
+        </w:tc>
+        <w:tc>
+          <w:tcPr>
+            <w:tcW w:type="dxa" w:w="1417"/>
+          </w:tcPr>
+          <w:p>
+            <w:pPr>
+              <w:jc w:val="center"/>
+            </w:pPr>
+            <w:r>
+              <w:rPr>
+                <w:sz w:val="20"/>
+              </w:rPr>
+              <w:t>Not assessed</w:t>
+            </w:r>
+          </w:p>
+        </w:tc>
+      </w:tr>
     </w:tbl>
     <w:p>
       <w:r>
@@ -3963,7 +5074,7 @@
             <w:r>
               <w:drawing>
                 <wp:inline xmlns:a="http://schemas.openxmlformats.org/drawingml/2006/main" xmlns:pic="http://schemas.openxmlformats.org/drawingml/2006/picture">
-                  <wp:extent cx="5486400" cy="3978416"/>
+                  <wp:extent cx="5486400" cy="2611120"/>
                   <wp:docPr id="3" name="Picture 3"/>
                   <wp:cNvGraphicFramePr>
                     <a:graphicFrameLocks noChangeAspect="1"/>
@@ -3972,7 +5083,7 @@
                     <a:graphicData uri="http://schemas.openxmlformats.org/drawingml/2006/picture">
                       <pic:pic>
                         <pic:nvPicPr>
-                          <pic:cNvPr id="0" name="cropped_plot_Difference_Plot_median.png"/>
+                          <pic:cNvPr id="0" name="image.png"/>
                           <pic:cNvPicPr/>
                         </pic:nvPicPr>
                         <pic:blipFill>
@@ -3984,7 +5095,7 @@
                         <pic:spPr>
                           <a:xfrm>
                             <a:off x="0" y="0"/>
-                            <a:ext cx="5486400" cy="3978416"/>
+                            <a:ext cx="5486400" cy="2611120"/>
                           </a:xfrm>
                           <a:prstGeom prst="rect"/>
                         </pic:spPr>
@@ -4010,7 +5121,7 @@
             <w:r>
               <w:drawing>
                 <wp:inline xmlns:a="http://schemas.openxmlformats.org/drawingml/2006/main" xmlns:pic="http://schemas.openxmlformats.org/drawingml/2006/picture">
-                  <wp:extent cx="5486400" cy="4057132"/>
+                  <wp:extent cx="5486400" cy="2611120"/>
                   <wp:docPr id="4" name="Picture 4"/>
                   <wp:cNvGraphicFramePr>
                     <a:graphicFrameLocks noChangeAspect="1"/>
@@ -4019,7 +5130,7 @@
                     <a:graphicData uri="http://schemas.openxmlformats.org/drawingml/2006/picture">
                       <pic:pic>
                         <pic:nvPicPr>
-                          <pic:cNvPr id="0" name="cropped_plot_Difference_Plot_median_per.png"/>
+                          <pic:cNvPr id="0" name="image.png"/>
                           <pic:cNvPicPr/>
                         </pic:nvPicPr>
                         <pic:blipFill>
@@ -4031,7 +5142,7 @@
                         <pic:spPr>
                           <a:xfrm>
                             <a:off x="0" y="0"/>
-                            <a:ext cx="5486400" cy="4057132"/>
+                            <a:ext cx="5486400" cy="2611120"/>
                           </a:xfrm>
                           <a:prstGeom prst="rect"/>
                         </pic:spPr>

</xml_diff>

<commit_message>
Streamlined the code by removing unnecessary imports and fixed the Deming regression function to correctly calculate Pearson's r. Adjusted error limits for method comparison.
</commit_message>
<xml_diff>
--- a/MethodComparison.docx
+++ b/MethodComparison.docx
@@ -7,7 +7,7 @@
         <w:pStyle w:val="Heading2"/>
       </w:pPr>
       <w:r>
-        <w:t xml:space="preserve"> Digoxin (new) vs. Digoxin (old)</w:t>
+        <w:t xml:space="preserve"> Dixogin (new) vs. Dixogin (old)</w:t>
       </w:r>
     </w:p>
     <w:p>
@@ -20,19 +20,19 @@
         <w:t xml:space="preserve">&lt; </w:t>
       </w:r>
       <w:r>
-        <w:t>3</w:t>
+        <w:t>2</w:t>
       </w:r>
       <w:r>
         <w:t xml:space="preserve">: ± </w:t>
       </w:r>
       <w:r>
-        <w:t>20</w:t>
+        <w:t>0.2</w:t>
       </w:r>
       <w:r>
         <w:t xml:space="preserve"> </w:t>
       </w:r>
       <w:r>
-        <w:t>u/n</w:t>
+        <w:t>fd</w:t>
       </w:r>
     </w:p>
     <w:p>
@@ -40,13 +40,13 @@
         <w:t xml:space="preserve">≥ </w:t>
       </w:r>
       <w:r>
-        <w:t>3</w:t>
+        <w:t>2</w:t>
       </w:r>
       <w:r>
         <w:t>: ±</w:t>
       </w:r>
       <w:r>
-        <w:t>15</w:t>
+        <w:t>10</w:t>
       </w:r>
       <w:r>
         <w:t>%</w:t>
@@ -60,7 +60,7 @@
         <w:rPr>
           <w:b/>
         </w:rPr>
-        <w:t>Digoxin (old) - Current method</w:t>
+        <w:t>Dixogin (old) - Current method</w:t>
       </w:r>
     </w:p>
     <w:p>
@@ -71,7 +71,7 @@
         <w:rPr>
           <w:b/>
         </w:rPr>
-        <w:t>Digoxin (new) - Test method</w:t>
+        <w:t>Dixogin (new) - Test method</w:t>
       </w:r>
     </w:p>
     <w:p>
@@ -966,7 +966,7 @@
       <w:r>
         <w:drawing>
           <wp:inline xmlns:a="http://schemas.openxmlformats.org/drawingml/2006/main" xmlns:pic="http://schemas.openxmlformats.org/drawingml/2006/picture">
-            <wp:extent cx="5943600" cy="2538835"/>
+            <wp:extent cx="5943600" cy="2556267"/>
             <wp:docPr id="2" name="Picture 2"/>
             <wp:cNvGraphicFramePr>
               <a:graphicFrameLocks noChangeAspect="1"/>
@@ -987,7 +987,7 @@
                   <pic:spPr>
                     <a:xfrm>
                       <a:off x="0" y="0"/>
-                      <a:ext cx="5943600" cy="2538835"/>
+                      <a:ext cx="5943600" cy="2556267"/>
                     </a:xfrm>
                     <a:prstGeom prst="rect"/>
                   </pic:spPr>
@@ -5074,7 +5074,7 @@
             <w:r>
               <w:drawing>
                 <wp:inline xmlns:a="http://schemas.openxmlformats.org/drawingml/2006/main" xmlns:pic="http://schemas.openxmlformats.org/drawingml/2006/picture">
-                  <wp:extent cx="5486400" cy="2611120"/>
+                  <wp:extent cx="5486400" cy="2584004"/>
                   <wp:docPr id="3" name="Picture 3"/>
                   <wp:cNvGraphicFramePr>
                     <a:graphicFrameLocks noChangeAspect="1"/>
@@ -5095,7 +5095,7 @@
                         <pic:spPr>
                           <a:xfrm>
                             <a:off x="0" y="0"/>
-                            <a:ext cx="5486400" cy="2611120"/>
+                            <a:ext cx="5486400" cy="2584004"/>
                           </a:xfrm>
                           <a:prstGeom prst="rect"/>
                         </pic:spPr>
@@ -5121,7 +5121,7 @@
             <w:r>
               <w:drawing>
                 <wp:inline xmlns:a="http://schemas.openxmlformats.org/drawingml/2006/main" xmlns:pic="http://schemas.openxmlformats.org/drawingml/2006/picture">
-                  <wp:extent cx="5486400" cy="2611120"/>
+                  <wp:extent cx="5486400" cy="2622452"/>
                   <wp:docPr id="4" name="Picture 4"/>
                   <wp:cNvGraphicFramePr>
                     <a:graphicFrameLocks noChangeAspect="1"/>
@@ -5142,7 +5142,7 @@
                         <pic:spPr>
                           <a:xfrm>
                             <a:off x="0" y="0"/>
-                            <a:ext cx="5486400" cy="2611120"/>
+                            <a:ext cx="5486400" cy="2622452"/>
                           </a:xfrm>
                           <a:prstGeom prst="rect"/>
                         </pic:spPr>

</xml_diff>

<commit_message>
Updated stream figures to have the originally defined figure size.
</commit_message>
<xml_diff>
--- a/MethodComparison.docx
+++ b/MethodComparison.docx
@@ -7,7 +7,7 @@
         <w:pStyle w:val="Heading2"/>
       </w:pPr>
       <w:r>
-        <w:t xml:space="preserve"> Dixogin (new) vs. Dixogin (old)</w:t>
+        <w:t xml:space="preserve"> Digoxin (new) vs. Digoxin (old)</w:t>
       </w:r>
     </w:p>
     <w:p>
@@ -32,7 +32,7 @@
         <w:t xml:space="preserve"> </w:t>
       </w:r>
       <w:r>
-        <w:t>fd</w:t>
+        <w:t>nmol/L</w:t>
       </w:r>
     </w:p>
     <w:p>
@@ -60,7 +60,7 @@
         <w:rPr>
           <w:b/>
         </w:rPr>
-        <w:t>Dixogin (old) - Current method</w:t>
+        <w:t>Digoxin (old) - Current method</w:t>
       </w:r>
     </w:p>
     <w:p>
@@ -71,7 +71,7 @@
         <w:rPr>
           <w:b/>
         </w:rPr>
-        <w:t>Dixogin (new) - Test method</w:t>
+        <w:t>Digoxin (new) - Test method</w:t>
       </w:r>
     </w:p>
     <w:p>
@@ -966,7 +966,7 @@
       <w:r>
         <w:drawing>
           <wp:inline xmlns:a="http://schemas.openxmlformats.org/drawingml/2006/main" xmlns:pic="http://schemas.openxmlformats.org/drawingml/2006/picture">
-            <wp:extent cx="5943600" cy="2556267"/>
+            <wp:extent cx="5943600" cy="6127484"/>
             <wp:docPr id="2" name="Picture 2"/>
             <wp:cNvGraphicFramePr>
               <a:graphicFrameLocks noChangeAspect="1"/>
@@ -987,7 +987,7 @@
                   <pic:spPr>
                     <a:xfrm>
                       <a:off x="0" y="0"/>
-                      <a:ext cx="5943600" cy="2556267"/>
+                      <a:ext cx="5943600" cy="6127484"/>
                     </a:xfrm>
                     <a:prstGeom prst="rect"/>
                   </pic:spPr>
@@ -5074,7 +5074,7 @@
             <w:r>
               <w:drawing>
                 <wp:inline xmlns:a="http://schemas.openxmlformats.org/drawingml/2006/main" xmlns:pic="http://schemas.openxmlformats.org/drawingml/2006/picture">
-                  <wp:extent cx="5486400" cy="2584004"/>
+                  <wp:extent cx="5486400" cy="5803839"/>
                   <wp:docPr id="3" name="Picture 3"/>
                   <wp:cNvGraphicFramePr>
                     <a:graphicFrameLocks noChangeAspect="1"/>
@@ -5095,7 +5095,7 @@
                         <pic:spPr>
                           <a:xfrm>
                             <a:off x="0" y="0"/>
-                            <a:ext cx="5486400" cy="2584004"/>
+                            <a:ext cx="5486400" cy="5803839"/>
                           </a:xfrm>
                           <a:prstGeom prst="rect"/>
                         </pic:spPr>
@@ -5121,7 +5121,7 @@
             <w:r>
               <w:drawing>
                 <wp:inline xmlns:a="http://schemas.openxmlformats.org/drawingml/2006/main" xmlns:pic="http://schemas.openxmlformats.org/drawingml/2006/picture">
-                  <wp:extent cx="5486400" cy="2622452"/>
+                  <wp:extent cx="5486400" cy="4057133"/>
                   <wp:docPr id="4" name="Picture 4"/>
                   <wp:cNvGraphicFramePr>
                     <a:graphicFrameLocks noChangeAspect="1"/>
@@ -5142,7 +5142,7 @@
                         <pic:spPr>
                           <a:xfrm>
                             <a:off x="0" y="0"/>
-                            <a:ext cx="5486400" cy="2622452"/>
+                            <a:ext cx="5486400" cy="4057133"/>
                           </a:xfrm>
                           <a:prstGeom prst="rect"/>
                         </pic:spPr>

</xml_diff>

<commit_message>
updated sample comparison table, to drop empty rows if x or y value are missing).
</commit_message>
<xml_diff>
--- a/MethodComparison.docx
+++ b/MethodComparison.docx
@@ -3570,1476 +3570,6 @@
           </w:p>
         </w:tc>
       </w:tr>
-      <w:tr>
-        <w:tc>
-          <w:tcPr>
-            <w:tcW w:type="dxa" w:w="1417"/>
-          </w:tcPr>
-          <w:p>
-            <w:pPr>
-              <w:jc w:val="center"/>
-            </w:pPr>
-            <w:r>
-              <w:rPr>
-                <w:sz w:val="20"/>
-              </w:rPr>
-              <w:t>26</w:t>
-            </w:r>
-          </w:p>
-        </w:tc>
-        <w:tc>
-          <w:tcPr>
-            <w:tcW w:type="dxa" w:w="1417"/>
-          </w:tcPr>
-          <w:p>
-            <w:pPr>
-              <w:jc w:val="center"/>
-            </w:pPr>
-            <w:r>
-              <w:rPr>
-                <w:sz w:val="20"/>
-              </w:rPr>
-              <w:t>nan</w:t>
-            </w:r>
-          </w:p>
-        </w:tc>
-        <w:tc>
-          <w:tcPr>
-            <w:tcW w:type="dxa" w:w="1417"/>
-          </w:tcPr>
-          <w:p>
-            <w:pPr>
-              <w:jc w:val="center"/>
-            </w:pPr>
-            <w:r>
-              <w:rPr>
-                <w:sz w:val="20"/>
-              </w:rPr>
-              <w:t>nan</w:t>
-            </w:r>
-          </w:p>
-        </w:tc>
-        <w:tc>
-          <w:tcPr>
-            <w:tcW w:type="dxa" w:w="1417"/>
-          </w:tcPr>
-          <w:p>
-            <w:pPr>
-              <w:jc w:val="center"/>
-            </w:pPr>
-            <w:r>
-              <w:rPr>
-                <w:sz w:val="20"/>
-              </w:rPr>
-              <w:t>nan</w:t>
-            </w:r>
-          </w:p>
-        </w:tc>
-        <w:tc>
-          <w:tcPr>
-            <w:tcW w:type="dxa" w:w="1417"/>
-          </w:tcPr>
-          <w:p>
-            <w:pPr>
-              <w:jc w:val="center"/>
-            </w:pPr>
-            <w:r>
-              <w:rPr>
-                <w:sz w:val="20"/>
-              </w:rPr>
-              <w:t>nan</w:t>
-            </w:r>
-          </w:p>
-        </w:tc>
-        <w:tc>
-          <w:tcPr>
-            <w:tcW w:type="dxa" w:w="1417"/>
-          </w:tcPr>
-          <w:p>
-            <w:pPr>
-              <w:jc w:val="center"/>
-            </w:pPr>
-            <w:r>
-              <w:rPr>
-                <w:sz w:val="20"/>
-              </w:rPr>
-              <w:t>Not assessed</w:t>
-            </w:r>
-          </w:p>
-        </w:tc>
-      </w:tr>
-      <w:tr>
-        <w:tc>
-          <w:tcPr>
-            <w:tcW w:type="dxa" w:w="1417"/>
-          </w:tcPr>
-          <w:p>
-            <w:pPr>
-              <w:jc w:val="center"/>
-            </w:pPr>
-            <w:r>
-              <w:rPr>
-                <w:sz w:val="20"/>
-              </w:rPr>
-              <w:t>27</w:t>
-            </w:r>
-          </w:p>
-        </w:tc>
-        <w:tc>
-          <w:tcPr>
-            <w:tcW w:type="dxa" w:w="1417"/>
-          </w:tcPr>
-          <w:p>
-            <w:pPr>
-              <w:jc w:val="center"/>
-            </w:pPr>
-            <w:r>
-              <w:rPr>
-                <w:sz w:val="20"/>
-              </w:rPr>
-              <w:t>nan</w:t>
-            </w:r>
-          </w:p>
-        </w:tc>
-        <w:tc>
-          <w:tcPr>
-            <w:tcW w:type="dxa" w:w="1417"/>
-          </w:tcPr>
-          <w:p>
-            <w:pPr>
-              <w:jc w:val="center"/>
-            </w:pPr>
-            <w:r>
-              <w:rPr>
-                <w:sz w:val="20"/>
-              </w:rPr>
-              <w:t>nan</w:t>
-            </w:r>
-          </w:p>
-        </w:tc>
-        <w:tc>
-          <w:tcPr>
-            <w:tcW w:type="dxa" w:w="1417"/>
-          </w:tcPr>
-          <w:p>
-            <w:pPr>
-              <w:jc w:val="center"/>
-            </w:pPr>
-            <w:r>
-              <w:rPr>
-                <w:sz w:val="20"/>
-              </w:rPr>
-              <w:t>nan</w:t>
-            </w:r>
-          </w:p>
-        </w:tc>
-        <w:tc>
-          <w:tcPr>
-            <w:tcW w:type="dxa" w:w="1417"/>
-          </w:tcPr>
-          <w:p>
-            <w:pPr>
-              <w:jc w:val="center"/>
-            </w:pPr>
-            <w:r>
-              <w:rPr>
-                <w:sz w:val="20"/>
-              </w:rPr>
-              <w:t>nan</w:t>
-            </w:r>
-          </w:p>
-        </w:tc>
-        <w:tc>
-          <w:tcPr>
-            <w:tcW w:type="dxa" w:w="1417"/>
-          </w:tcPr>
-          <w:p>
-            <w:pPr>
-              <w:jc w:val="center"/>
-            </w:pPr>
-            <w:r>
-              <w:rPr>
-                <w:sz w:val="20"/>
-              </w:rPr>
-              <w:t>Not assessed</w:t>
-            </w:r>
-          </w:p>
-        </w:tc>
-      </w:tr>
-      <w:tr>
-        <w:tc>
-          <w:tcPr>
-            <w:tcW w:type="dxa" w:w="1417"/>
-          </w:tcPr>
-          <w:p>
-            <w:pPr>
-              <w:jc w:val="center"/>
-            </w:pPr>
-            <w:r>
-              <w:rPr>
-                <w:sz w:val="20"/>
-              </w:rPr>
-              <w:t>28</w:t>
-            </w:r>
-          </w:p>
-        </w:tc>
-        <w:tc>
-          <w:tcPr>
-            <w:tcW w:type="dxa" w:w="1417"/>
-          </w:tcPr>
-          <w:p>
-            <w:pPr>
-              <w:jc w:val="center"/>
-            </w:pPr>
-            <w:r>
-              <w:rPr>
-                <w:sz w:val="20"/>
-              </w:rPr>
-              <w:t>nan</w:t>
-            </w:r>
-          </w:p>
-        </w:tc>
-        <w:tc>
-          <w:tcPr>
-            <w:tcW w:type="dxa" w:w="1417"/>
-          </w:tcPr>
-          <w:p>
-            <w:pPr>
-              <w:jc w:val="center"/>
-            </w:pPr>
-            <w:r>
-              <w:rPr>
-                <w:sz w:val="20"/>
-              </w:rPr>
-              <w:t>nan</w:t>
-            </w:r>
-          </w:p>
-        </w:tc>
-        <w:tc>
-          <w:tcPr>
-            <w:tcW w:type="dxa" w:w="1417"/>
-          </w:tcPr>
-          <w:p>
-            <w:pPr>
-              <w:jc w:val="center"/>
-            </w:pPr>
-            <w:r>
-              <w:rPr>
-                <w:sz w:val="20"/>
-              </w:rPr>
-              <w:t>nan</w:t>
-            </w:r>
-          </w:p>
-        </w:tc>
-        <w:tc>
-          <w:tcPr>
-            <w:tcW w:type="dxa" w:w="1417"/>
-          </w:tcPr>
-          <w:p>
-            <w:pPr>
-              <w:jc w:val="center"/>
-            </w:pPr>
-            <w:r>
-              <w:rPr>
-                <w:sz w:val="20"/>
-              </w:rPr>
-              <w:t>nan</w:t>
-            </w:r>
-          </w:p>
-        </w:tc>
-        <w:tc>
-          <w:tcPr>
-            <w:tcW w:type="dxa" w:w="1417"/>
-          </w:tcPr>
-          <w:p>
-            <w:pPr>
-              <w:jc w:val="center"/>
-            </w:pPr>
-            <w:r>
-              <w:rPr>
-                <w:sz w:val="20"/>
-              </w:rPr>
-              <w:t>Not assessed</w:t>
-            </w:r>
-          </w:p>
-        </w:tc>
-      </w:tr>
-      <w:tr>
-        <w:tc>
-          <w:tcPr>
-            <w:tcW w:type="dxa" w:w="1417"/>
-          </w:tcPr>
-          <w:p>
-            <w:pPr>
-              <w:jc w:val="center"/>
-            </w:pPr>
-            <w:r>
-              <w:rPr>
-                <w:sz w:val="20"/>
-              </w:rPr>
-              <w:t>29</w:t>
-            </w:r>
-          </w:p>
-        </w:tc>
-        <w:tc>
-          <w:tcPr>
-            <w:tcW w:type="dxa" w:w="1417"/>
-          </w:tcPr>
-          <w:p>
-            <w:pPr>
-              <w:jc w:val="center"/>
-            </w:pPr>
-            <w:r>
-              <w:rPr>
-                <w:sz w:val="20"/>
-              </w:rPr>
-              <w:t>nan</w:t>
-            </w:r>
-          </w:p>
-        </w:tc>
-        <w:tc>
-          <w:tcPr>
-            <w:tcW w:type="dxa" w:w="1417"/>
-          </w:tcPr>
-          <w:p>
-            <w:pPr>
-              <w:jc w:val="center"/>
-            </w:pPr>
-            <w:r>
-              <w:rPr>
-                <w:sz w:val="20"/>
-              </w:rPr>
-              <w:t>nan</w:t>
-            </w:r>
-          </w:p>
-        </w:tc>
-        <w:tc>
-          <w:tcPr>
-            <w:tcW w:type="dxa" w:w="1417"/>
-          </w:tcPr>
-          <w:p>
-            <w:pPr>
-              <w:jc w:val="center"/>
-            </w:pPr>
-            <w:r>
-              <w:rPr>
-                <w:sz w:val="20"/>
-              </w:rPr>
-              <w:t>nan</w:t>
-            </w:r>
-          </w:p>
-        </w:tc>
-        <w:tc>
-          <w:tcPr>
-            <w:tcW w:type="dxa" w:w="1417"/>
-          </w:tcPr>
-          <w:p>
-            <w:pPr>
-              <w:jc w:val="center"/>
-            </w:pPr>
-            <w:r>
-              <w:rPr>
-                <w:sz w:val="20"/>
-              </w:rPr>
-              <w:t>nan</w:t>
-            </w:r>
-          </w:p>
-        </w:tc>
-        <w:tc>
-          <w:tcPr>
-            <w:tcW w:type="dxa" w:w="1417"/>
-          </w:tcPr>
-          <w:p>
-            <w:pPr>
-              <w:jc w:val="center"/>
-            </w:pPr>
-            <w:r>
-              <w:rPr>
-                <w:sz w:val="20"/>
-              </w:rPr>
-              <w:t>Not assessed</w:t>
-            </w:r>
-          </w:p>
-        </w:tc>
-      </w:tr>
-      <w:tr>
-        <w:tc>
-          <w:tcPr>
-            <w:tcW w:type="dxa" w:w="1417"/>
-          </w:tcPr>
-          <w:p>
-            <w:pPr>
-              <w:jc w:val="center"/>
-            </w:pPr>
-            <w:r>
-              <w:rPr>
-                <w:sz w:val="20"/>
-              </w:rPr>
-              <w:t>30</w:t>
-            </w:r>
-          </w:p>
-        </w:tc>
-        <w:tc>
-          <w:tcPr>
-            <w:tcW w:type="dxa" w:w="1417"/>
-          </w:tcPr>
-          <w:p>
-            <w:pPr>
-              <w:jc w:val="center"/>
-            </w:pPr>
-            <w:r>
-              <w:rPr>
-                <w:sz w:val="20"/>
-              </w:rPr>
-              <w:t>nan</w:t>
-            </w:r>
-          </w:p>
-        </w:tc>
-        <w:tc>
-          <w:tcPr>
-            <w:tcW w:type="dxa" w:w="1417"/>
-          </w:tcPr>
-          <w:p>
-            <w:pPr>
-              <w:jc w:val="center"/>
-            </w:pPr>
-            <w:r>
-              <w:rPr>
-                <w:sz w:val="20"/>
-              </w:rPr>
-              <w:t>nan</w:t>
-            </w:r>
-          </w:p>
-        </w:tc>
-        <w:tc>
-          <w:tcPr>
-            <w:tcW w:type="dxa" w:w="1417"/>
-          </w:tcPr>
-          <w:p>
-            <w:pPr>
-              <w:jc w:val="center"/>
-            </w:pPr>
-            <w:r>
-              <w:rPr>
-                <w:sz w:val="20"/>
-              </w:rPr>
-              <w:t>nan</w:t>
-            </w:r>
-          </w:p>
-        </w:tc>
-        <w:tc>
-          <w:tcPr>
-            <w:tcW w:type="dxa" w:w="1417"/>
-          </w:tcPr>
-          <w:p>
-            <w:pPr>
-              <w:jc w:val="center"/>
-            </w:pPr>
-            <w:r>
-              <w:rPr>
-                <w:sz w:val="20"/>
-              </w:rPr>
-              <w:t>nan</w:t>
-            </w:r>
-          </w:p>
-        </w:tc>
-        <w:tc>
-          <w:tcPr>
-            <w:tcW w:type="dxa" w:w="1417"/>
-          </w:tcPr>
-          <w:p>
-            <w:pPr>
-              <w:jc w:val="center"/>
-            </w:pPr>
-            <w:r>
-              <w:rPr>
-                <w:sz w:val="20"/>
-              </w:rPr>
-              <w:t>Not assessed</w:t>
-            </w:r>
-          </w:p>
-        </w:tc>
-      </w:tr>
-      <w:tr>
-        <w:tc>
-          <w:tcPr>
-            <w:tcW w:type="dxa" w:w="1417"/>
-          </w:tcPr>
-          <w:p>
-            <w:pPr>
-              <w:jc w:val="center"/>
-            </w:pPr>
-            <w:r>
-              <w:rPr>
-                <w:sz w:val="20"/>
-              </w:rPr>
-              <w:t>31</w:t>
-            </w:r>
-          </w:p>
-        </w:tc>
-        <w:tc>
-          <w:tcPr>
-            <w:tcW w:type="dxa" w:w="1417"/>
-          </w:tcPr>
-          <w:p>
-            <w:pPr>
-              <w:jc w:val="center"/>
-            </w:pPr>
-            <w:r>
-              <w:rPr>
-                <w:sz w:val="20"/>
-              </w:rPr>
-              <w:t>nan</w:t>
-            </w:r>
-          </w:p>
-        </w:tc>
-        <w:tc>
-          <w:tcPr>
-            <w:tcW w:type="dxa" w:w="1417"/>
-          </w:tcPr>
-          <w:p>
-            <w:pPr>
-              <w:jc w:val="center"/>
-            </w:pPr>
-            <w:r>
-              <w:rPr>
-                <w:sz w:val="20"/>
-              </w:rPr>
-              <w:t>nan</w:t>
-            </w:r>
-          </w:p>
-        </w:tc>
-        <w:tc>
-          <w:tcPr>
-            <w:tcW w:type="dxa" w:w="1417"/>
-          </w:tcPr>
-          <w:p>
-            <w:pPr>
-              <w:jc w:val="center"/>
-            </w:pPr>
-            <w:r>
-              <w:rPr>
-                <w:sz w:val="20"/>
-              </w:rPr>
-              <w:t>nan</w:t>
-            </w:r>
-          </w:p>
-        </w:tc>
-        <w:tc>
-          <w:tcPr>
-            <w:tcW w:type="dxa" w:w="1417"/>
-          </w:tcPr>
-          <w:p>
-            <w:pPr>
-              <w:jc w:val="center"/>
-            </w:pPr>
-            <w:r>
-              <w:rPr>
-                <w:sz w:val="20"/>
-              </w:rPr>
-              <w:t>nan</w:t>
-            </w:r>
-          </w:p>
-        </w:tc>
-        <w:tc>
-          <w:tcPr>
-            <w:tcW w:type="dxa" w:w="1417"/>
-          </w:tcPr>
-          <w:p>
-            <w:pPr>
-              <w:jc w:val="center"/>
-            </w:pPr>
-            <w:r>
-              <w:rPr>
-                <w:sz w:val="20"/>
-              </w:rPr>
-              <w:t>Not assessed</w:t>
-            </w:r>
-          </w:p>
-        </w:tc>
-      </w:tr>
-      <w:tr>
-        <w:tc>
-          <w:tcPr>
-            <w:tcW w:type="dxa" w:w="1417"/>
-          </w:tcPr>
-          <w:p>
-            <w:pPr>
-              <w:jc w:val="center"/>
-            </w:pPr>
-            <w:r>
-              <w:rPr>
-                <w:sz w:val="20"/>
-              </w:rPr>
-              <w:t>32</w:t>
-            </w:r>
-          </w:p>
-        </w:tc>
-        <w:tc>
-          <w:tcPr>
-            <w:tcW w:type="dxa" w:w="1417"/>
-          </w:tcPr>
-          <w:p>
-            <w:pPr>
-              <w:jc w:val="center"/>
-            </w:pPr>
-            <w:r>
-              <w:rPr>
-                <w:sz w:val="20"/>
-              </w:rPr>
-              <w:t>nan</w:t>
-            </w:r>
-          </w:p>
-        </w:tc>
-        <w:tc>
-          <w:tcPr>
-            <w:tcW w:type="dxa" w:w="1417"/>
-          </w:tcPr>
-          <w:p>
-            <w:pPr>
-              <w:jc w:val="center"/>
-            </w:pPr>
-            <w:r>
-              <w:rPr>
-                <w:sz w:val="20"/>
-              </w:rPr>
-              <w:t>nan</w:t>
-            </w:r>
-          </w:p>
-        </w:tc>
-        <w:tc>
-          <w:tcPr>
-            <w:tcW w:type="dxa" w:w="1417"/>
-          </w:tcPr>
-          <w:p>
-            <w:pPr>
-              <w:jc w:val="center"/>
-            </w:pPr>
-            <w:r>
-              <w:rPr>
-                <w:sz w:val="20"/>
-              </w:rPr>
-              <w:t>nan</w:t>
-            </w:r>
-          </w:p>
-        </w:tc>
-        <w:tc>
-          <w:tcPr>
-            <w:tcW w:type="dxa" w:w="1417"/>
-          </w:tcPr>
-          <w:p>
-            <w:pPr>
-              <w:jc w:val="center"/>
-            </w:pPr>
-            <w:r>
-              <w:rPr>
-                <w:sz w:val="20"/>
-              </w:rPr>
-              <w:t>nan</w:t>
-            </w:r>
-          </w:p>
-        </w:tc>
-        <w:tc>
-          <w:tcPr>
-            <w:tcW w:type="dxa" w:w="1417"/>
-          </w:tcPr>
-          <w:p>
-            <w:pPr>
-              <w:jc w:val="center"/>
-            </w:pPr>
-            <w:r>
-              <w:rPr>
-                <w:sz w:val="20"/>
-              </w:rPr>
-              <w:t>Not assessed</w:t>
-            </w:r>
-          </w:p>
-        </w:tc>
-      </w:tr>
-      <w:tr>
-        <w:tc>
-          <w:tcPr>
-            <w:tcW w:type="dxa" w:w="1417"/>
-          </w:tcPr>
-          <w:p>
-            <w:pPr>
-              <w:jc w:val="center"/>
-            </w:pPr>
-            <w:r>
-              <w:rPr>
-                <w:sz w:val="20"/>
-              </w:rPr>
-              <w:t>33</w:t>
-            </w:r>
-          </w:p>
-        </w:tc>
-        <w:tc>
-          <w:tcPr>
-            <w:tcW w:type="dxa" w:w="1417"/>
-          </w:tcPr>
-          <w:p>
-            <w:pPr>
-              <w:jc w:val="center"/>
-            </w:pPr>
-            <w:r>
-              <w:rPr>
-                <w:sz w:val="20"/>
-              </w:rPr>
-              <w:t>nan</w:t>
-            </w:r>
-          </w:p>
-        </w:tc>
-        <w:tc>
-          <w:tcPr>
-            <w:tcW w:type="dxa" w:w="1417"/>
-          </w:tcPr>
-          <w:p>
-            <w:pPr>
-              <w:jc w:val="center"/>
-            </w:pPr>
-            <w:r>
-              <w:rPr>
-                <w:sz w:val="20"/>
-              </w:rPr>
-              <w:t>nan</w:t>
-            </w:r>
-          </w:p>
-        </w:tc>
-        <w:tc>
-          <w:tcPr>
-            <w:tcW w:type="dxa" w:w="1417"/>
-          </w:tcPr>
-          <w:p>
-            <w:pPr>
-              <w:jc w:val="center"/>
-            </w:pPr>
-            <w:r>
-              <w:rPr>
-                <w:sz w:val="20"/>
-              </w:rPr>
-              <w:t>nan</w:t>
-            </w:r>
-          </w:p>
-        </w:tc>
-        <w:tc>
-          <w:tcPr>
-            <w:tcW w:type="dxa" w:w="1417"/>
-          </w:tcPr>
-          <w:p>
-            <w:pPr>
-              <w:jc w:val="center"/>
-            </w:pPr>
-            <w:r>
-              <w:rPr>
-                <w:sz w:val="20"/>
-              </w:rPr>
-              <w:t>nan</w:t>
-            </w:r>
-          </w:p>
-        </w:tc>
-        <w:tc>
-          <w:tcPr>
-            <w:tcW w:type="dxa" w:w="1417"/>
-          </w:tcPr>
-          <w:p>
-            <w:pPr>
-              <w:jc w:val="center"/>
-            </w:pPr>
-            <w:r>
-              <w:rPr>
-                <w:sz w:val="20"/>
-              </w:rPr>
-              <w:t>Not assessed</w:t>
-            </w:r>
-          </w:p>
-        </w:tc>
-      </w:tr>
-      <w:tr>
-        <w:tc>
-          <w:tcPr>
-            <w:tcW w:type="dxa" w:w="1417"/>
-          </w:tcPr>
-          <w:p>
-            <w:pPr>
-              <w:jc w:val="center"/>
-            </w:pPr>
-            <w:r>
-              <w:rPr>
-                <w:sz w:val="20"/>
-              </w:rPr>
-              <w:t>34</w:t>
-            </w:r>
-          </w:p>
-        </w:tc>
-        <w:tc>
-          <w:tcPr>
-            <w:tcW w:type="dxa" w:w="1417"/>
-          </w:tcPr>
-          <w:p>
-            <w:pPr>
-              <w:jc w:val="center"/>
-            </w:pPr>
-            <w:r>
-              <w:rPr>
-                <w:sz w:val="20"/>
-              </w:rPr>
-              <w:t>nan</w:t>
-            </w:r>
-          </w:p>
-        </w:tc>
-        <w:tc>
-          <w:tcPr>
-            <w:tcW w:type="dxa" w:w="1417"/>
-          </w:tcPr>
-          <w:p>
-            <w:pPr>
-              <w:jc w:val="center"/>
-            </w:pPr>
-            <w:r>
-              <w:rPr>
-                <w:sz w:val="20"/>
-              </w:rPr>
-              <w:t>nan</w:t>
-            </w:r>
-          </w:p>
-        </w:tc>
-        <w:tc>
-          <w:tcPr>
-            <w:tcW w:type="dxa" w:w="1417"/>
-          </w:tcPr>
-          <w:p>
-            <w:pPr>
-              <w:jc w:val="center"/>
-            </w:pPr>
-            <w:r>
-              <w:rPr>
-                <w:sz w:val="20"/>
-              </w:rPr>
-              <w:t>nan</w:t>
-            </w:r>
-          </w:p>
-        </w:tc>
-        <w:tc>
-          <w:tcPr>
-            <w:tcW w:type="dxa" w:w="1417"/>
-          </w:tcPr>
-          <w:p>
-            <w:pPr>
-              <w:jc w:val="center"/>
-            </w:pPr>
-            <w:r>
-              <w:rPr>
-                <w:sz w:val="20"/>
-              </w:rPr>
-              <w:t>nan</w:t>
-            </w:r>
-          </w:p>
-        </w:tc>
-        <w:tc>
-          <w:tcPr>
-            <w:tcW w:type="dxa" w:w="1417"/>
-          </w:tcPr>
-          <w:p>
-            <w:pPr>
-              <w:jc w:val="center"/>
-            </w:pPr>
-            <w:r>
-              <w:rPr>
-                <w:sz w:val="20"/>
-              </w:rPr>
-              <w:t>Not assessed</w:t>
-            </w:r>
-          </w:p>
-        </w:tc>
-      </w:tr>
-      <w:tr>
-        <w:tc>
-          <w:tcPr>
-            <w:tcW w:type="dxa" w:w="1417"/>
-          </w:tcPr>
-          <w:p>
-            <w:pPr>
-              <w:jc w:val="center"/>
-            </w:pPr>
-            <w:r>
-              <w:rPr>
-                <w:sz w:val="20"/>
-              </w:rPr>
-              <w:t>35</w:t>
-            </w:r>
-          </w:p>
-        </w:tc>
-        <w:tc>
-          <w:tcPr>
-            <w:tcW w:type="dxa" w:w="1417"/>
-          </w:tcPr>
-          <w:p>
-            <w:pPr>
-              <w:jc w:val="center"/>
-            </w:pPr>
-            <w:r>
-              <w:rPr>
-                <w:sz w:val="20"/>
-              </w:rPr>
-              <w:t>nan</w:t>
-            </w:r>
-          </w:p>
-        </w:tc>
-        <w:tc>
-          <w:tcPr>
-            <w:tcW w:type="dxa" w:w="1417"/>
-          </w:tcPr>
-          <w:p>
-            <w:pPr>
-              <w:jc w:val="center"/>
-            </w:pPr>
-            <w:r>
-              <w:rPr>
-                <w:sz w:val="20"/>
-              </w:rPr>
-              <w:t>nan</w:t>
-            </w:r>
-          </w:p>
-        </w:tc>
-        <w:tc>
-          <w:tcPr>
-            <w:tcW w:type="dxa" w:w="1417"/>
-          </w:tcPr>
-          <w:p>
-            <w:pPr>
-              <w:jc w:val="center"/>
-            </w:pPr>
-            <w:r>
-              <w:rPr>
-                <w:sz w:val="20"/>
-              </w:rPr>
-              <w:t>nan</w:t>
-            </w:r>
-          </w:p>
-        </w:tc>
-        <w:tc>
-          <w:tcPr>
-            <w:tcW w:type="dxa" w:w="1417"/>
-          </w:tcPr>
-          <w:p>
-            <w:pPr>
-              <w:jc w:val="center"/>
-            </w:pPr>
-            <w:r>
-              <w:rPr>
-                <w:sz w:val="20"/>
-              </w:rPr>
-              <w:t>nan</w:t>
-            </w:r>
-          </w:p>
-        </w:tc>
-        <w:tc>
-          <w:tcPr>
-            <w:tcW w:type="dxa" w:w="1417"/>
-          </w:tcPr>
-          <w:p>
-            <w:pPr>
-              <w:jc w:val="center"/>
-            </w:pPr>
-            <w:r>
-              <w:rPr>
-                <w:sz w:val="20"/>
-              </w:rPr>
-              <w:t>Not assessed</w:t>
-            </w:r>
-          </w:p>
-        </w:tc>
-      </w:tr>
-      <w:tr>
-        <w:tc>
-          <w:tcPr>
-            <w:tcW w:type="dxa" w:w="1417"/>
-          </w:tcPr>
-          <w:p>
-            <w:pPr>
-              <w:jc w:val="center"/>
-            </w:pPr>
-            <w:r>
-              <w:rPr>
-                <w:sz w:val="20"/>
-              </w:rPr>
-              <w:t>36</w:t>
-            </w:r>
-          </w:p>
-        </w:tc>
-        <w:tc>
-          <w:tcPr>
-            <w:tcW w:type="dxa" w:w="1417"/>
-          </w:tcPr>
-          <w:p>
-            <w:pPr>
-              <w:jc w:val="center"/>
-            </w:pPr>
-            <w:r>
-              <w:rPr>
-                <w:sz w:val="20"/>
-              </w:rPr>
-              <w:t>nan</w:t>
-            </w:r>
-          </w:p>
-        </w:tc>
-        <w:tc>
-          <w:tcPr>
-            <w:tcW w:type="dxa" w:w="1417"/>
-          </w:tcPr>
-          <w:p>
-            <w:pPr>
-              <w:jc w:val="center"/>
-            </w:pPr>
-            <w:r>
-              <w:rPr>
-                <w:sz w:val="20"/>
-              </w:rPr>
-              <w:t>nan</w:t>
-            </w:r>
-          </w:p>
-        </w:tc>
-        <w:tc>
-          <w:tcPr>
-            <w:tcW w:type="dxa" w:w="1417"/>
-          </w:tcPr>
-          <w:p>
-            <w:pPr>
-              <w:jc w:val="center"/>
-            </w:pPr>
-            <w:r>
-              <w:rPr>
-                <w:sz w:val="20"/>
-              </w:rPr>
-              <w:t>nan</w:t>
-            </w:r>
-          </w:p>
-        </w:tc>
-        <w:tc>
-          <w:tcPr>
-            <w:tcW w:type="dxa" w:w="1417"/>
-          </w:tcPr>
-          <w:p>
-            <w:pPr>
-              <w:jc w:val="center"/>
-            </w:pPr>
-            <w:r>
-              <w:rPr>
-                <w:sz w:val="20"/>
-              </w:rPr>
-              <w:t>nan</w:t>
-            </w:r>
-          </w:p>
-        </w:tc>
-        <w:tc>
-          <w:tcPr>
-            <w:tcW w:type="dxa" w:w="1417"/>
-          </w:tcPr>
-          <w:p>
-            <w:pPr>
-              <w:jc w:val="center"/>
-            </w:pPr>
-            <w:r>
-              <w:rPr>
-                <w:sz w:val="20"/>
-              </w:rPr>
-              <w:t>Not assessed</w:t>
-            </w:r>
-          </w:p>
-        </w:tc>
-      </w:tr>
-      <w:tr>
-        <w:tc>
-          <w:tcPr>
-            <w:tcW w:type="dxa" w:w="1417"/>
-          </w:tcPr>
-          <w:p>
-            <w:pPr>
-              <w:jc w:val="center"/>
-            </w:pPr>
-            <w:r>
-              <w:rPr>
-                <w:sz w:val="20"/>
-              </w:rPr>
-              <w:t>37</w:t>
-            </w:r>
-          </w:p>
-        </w:tc>
-        <w:tc>
-          <w:tcPr>
-            <w:tcW w:type="dxa" w:w="1417"/>
-          </w:tcPr>
-          <w:p>
-            <w:pPr>
-              <w:jc w:val="center"/>
-            </w:pPr>
-            <w:r>
-              <w:rPr>
-                <w:sz w:val="20"/>
-              </w:rPr>
-              <w:t>nan</w:t>
-            </w:r>
-          </w:p>
-        </w:tc>
-        <w:tc>
-          <w:tcPr>
-            <w:tcW w:type="dxa" w:w="1417"/>
-          </w:tcPr>
-          <w:p>
-            <w:pPr>
-              <w:jc w:val="center"/>
-            </w:pPr>
-            <w:r>
-              <w:rPr>
-                <w:sz w:val="20"/>
-              </w:rPr>
-              <w:t>nan</w:t>
-            </w:r>
-          </w:p>
-        </w:tc>
-        <w:tc>
-          <w:tcPr>
-            <w:tcW w:type="dxa" w:w="1417"/>
-          </w:tcPr>
-          <w:p>
-            <w:pPr>
-              <w:jc w:val="center"/>
-            </w:pPr>
-            <w:r>
-              <w:rPr>
-                <w:sz w:val="20"/>
-              </w:rPr>
-              <w:t>nan</w:t>
-            </w:r>
-          </w:p>
-        </w:tc>
-        <w:tc>
-          <w:tcPr>
-            <w:tcW w:type="dxa" w:w="1417"/>
-          </w:tcPr>
-          <w:p>
-            <w:pPr>
-              <w:jc w:val="center"/>
-            </w:pPr>
-            <w:r>
-              <w:rPr>
-                <w:sz w:val="20"/>
-              </w:rPr>
-              <w:t>nan</w:t>
-            </w:r>
-          </w:p>
-        </w:tc>
-        <w:tc>
-          <w:tcPr>
-            <w:tcW w:type="dxa" w:w="1417"/>
-          </w:tcPr>
-          <w:p>
-            <w:pPr>
-              <w:jc w:val="center"/>
-            </w:pPr>
-            <w:r>
-              <w:rPr>
-                <w:sz w:val="20"/>
-              </w:rPr>
-              <w:t>Not assessed</w:t>
-            </w:r>
-          </w:p>
-        </w:tc>
-      </w:tr>
-      <w:tr>
-        <w:tc>
-          <w:tcPr>
-            <w:tcW w:type="dxa" w:w="1417"/>
-          </w:tcPr>
-          <w:p>
-            <w:pPr>
-              <w:jc w:val="center"/>
-            </w:pPr>
-            <w:r>
-              <w:rPr>
-                <w:sz w:val="20"/>
-              </w:rPr>
-              <w:t>38</w:t>
-            </w:r>
-          </w:p>
-        </w:tc>
-        <w:tc>
-          <w:tcPr>
-            <w:tcW w:type="dxa" w:w="1417"/>
-          </w:tcPr>
-          <w:p>
-            <w:pPr>
-              <w:jc w:val="center"/>
-            </w:pPr>
-            <w:r>
-              <w:rPr>
-                <w:sz w:val="20"/>
-              </w:rPr>
-              <w:t>nan</w:t>
-            </w:r>
-          </w:p>
-        </w:tc>
-        <w:tc>
-          <w:tcPr>
-            <w:tcW w:type="dxa" w:w="1417"/>
-          </w:tcPr>
-          <w:p>
-            <w:pPr>
-              <w:jc w:val="center"/>
-            </w:pPr>
-            <w:r>
-              <w:rPr>
-                <w:sz w:val="20"/>
-              </w:rPr>
-              <w:t>nan</w:t>
-            </w:r>
-          </w:p>
-        </w:tc>
-        <w:tc>
-          <w:tcPr>
-            <w:tcW w:type="dxa" w:w="1417"/>
-          </w:tcPr>
-          <w:p>
-            <w:pPr>
-              <w:jc w:val="center"/>
-            </w:pPr>
-            <w:r>
-              <w:rPr>
-                <w:sz w:val="20"/>
-              </w:rPr>
-              <w:t>nan</w:t>
-            </w:r>
-          </w:p>
-        </w:tc>
-        <w:tc>
-          <w:tcPr>
-            <w:tcW w:type="dxa" w:w="1417"/>
-          </w:tcPr>
-          <w:p>
-            <w:pPr>
-              <w:jc w:val="center"/>
-            </w:pPr>
-            <w:r>
-              <w:rPr>
-                <w:sz w:val="20"/>
-              </w:rPr>
-              <w:t>nan</w:t>
-            </w:r>
-          </w:p>
-        </w:tc>
-        <w:tc>
-          <w:tcPr>
-            <w:tcW w:type="dxa" w:w="1417"/>
-          </w:tcPr>
-          <w:p>
-            <w:pPr>
-              <w:jc w:val="center"/>
-            </w:pPr>
-            <w:r>
-              <w:rPr>
-                <w:sz w:val="20"/>
-              </w:rPr>
-              <w:t>Not assessed</w:t>
-            </w:r>
-          </w:p>
-        </w:tc>
-      </w:tr>
-      <w:tr>
-        <w:tc>
-          <w:tcPr>
-            <w:tcW w:type="dxa" w:w="1417"/>
-          </w:tcPr>
-          <w:p>
-            <w:pPr>
-              <w:jc w:val="center"/>
-            </w:pPr>
-            <w:r>
-              <w:rPr>
-                <w:sz w:val="20"/>
-              </w:rPr>
-              <w:t>39</w:t>
-            </w:r>
-          </w:p>
-        </w:tc>
-        <w:tc>
-          <w:tcPr>
-            <w:tcW w:type="dxa" w:w="1417"/>
-          </w:tcPr>
-          <w:p>
-            <w:pPr>
-              <w:jc w:val="center"/>
-            </w:pPr>
-            <w:r>
-              <w:rPr>
-                <w:sz w:val="20"/>
-              </w:rPr>
-              <w:t>nan</w:t>
-            </w:r>
-          </w:p>
-        </w:tc>
-        <w:tc>
-          <w:tcPr>
-            <w:tcW w:type="dxa" w:w="1417"/>
-          </w:tcPr>
-          <w:p>
-            <w:pPr>
-              <w:jc w:val="center"/>
-            </w:pPr>
-            <w:r>
-              <w:rPr>
-                <w:sz w:val="20"/>
-              </w:rPr>
-              <w:t>nan</w:t>
-            </w:r>
-          </w:p>
-        </w:tc>
-        <w:tc>
-          <w:tcPr>
-            <w:tcW w:type="dxa" w:w="1417"/>
-          </w:tcPr>
-          <w:p>
-            <w:pPr>
-              <w:jc w:val="center"/>
-            </w:pPr>
-            <w:r>
-              <w:rPr>
-                <w:sz w:val="20"/>
-              </w:rPr>
-              <w:t>nan</w:t>
-            </w:r>
-          </w:p>
-        </w:tc>
-        <w:tc>
-          <w:tcPr>
-            <w:tcW w:type="dxa" w:w="1417"/>
-          </w:tcPr>
-          <w:p>
-            <w:pPr>
-              <w:jc w:val="center"/>
-            </w:pPr>
-            <w:r>
-              <w:rPr>
-                <w:sz w:val="20"/>
-              </w:rPr>
-              <w:t>nan</w:t>
-            </w:r>
-          </w:p>
-        </w:tc>
-        <w:tc>
-          <w:tcPr>
-            <w:tcW w:type="dxa" w:w="1417"/>
-          </w:tcPr>
-          <w:p>
-            <w:pPr>
-              <w:jc w:val="center"/>
-            </w:pPr>
-            <w:r>
-              <w:rPr>
-                <w:sz w:val="20"/>
-              </w:rPr>
-              <w:t>Not assessed</w:t>
-            </w:r>
-          </w:p>
-        </w:tc>
-      </w:tr>
-      <w:tr>
-        <w:tc>
-          <w:tcPr>
-            <w:tcW w:type="dxa" w:w="1417"/>
-          </w:tcPr>
-          <w:p>
-            <w:pPr>
-              <w:jc w:val="center"/>
-            </w:pPr>
-            <w:r>
-              <w:rPr>
-                <w:sz w:val="20"/>
-              </w:rPr>
-              <w:t>40</w:t>
-            </w:r>
-          </w:p>
-        </w:tc>
-        <w:tc>
-          <w:tcPr>
-            <w:tcW w:type="dxa" w:w="1417"/>
-          </w:tcPr>
-          <w:p>
-            <w:pPr>
-              <w:jc w:val="center"/>
-            </w:pPr>
-            <w:r>
-              <w:rPr>
-                <w:sz w:val="20"/>
-              </w:rPr>
-              <w:t>nan</w:t>
-            </w:r>
-          </w:p>
-        </w:tc>
-        <w:tc>
-          <w:tcPr>
-            <w:tcW w:type="dxa" w:w="1417"/>
-          </w:tcPr>
-          <w:p>
-            <w:pPr>
-              <w:jc w:val="center"/>
-            </w:pPr>
-            <w:r>
-              <w:rPr>
-                <w:sz w:val="20"/>
-              </w:rPr>
-              <w:t>nan</w:t>
-            </w:r>
-          </w:p>
-        </w:tc>
-        <w:tc>
-          <w:tcPr>
-            <w:tcW w:type="dxa" w:w="1417"/>
-          </w:tcPr>
-          <w:p>
-            <w:pPr>
-              <w:jc w:val="center"/>
-            </w:pPr>
-            <w:r>
-              <w:rPr>
-                <w:sz w:val="20"/>
-              </w:rPr>
-              <w:t>nan</w:t>
-            </w:r>
-          </w:p>
-        </w:tc>
-        <w:tc>
-          <w:tcPr>
-            <w:tcW w:type="dxa" w:w="1417"/>
-          </w:tcPr>
-          <w:p>
-            <w:pPr>
-              <w:jc w:val="center"/>
-            </w:pPr>
-            <w:r>
-              <w:rPr>
-                <w:sz w:val="20"/>
-              </w:rPr>
-              <w:t>nan</w:t>
-            </w:r>
-          </w:p>
-        </w:tc>
-        <w:tc>
-          <w:tcPr>
-            <w:tcW w:type="dxa" w:w="1417"/>
-          </w:tcPr>
-          <w:p>
-            <w:pPr>
-              <w:jc w:val="center"/>
-            </w:pPr>
-            <w:r>
-              <w:rPr>
-                <w:sz w:val="20"/>
-              </w:rPr>
-              <w:t>Not assessed</w:t>
-            </w:r>
-          </w:p>
-        </w:tc>
-      </w:tr>
     </w:tbl>
     <w:p>
       <w:r>

</xml_diff>

<commit_message>
updated PYME functions to read analyte in tables and figures instead of just appearing as Referenec Method and Test Method.
</commit_message>
<xml_diff>
--- a/MethodComparison.docx
+++ b/MethodComparison.docx
@@ -7,7 +7,7 @@
         <w:pStyle w:val="Heading2"/>
       </w:pPr>
       <w:r>
-        <w:t xml:space="preserve"> Digoxin (new) vs. Digoxin (old)</w:t>
+        <w:t xml:space="preserve"> Digoxin Test vs. Digoxin Ref.</w:t>
       </w:r>
     </w:p>
     <w:p>
@@ -60,7 +60,7 @@
         <w:rPr>
           <w:b/>
         </w:rPr>
-        <w:t>Digoxin (old) - Current method</w:t>
+        <w:t>Digoxin Ref.</w:t>
       </w:r>
     </w:p>
     <w:p>
@@ -71,7 +71,7 @@
         <w:rPr>
           <w:b/>
         </w:rPr>
-        <w:t>Digoxin (new) - Test method</w:t>
+        <w:t>Digoxin Test</w:t>
       </w:r>
     </w:p>
     <w:p>
@@ -313,7 +313,7 @@
               <w:rPr>
                 <w:sz w:val="20"/>
               </w:rPr>
-              <w:t>Current Method</w:t>
+              <w:t>Digoxin Ref.</w:t>
             </w:r>
           </w:p>
         </w:tc>
@@ -475,7 +475,7 @@
               <w:rPr>
                 <w:sz w:val="20"/>
               </w:rPr>
-              <w:t>New Method</w:t>
+              <w:t>Digoxin Test</w:t>
             </w:r>
           </w:p>
         </w:tc>
@@ -966,7 +966,7 @@
       <w:r>
         <w:drawing>
           <wp:inline xmlns:a="http://schemas.openxmlformats.org/drawingml/2006/main" xmlns:pic="http://schemas.openxmlformats.org/drawingml/2006/picture">
-            <wp:extent cx="5943600" cy="6127484"/>
+            <wp:extent cx="5943600" cy="6169231"/>
             <wp:docPr id="2" name="Picture 2"/>
             <wp:cNvGraphicFramePr>
               <a:graphicFrameLocks noChangeAspect="1"/>
@@ -987,7 +987,7 @@
                   <pic:spPr>
                     <a:xfrm>
                       <a:off x="0" y="0"/>
-                      <a:ext cx="5943600" cy="6127484"/>
+                      <a:ext cx="5943600" cy="6169231"/>
                     </a:xfrm>
                     <a:prstGeom prst="rect"/>
                   </pic:spPr>
@@ -1051,7 +1051,7 @@
               <w:rPr>
                 <w:sz w:val="20"/>
               </w:rPr>
-              <w:t>Current Method</w:t>
+              <w:t>Digoxin Ref.</w:t>
             </w:r>
           </w:p>
         </w:tc>
@@ -1067,7 +1067,7 @@
               <w:rPr>
                 <w:sz w:val="20"/>
               </w:rPr>
-              <w:t>New Method</w:t>
+              <w:t>Digoxin Test</w:t>
             </w:r>
           </w:p>
         </w:tc>
@@ -3604,7 +3604,7 @@
             <w:r>
               <w:drawing>
                 <wp:inline xmlns:a="http://schemas.openxmlformats.org/drawingml/2006/main" xmlns:pic="http://schemas.openxmlformats.org/drawingml/2006/picture">
-                  <wp:extent cx="5486400" cy="5803839"/>
+                  <wp:extent cx="5486400" cy="5835583"/>
                   <wp:docPr id="3" name="Picture 3"/>
                   <wp:cNvGraphicFramePr>
                     <a:graphicFrameLocks noChangeAspect="1"/>
@@ -3625,7 +3625,7 @@
                         <pic:spPr>
                           <a:xfrm>
                             <a:off x="0" y="0"/>
-                            <a:ext cx="5486400" cy="5803839"/>
+                            <a:ext cx="5486400" cy="5835583"/>
                           </a:xfrm>
                           <a:prstGeom prst="rect"/>
                         </pic:spPr>
@@ -3651,7 +3651,7 @@
             <w:r>
               <w:drawing>
                 <wp:inline xmlns:a="http://schemas.openxmlformats.org/drawingml/2006/main" xmlns:pic="http://schemas.openxmlformats.org/drawingml/2006/picture">
-                  <wp:extent cx="5486400" cy="4057133"/>
+                  <wp:extent cx="5486400" cy="4084271"/>
                   <wp:docPr id="4" name="Picture 4"/>
                   <wp:cNvGraphicFramePr>
                     <a:graphicFrameLocks noChangeAspect="1"/>
@@ -3672,7 +3672,7 @@
                         <pic:spPr>
                           <a:xfrm>
                             <a:off x="0" y="0"/>
-                            <a:ext cx="5486400" cy="4057133"/>
+                            <a:ext cx="5486400" cy="4084271"/>
                           </a:xfrm>
                           <a:prstGeom prst="rect"/>
                         </pic:spPr>

</xml_diff>